<commit_message>
Revamp presentation and synopsis - premium dark theme PPT with transitions, natural-tone synopsis DOCX
</commit_message>
<xml_diff>
--- a/CardioPredict_Synopsis.docx
+++ b/CardioPredict_Synopsis.docx
@@ -3,10 +3,9 @@
 <w:document xmlns:wpc="http://schemas.microsoft.com/office/word/2010/wordprocessingCanvas" xmlns:mo="http://schemas.microsoft.com/office/mac/office/2008/main" xmlns:mc="http://schemas.openxmlformats.org/markup-compatibility/2006" xmlns:mv="urn:schemas-microsoft-com:mac:vml" xmlns:o="urn:schemas-microsoft-com:office:office" xmlns:r="http://schemas.openxmlformats.org/officeDocument/2006/relationships" xmlns:m="http://schemas.openxmlformats.org/officeDocument/2006/math" xmlns:v="urn:schemas-microsoft-com:vml" xmlns:wp14="http://schemas.microsoft.com/office/word/2010/wordprocessingDrawing" xmlns:wp="http://schemas.openxmlformats.org/drawingml/2006/wordprocessingDrawing" xmlns:w10="urn:schemas-microsoft-com:office:word" xmlns:w="http://schemas.openxmlformats.org/wordprocessingml/2006/main" xmlns:w14="http://schemas.microsoft.com/office/word/2010/wordml" xmlns:wpg="http://schemas.microsoft.com/office/word/2010/wordprocessingGroup" xmlns:wpi="http://schemas.microsoft.com/office/word/2010/wordprocessingInk" xmlns:wne="http://schemas.microsoft.com/office/word/2006/wordml" xmlns:wps="http://schemas.microsoft.com/office/word/2010/wordprocessingShape" mc:Ignorable="w14 wp14">
   <w:body>
     <w:p/>
-    <w:p/>
     <w:p>
       <w:pPr>
-        <w:spacing w:before="1200" w:after="240"/>
+        <w:spacing w:before="1440" w:after="240"/>
         <w:jc w:val="center"/>
       </w:pPr>
       <w:r>
@@ -20,7 +19,7 @@
     </w:p>
     <w:p>
       <w:pPr>
-        <w:spacing w:before="0" w:after="720"/>
+        <w:spacing w:before="0" w:after="960"/>
         <w:jc w:val="center"/>
       </w:pPr>
       <w:r>
@@ -34,14 +33,14 @@
     </w:p>
     <w:p>
       <w:pPr>
-        <w:spacing w:before="480" w:after="480"/>
+        <w:spacing w:before="480" w:after="600"/>
         <w:jc w:val="center"/>
       </w:pPr>
       <w:r>
         <w:rPr>
           <w:rFonts w:ascii="Times New Roman" w:hAnsi="Times New Roman"/>
           <w:b/>
-          <w:sz w:val="24"/>
+          <w:sz w:val="26"/>
         </w:rPr>
         <w:t>PROJECT SYNOPSIS</w:t>
       </w:r>
@@ -55,7 +54,7 @@
         <w:rPr>
           <w:rFonts w:ascii="Times New Roman" w:hAnsi="Times New Roman"/>
           <w:b/>
-          <w:sz w:val="44"/>
+          <w:sz w:val="40"/>
         </w:rPr>
         <w:t>CardioPredict:</w:t>
       </w:r>
@@ -69,7 +68,7 @@
         <w:rPr>
           <w:rFonts w:ascii="Times New Roman" w:hAnsi="Times New Roman"/>
           <w:b/>
-          <w:sz w:val="40"/>
+          <w:sz w:val="36"/>
         </w:rPr>
         <w:t>Heart Disease Prediction System</w:t>
       </w:r>
@@ -83,7 +82,7 @@
         <w:rPr>
           <w:rFonts w:ascii="Times New Roman" w:hAnsi="Times New Roman"/>
           <w:b/>
-          <w:sz w:val="40"/>
+          <w:sz w:val="36"/>
         </w:rPr>
         <w:t>Using Machine Learning</w:t>
       </w:r>
@@ -97,28 +96,28 @@
         <w:rPr>
           <w:rFonts w:ascii="Times New Roman" w:hAnsi="Times New Roman"/>
           <w:b w:val="0"/>
-          <w:sz w:val="26"/>
+          <w:sz w:val="24"/>
         </w:rPr>
         <w:t>A Flask-Based Clinical Screening Web Application</w:t>
       </w:r>
     </w:p>
     <w:p>
       <w:pPr>
-        <w:spacing w:before="0" w:after="720"/>
+        <w:spacing w:before="0" w:after="960"/>
         <w:jc w:val="center"/>
       </w:pPr>
       <w:r>
         <w:rPr>
           <w:rFonts w:ascii="Times New Roman" w:hAnsi="Times New Roman"/>
           <w:b w:val="0"/>
-          <w:sz w:val="26"/>
+          <w:sz w:val="24"/>
         </w:rPr>
         <w:t>with Random Forest Classification</w:t>
       </w:r>
     </w:p>
     <w:p>
       <w:pPr>
-        <w:spacing w:before="480"/>
+        <w:spacing w:before="360"/>
         <w:jc w:val="center"/>
       </w:pPr>
       <w:r>
@@ -189,7 +188,7 @@
     </w:p>
     <w:p>
       <w:pPr>
-        <w:spacing w:before="0" w:after="720"/>
+        <w:spacing w:before="0" w:after="960"/>
         <w:jc w:val="center"/>
       </w:pPr>
       <w:r>
@@ -242,9 +241,10 @@
         <w:rPr>
           <w:rFonts w:ascii="Times New Roman" w:hAnsi="Times New Roman"/>
           <w:b w:val="0"/>
+          <w:i w:val="0"/>
           <w:sz w:val="24"/>
         </w:rPr>
-        <w:t>Cardiovascular diseases (CVDs) are the leading cause of death globally, responsible for approximately 17.9 million deaths each year according to the World Health Organisation. In India alone, CVDs account for nearly 28% of all deaths, with prevalence rates rising sharply due to sedentary lifestyles, dietary shifts, and increasing stress levels in urban populations. Early detection and timely intervention remain the most effective strategies for reducing CVD-related mortality; however, conventional diagnostic procedures — including electrocardiography, echocardiography, coronary angiography, and cardiac biomarker assays — are often expensive, time-consuming, and require specialised medical infrastructure that is unavailable in rural and semi-urban healthcare settings.</w:t>
+        <w:t>Heart disease remains one of the most pressing health challenges of our time. According to the World Health Organisation, cardiovascular diseases claim roughly 17.9 million lives every year, making them the single largest cause of death worldwide. India is particularly affected — nearly one in four deaths in the country is attributed to some form of cardiovascular condition, and the numbers have been climbing steadily over the past two decades.</w:t>
       </w:r>
     </w:p>
     <w:p>
@@ -257,9 +257,10 @@
         <w:rPr>
           <w:rFonts w:ascii="Times New Roman" w:hAnsi="Times New Roman"/>
           <w:b w:val="0"/>
+          <w:i w:val="0"/>
           <w:sz w:val="24"/>
         </w:rPr>
-        <w:t>Machine learning offers a transformative alternative by enabling the development of predictive models that can analyse readily available clinical parameters (such as age, blood pressure, cholesterol levels, and heart rate) to estimate the probability of heart disease. Such models can serve as rapid, low-cost screening tools that assist clinicians in identifying high-risk patients who require further diagnostic investigation, thereby optimising healthcare resource allocation and improving patient outcomes.</w:t>
+        <w:t>What makes this problem especially difficult is the gap between where the patients are and where the diagnostics are. Traditional cardiac screening relies on tests like electrocardiograms, echocardiography, and coronary angiography — all of which require expensive equipment and trained specialists. In rural India, where roughly 70% of the population lives, these facilities are simply not available. Patients often have to travel hours to reach a hospital that can run basic cardiac diagnostics, and by that point, critical time may have been lost.</w:t>
       </w:r>
     </w:p>
     <w:p>
@@ -272,9 +273,26 @@
         <w:rPr>
           <w:rFonts w:ascii="Times New Roman" w:hAnsi="Times New Roman"/>
           <w:b w:val="0"/>
+          <w:i w:val="0"/>
           <w:sz w:val="24"/>
         </w:rPr>
-        <w:t>CardioPredict is a full-stack web application that integrates a trained Random Forest classification model with a Flask-based web interface, enabling clinical users to enter 13 standard clinical parameters and receive an instant heart disease probability assessment. The system is designed for deployment in resource-constrained environments where specialised cardiac diagnostic equipment may not be available.</w:t>
+        <w:t>Over the past decade, machine learning has shown real promise in bridging this gap. Researchers have demonstrated that trained classifiers can estimate heart disease risk using nothing more than a handful of routine clinical measurements — age, blood pressure, cholesterol, heart rate, and a few other numbers that any primary care physician can collect during a standard check-up. The accuracy of these models, when built carefully, rivals that of many conventional screening methods.</w:t>
+      </w:r>
+    </w:p>
+    <w:p>
+      <w:pPr>
+        <w:spacing w:after="120"/>
+        <w:ind w:firstLine="720"/>
+        <w:jc w:val="both"/>
+      </w:pPr>
+      <w:r>
+        <w:rPr>
+          <w:rFonts w:ascii="Times New Roman" w:hAnsi="Times New Roman"/>
+          <w:b w:val="0"/>
+          <w:i w:val="0"/>
+          <w:sz w:val="24"/>
+        </w:rPr>
+        <w:t>CardioPredict is an attempt to take this idea from research papers into practice. It is a web application — built with Flask, Python, and a trained Random Forest model — that accepts 13 clinical parameters through a simple form and returns an instant heart disease probability estimate. The goal is not to replace doctors, but to give them a quick, low-cost screening tool that they can use in settings where advanced diagnostics are out of reach.</w:t>
       </w:r>
     </w:p>
     <w:p>
@@ -299,9 +317,10 @@
         <w:rPr>
           <w:rFonts w:ascii="Times New Roman" w:hAnsi="Times New Roman"/>
           <w:b w:val="0"/>
+          <w:i w:val="0"/>
           <w:sz w:val="24"/>
         </w:rPr>
-        <w:t>Despite significant advances in medical technology, heart disease diagnosis remains heavily dependent on expensive diagnostic procedures and specialist availability. In many developing regions, patients presenting with ambiguous cardiovascular symptoms are either subjected to unnecessary referrals or, worse, are sent home without adequate screening due to lack of diagnostic resources. There is a critical need for an accessible, accurate, and user-friendly clinical decision support tool that can provide preliminary heart disease risk assessment using routinely collected clinical data — without requiring specialised hardware, laboratory infrastructure, or specialist expertise at the point of care.</w:t>
+        <w:t>The core problem is straightforward: there is no affordable, easy-to-use screening tool that a primary care physician in a small clinic can use to quickly assess whether a patient might have heart disease. The existing path — refer the patient to a specialist, wait for an appointment, run expensive tests, wait for results — is slow, costly, and simply unavailable in many parts of the country.</w:t>
       </w:r>
     </w:p>
     <w:p>
@@ -314,9 +333,26 @@
         <w:rPr>
           <w:rFonts w:ascii="Times New Roman" w:hAnsi="Times New Roman"/>
           <w:b w:val="0"/>
+          <w:i w:val="0"/>
           <w:sz w:val="24"/>
         </w:rPr>
-        <w:t>Existing research demonstrates that machine learning classifiers can achieve diagnostic accuracy comparable to traditional methods when trained on well-curated clinical datasets. However, most published models exist only as research prototypes — command-line scripts or Jupyter notebooks — without the user-facing interface that would make them practically usable by non-technical clinical staff. CardioPredict addresses this gap by delivering an end-to-end solution: from trained model to production-ready web application.</w:t>
+        <w:t>From a technical standpoint, the gap is not in the machine learning research. Plenty of studies have shown that classifiers trained on the UCI Cleveland Heart Disease dataset can achieve accuracies in the 80–90% range. The gap is in delivery. Most of these models exist as Jupyter notebooks or command-line scripts that no clinician would ever use. They lack a proper user interface, input validation, result interpretation, and the kind of packaging that would make them deployable in a real healthcare setting.</w:t>
+      </w:r>
+    </w:p>
+    <w:p>
+      <w:pPr>
+        <w:spacing w:after="120"/>
+        <w:ind w:firstLine="720"/>
+        <w:jc w:val="both"/>
+      </w:pPr>
+      <w:r>
+        <w:rPr>
+          <w:rFonts w:ascii="Times New Roman" w:hAnsi="Times New Roman"/>
+          <w:b w:val="0"/>
+          <w:i w:val="0"/>
+          <w:sz w:val="24"/>
+        </w:rPr>
+        <w:t>CardioPredict aims to close this gap by building the complete pipeline: data preprocessing, model training and selection, a production-grade web application with proper validation, a prediction history database, and containerised deployment — all in one project.</w:t>
       </w:r>
     </w:p>
     <w:p>
@@ -341,9 +377,10 @@
         <w:rPr>
           <w:rFonts w:ascii="Times New Roman" w:hAnsi="Times New Roman"/>
           <w:b w:val="0"/>
+          <w:i w:val="0"/>
           <w:sz w:val="24"/>
         </w:rPr>
-        <w:t>The primary objectives of the CardioPredict project are:</w:t>
+        <w:t>This project has seven specific objectives:</w:t>
       </w:r>
     </w:p>
     <w:p>
@@ -355,7 +392,7 @@
           <w:rFonts w:ascii="Times New Roman" w:hAnsi="Times New Roman"/>
           <w:sz w:val="24"/>
         </w:rPr>
-        <w:t>To analyse the Cleveland Heart Disease dataset and identify the clinical features most strongly associated with cardiovascular disease.</w:t>
+        <w:t>Perform exploratory data analysis on the Cleveland Heart Disease dataset (303 patients, 13 clinical features) to understand feature distributions, correlations, and class balance.</w:t>
       </w:r>
     </w:p>
     <w:p>
@@ -367,7 +404,7 @@
           <w:rFonts w:ascii="Times New Roman" w:hAnsi="Times New Roman"/>
           <w:sz w:val="24"/>
         </w:rPr>
-        <w:t>To train, evaluate, and compare seven classification algorithms (Logistic Regression, Decision Tree, Random Forest, Support Vector Machine, K-Nearest Neighbours, Gradient Boosting, AdaBoost) and select the best-performing model.</w:t>
+        <w:t>Train and evaluate seven different classification algorithms — Logistic Regression, Decision Tree, Random Forest, SVM, KNN, Gradient Boosting, and AdaBoost — using stratified 10-fold cross-validation, and select the best performer.</w:t>
       </w:r>
     </w:p>
     <w:p>
@@ -379,7 +416,7 @@
           <w:rFonts w:ascii="Times New Roman" w:hAnsi="Times New Roman"/>
           <w:sz w:val="24"/>
         </w:rPr>
-        <w:t>To develop a responsive, accessible web application using Flask that allows clinical users to input patient data and receive instant prediction results.</w:t>
+        <w:t>Develop a complete web application using Flask that lets a clinician enter patient data through an intuitive form and receive an instant prediction with a colour-coded risk level.</w:t>
       </w:r>
     </w:p>
     <w:p>
@@ -391,7 +428,7 @@
           <w:rFonts w:ascii="Times New Roman" w:hAnsi="Times New Roman"/>
           <w:sz w:val="24"/>
         </w:rPr>
-        <w:t>To implement a dual-layer input validation system (client-side HTML5 constraints + server-side Python validation) ensuring data integrity and security.</w:t>
+        <w:t>Implement input validation on both the client side (HTML5 constraints, JavaScript checks) and the server side (Python type/range validation) so that bad data never reaches the model.</w:t>
       </w:r>
     </w:p>
     <w:p>
@@ -403,7 +440,7 @@
           <w:rFonts w:ascii="Times New Roman" w:hAnsi="Times New Roman"/>
           <w:sz w:val="24"/>
         </w:rPr>
-        <w:t>To provide prediction history storage using SQLite for longitudinal patient tracking.</w:t>
+        <w:t>Store every prediction in a SQLite database, along with timestamps and input values, to enable longitudinal tracking of patients over time.</w:t>
       </w:r>
     </w:p>
     <w:p>
@@ -415,7 +452,7 @@
           <w:rFonts w:ascii="Times New Roman" w:hAnsi="Times New Roman"/>
           <w:sz w:val="24"/>
         </w:rPr>
-        <w:t>To containerise the application using Docker for portable, reproducible deployment.</w:t>
+        <w:t>Containerise the entire application with Docker and configure a production-grade Gunicorn server, so the system can be deployed on any machine with a single command.</w:t>
       </w:r>
     </w:p>
     <w:p>
@@ -427,7 +464,7 @@
           <w:rFonts w:ascii="Times New Roman" w:hAnsi="Times New Roman"/>
           <w:sz w:val="24"/>
         </w:rPr>
-        <w:t>To implement a comprehensive testing suite with unit, integration, and edge-case tests using pytest.</w:t>
+        <w:t>Write a comprehensive test suite using pytest — covering routing, prediction logic, content validation, edge cases, and database operations — to ensure reliability.</w:t>
       </w:r>
     </w:p>
     <w:p>
@@ -451,7 +488,7 @@
           <w:rFonts w:ascii="Times New Roman" w:hAnsi="Times New Roman"/>
           <w:color w:val="000000"/>
         </w:rPr>
-        <w:t>4.1 Scope</w:t>
+        <w:t>4.1 What the Project Covers</w:t>
       </w:r>
     </w:p>
     <w:p>
@@ -464,74 +501,70 @@
         <w:rPr>
           <w:rFonts w:ascii="Times New Roman" w:hAnsi="Times New Roman"/>
           <w:b w:val="0"/>
+          <w:i w:val="0"/>
           <w:sz w:val="24"/>
         </w:rPr>
-        <w:t>The project encompasses:</w:t>
+        <w:t>The scope of CardioPredict includes:</w:t>
       </w:r>
     </w:p>
     <w:p>
       <w:pPr>
         <w:pStyle w:val="ListBullet"/>
-        <w:ind w:left="720"/>
       </w:pPr>
       <w:r>
         <w:rPr>
           <w:rFonts w:ascii="Times New Roman" w:hAnsi="Times New Roman"/>
           <w:sz w:val="24"/>
         </w:rPr>
-        <w:t>Binary classification of heart disease presence/absence based on 13 clinical parameters.</w:t>
+        <w:t>Binary classification (disease present / disease absent) using 13 clinical parameters.</w:t>
       </w:r>
     </w:p>
     <w:p>
       <w:pPr>
         <w:pStyle w:val="ListBullet"/>
-        <w:ind w:left="720"/>
       </w:pPr>
       <w:r>
         <w:rPr>
           <w:rFonts w:ascii="Times New Roman" w:hAnsi="Times New Roman"/>
           <w:sz w:val="24"/>
         </w:rPr>
-        <w:t>A complete web application with prediction form, result display, prediction history, model information, and parameter documentation pages.</w:t>
+        <w:t>A multi-page web application with a prediction form, result display, prediction history, model information page, and a parameter reference page.</w:t>
       </w:r>
     </w:p>
     <w:p>
       <w:pPr>
         <w:pStyle w:val="ListBullet"/>
-        <w:ind w:left="720"/>
       </w:pPr>
       <w:r>
         <w:rPr>
           <w:rFonts w:ascii="Times New Roman" w:hAnsi="Times New Roman"/>
           <w:sz w:val="24"/>
         </w:rPr>
-        <w:t>Dark mode, font customisation, and text scaling accessibility features.</w:t>
+        <w:t>Accessibility features: dark mode toggle, adjustable font sizes, and text scaling.</w:t>
       </w:r>
     </w:p>
     <w:p>
       <w:pPr>
         <w:pStyle w:val="ListBullet"/>
-        <w:ind w:left="720"/>
       </w:pPr>
       <w:r>
         <w:rPr>
           <w:rFonts w:ascii="Times New Roman" w:hAnsi="Times New Roman"/>
           <w:sz w:val="24"/>
         </w:rPr>
-        <w:t>REST API endpoint for programmatic access to the prediction engine.</w:t>
+        <w:t>A REST API endpoint that returns predictions in JSON format for programmatic access.</w:t>
       </w:r>
     </w:p>
     <w:p>
       <w:pPr>
         <w:pStyle w:val="ListBullet"/>
-        <w:ind w:left="720"/>
       </w:pPr>
       <w:r>
         <w:rPr>
           <w:rFonts w:ascii="Times New Roman" w:hAnsi="Times New Roman"/>
           <w:sz w:val="24"/>
         </w:rPr>
-        <w:t>Docker containerisation with Gunicorn production server.</w:t>
+        <w:t>Docker-based deployment with Gunicorn as the production WSGI server.</w:t>
       </w:r>
     </w:p>
     <w:p>
@@ -543,46 +576,43 @@
           <w:rFonts w:ascii="Times New Roman" w:hAnsi="Times New Roman"/>
           <w:color w:val="000000"/>
         </w:rPr>
-        <w:t>4.2 Limitations</w:t>
+        <w:t>4.2 Known Limitations</w:t>
       </w:r>
     </w:p>
     <w:p>
       <w:pPr>
         <w:pStyle w:val="ListBullet"/>
-        <w:ind w:left="720"/>
       </w:pPr>
       <w:r>
         <w:rPr>
           <w:rFonts w:ascii="Times New Roman" w:hAnsi="Times New Roman"/>
           <w:sz w:val="24"/>
         </w:rPr>
-        <w:t>The model is trained on a single dataset (303 records from Cleveland Clinic); larger, multi-institutional datasets would improve generalisability.</w:t>
+        <w:t>The training dataset has only 303 records from a single hospital (Cleveland Clinic). A production system would need data from multiple institutions across different demographics.</w:t>
       </w:r>
     </w:p>
     <w:p>
       <w:pPr>
         <w:pStyle w:val="ListBullet"/>
-        <w:ind w:left="720"/>
       </w:pPr>
       <w:r>
         <w:rPr>
           <w:rFonts w:ascii="Times New Roman" w:hAnsi="Times New Roman"/>
           <w:sz w:val="24"/>
         </w:rPr>
-        <w:t>The system provides screening-level risk estimation, not clinical diagnosis — it is not intended to replace professional medical judgement.</w:t>
+        <w:t>The system is a screening aid, not a diagnostic tool. It should always be used alongside clinical judgement, never as a standalone replacement for professional evaluation.</w:t>
       </w:r>
     </w:p>
     <w:p>
       <w:pPr>
         <w:pStyle w:val="ListBullet"/>
-        <w:ind w:left="720"/>
       </w:pPr>
       <w:r>
         <w:rPr>
           <w:rFonts w:ascii="Times New Roman" w:hAnsi="Times New Roman"/>
           <w:sz w:val="24"/>
         </w:rPr>
-        <w:t>User authentication and multi-user support are not implemented in the current version.</w:t>
+        <w:t>There is no user authentication in the current version. In a real deployment, role-based access control would be needed to protect patient data.</w:t>
       </w:r>
     </w:p>
     <w:p>
@@ -619,9 +649,10 @@
         <w:rPr>
           <w:rFonts w:ascii="Times New Roman" w:hAnsi="Times New Roman"/>
           <w:b w:val="0"/>
+          <w:i w:val="0"/>
           <w:sz w:val="24"/>
         </w:rPr>
-        <w:t>The Cleveland Heart Disease dataset from the UCI Machine Learning Repository contains 303 patient records with 13 clinical features and a binary target variable (0 = no disease, 1 = disease present). Features include age, sex, chest pain type, resting blood pressure, serum cholesterol, fasting blood sugar, resting ECG results, maximum heart rate, exercise-induced angina, ST depression, ST slope, number of major vessels coloured by fluoroscopy, and thalassemia type.</w:t>
+        <w:t>The project uses the Cleveland Heart Disease dataset, originally collected at the Cleveland Clinic Foundation and made available through the UCI Machine Learning Repository. It contains 303 patient records, each described by 13 clinical features: age, sex, chest pain type (4 categories), resting blood pressure, serum cholesterol, fasting blood sugar, resting ECG results (3 categories), maximum heart rate achieved, exercise-induced angina, ST depression induced by exercise, the slope of the peak exercise ST segment, number of major vessels coloured by fluoroscopy (0–3), and thalassemia type (3 categories). The target variable is binary: 0 for no disease, 1 for disease present.</w:t>
       </w:r>
     </w:p>
     <w:p>
@@ -638,41 +669,54 @@
     </w:p>
     <w:p>
       <w:pPr>
+        <w:spacing w:after="120"/>
+        <w:ind w:firstLine="0"/>
+        <w:jc w:val="both"/>
+      </w:pPr>
+      <w:r>
+        <w:rPr>
+          <w:rFonts w:ascii="Times New Roman" w:hAnsi="Times New Roman"/>
+          <w:b w:val="0"/>
+          <w:i w:val="0"/>
+          <w:sz w:val="24"/>
+        </w:rPr>
+        <w:t>The preprocessing pipeline involves three steps:</w:t>
+      </w:r>
+    </w:p>
+    <w:p>
+      <w:pPr>
         <w:pStyle w:val="ListBullet"/>
-        <w:ind w:left="720"/>
       </w:pPr>
       <w:r>
         <w:rPr>
           <w:rFonts w:ascii="Times New Roman" w:hAnsi="Times New Roman"/>
           <w:sz w:val="24"/>
         </w:rPr>
-        <w:t>Missing Value Treatment: Missing values in the ca and thal columns are imputed using median values.</w:t>
+        <w:t>Missing value imputation: The ca (major vessels) and thal (thalassemia) columns have missing values in a few records. These are filled using the median of each column, which is robust to outliers and preserves the overall distribution.</w:t>
       </w:r>
     </w:p>
     <w:p>
       <w:pPr>
         <w:pStyle w:val="ListBullet"/>
-        <w:ind w:left="720"/>
       </w:pPr>
       <w:r>
         <w:rPr>
           <w:rFonts w:ascii="Times New Roman" w:hAnsi="Times New Roman"/>
           <w:sz w:val="24"/>
         </w:rPr>
-        <w:t>Feature Scaling: StandardScaler (z-score normalisation) is applied to all 13 features, ensuring zero mean and unit variance — essential for distance-based algorithms (KNN, SVM).</w:t>
+        <w:t>Feature scaling: All 13 features are normalised using StandardScaler, which transforms each feature to have zero mean and unit variance. This step is essential for algorithms like SVM and KNN that are sensitive to the scale of input features.</w:t>
       </w:r>
     </w:p>
     <w:p>
       <w:pPr>
         <w:pStyle w:val="ListBullet"/>
-        <w:ind w:left="720"/>
       </w:pPr>
       <w:r>
         <w:rPr>
           <w:rFonts w:ascii="Times New Roman" w:hAnsi="Times New Roman"/>
           <w:sz w:val="24"/>
         </w:rPr>
-        <w:t>Train-Test Split: 80% training (242 records) / 20% testing (61 records) with stratified sampling to preserve class distribution.</w:t>
+        <w:t>Train-test split: The data is split 80/20 (242 training, 61 testing) using stratified sampling to ensure both sets have the same proportion of disease/no-disease cases.</w:t>
       </w:r>
     </w:p>
     <w:p>
@@ -684,7 +728,7 @@
           <w:rFonts w:ascii="Times New Roman" w:hAnsi="Times New Roman"/>
           <w:color w:val="000000"/>
         </w:rPr>
-        <w:t>5.3 Machine Learning Pipeline</w:t>
+        <w:t>5.3 Model Training Pipeline</w:t>
       </w:r>
     </w:p>
     <w:tbl>
@@ -703,14 +747,13 @@
         <w:tc>
           <w:tcPr>
             <w:tcW w:type="dxa" w:w="2999"/>
-            <w:shd w:fill="2D3748" w:val="clear"/>
+            <w:shd w:fill="D9E2F3" w:val="clear"/>
           </w:tcPr>
           <w:p>
             <w:r>
               <w:rPr>
                 <w:rFonts w:ascii="Times New Roman" w:hAnsi="Times New Roman"/>
                 <w:b/>
-                <w:color w:val="FFFFFF"/>
                 <w:sz w:val="22"/>
               </w:rPr>
               <w:t>Stage</w:t>
@@ -720,34 +763,32 @@
         <w:tc>
           <w:tcPr>
             <w:tcW w:type="dxa" w:w="2999"/>
-            <w:shd w:fill="2D3748" w:val="clear"/>
+            <w:shd w:fill="D9E2F3" w:val="clear"/>
           </w:tcPr>
           <w:p>
             <w:r>
               <w:rPr>
                 <w:rFonts w:ascii="Times New Roman" w:hAnsi="Times New Roman"/>
                 <w:b/>
-                <w:color w:val="FFFFFF"/>
                 <w:sz w:val="22"/>
               </w:rPr>
-              <w:t>Description</w:t>
+              <w:t>What Happens</w:t>
             </w:r>
           </w:p>
         </w:tc>
         <w:tc>
           <w:tcPr>
             <w:tcW w:type="dxa" w:w="2999"/>
-            <w:shd w:fill="2D3748" w:val="clear"/>
+            <w:shd w:fill="D9E2F3" w:val="clear"/>
           </w:tcPr>
           <w:p>
             <w:r>
               <w:rPr>
                 <w:rFonts w:ascii="Times New Roman" w:hAnsi="Times New Roman"/>
                 <w:b/>
-                <w:color w:val="FFFFFF"/>
                 <w:sz w:val="22"/>
               </w:rPr>
-              <w:t>Tools</w:t>
+              <w:t>Tools Used</w:t>
             </w:r>
           </w:p>
         </w:tc>
@@ -763,7 +804,7 @@
                 <w:rFonts w:ascii="Times New Roman" w:hAnsi="Times New Roman"/>
                 <w:sz w:val="22"/>
               </w:rPr>
-              <w:t>Data Loading</w:t>
+              <w:t>Data loading</w:t>
             </w:r>
           </w:p>
         </w:tc>
@@ -777,7 +818,7 @@
                 <w:rFonts w:ascii="Times New Roman" w:hAnsi="Times New Roman"/>
                 <w:sz w:val="22"/>
               </w:rPr>
-              <w:t>CSV parsing and initial inspection</w:t>
+              <w:t>Read the CSV, inspect shape and types</w:t>
             </w:r>
           </w:p>
         </w:tc>
@@ -807,7 +848,7 @@
                 <w:rFonts w:ascii="Times New Roman" w:hAnsi="Times New Roman"/>
                 <w:sz w:val="22"/>
               </w:rPr>
-              <w:t>EDA &amp; Visualisation</w:t>
+              <w:t>Exploratory analysis</w:t>
             </w:r>
           </w:p>
         </w:tc>
@@ -821,7 +862,7 @@
                 <w:rFonts w:ascii="Times New Roman" w:hAnsi="Times New Roman"/>
                 <w:sz w:val="22"/>
               </w:rPr>
-              <w:t>Correlation heatmap, class distribution analysis</w:t>
+              <w:t>Correlation heatmaps, class distribution plots</w:t>
             </w:r>
           </w:p>
         </w:tc>
@@ -865,7 +906,7 @@
                 <w:rFonts w:ascii="Times New Roman" w:hAnsi="Times New Roman"/>
                 <w:sz w:val="22"/>
               </w:rPr>
-              <w:t>Missing value imputation, feature scaling</w:t>
+              <w:t>Handle missing values, scale features</w:t>
             </w:r>
           </w:p>
         </w:tc>
@@ -895,7 +936,7 @@
                 <w:rFonts w:ascii="Times New Roman" w:hAnsi="Times New Roman"/>
                 <w:sz w:val="22"/>
               </w:rPr>
-              <w:t>Model Training</w:t>
+              <w:t>Model training</w:t>
             </w:r>
           </w:p>
         </w:tc>
@@ -909,7 +950,7 @@
                 <w:rFonts w:ascii="Times New Roman" w:hAnsi="Times New Roman"/>
                 <w:sz w:val="22"/>
               </w:rPr>
-              <w:t>7-algorithm comparison with 10-fold stratified CV</w:t>
+              <w:t>Fit 7 algorithms with 10-fold stratified CV</w:t>
             </w:r>
           </w:p>
         </w:tc>
@@ -953,7 +994,7 @@
                 <w:rFonts w:ascii="Times New Roman" w:hAnsi="Times New Roman"/>
                 <w:sz w:val="22"/>
               </w:rPr>
-              <w:t>Accuracy, Precision, Recall, F1, Confusion Matrix</w:t>
+              <w:t>Accuracy, Precision, Recall, F1, confusion matrix</w:t>
             </w:r>
           </w:p>
         </w:tc>
@@ -997,7 +1038,7 @@
                 <w:rFonts w:ascii="Times New Roman" w:hAnsi="Times New Roman"/>
                 <w:sz w:val="22"/>
               </w:rPr>
-              <w:t>Save best model and scaler to .pkl files</w:t>
+              <w:t>Save the best model and scaler as .pkl files</w:t>
             </w:r>
           </w:p>
         </w:tc>
@@ -1027,7 +1068,23 @@
           <w:rFonts w:ascii="Times New Roman" w:hAnsi="Times New Roman"/>
           <w:color w:val="000000"/>
         </w:rPr>
-        <w:t>5.4 Classification Algorithms</w:t>
+        <w:t>5.4 Algorithms Compared</w:t>
+      </w:r>
+    </w:p>
+    <w:p>
+      <w:pPr>
+        <w:spacing w:after="120"/>
+        <w:ind w:firstLine="0"/>
+        <w:jc w:val="both"/>
+      </w:pPr>
+      <w:r>
+        <w:rPr>
+          <w:rFonts w:ascii="Times New Roman" w:hAnsi="Times New Roman"/>
+          <w:b w:val="0"/>
+          <w:i w:val="0"/>
+          <w:sz w:val="24"/>
+        </w:rPr>
+        <w:t>Seven algorithms were trained and compared. The table below lists each one with its type and the reason it was included in the comparison:</w:t>
       </w:r>
     </w:p>
     <w:tbl>
@@ -1046,14 +1103,13 @@
         <w:tc>
           <w:tcPr>
             <w:tcW w:type="dxa" w:w="2999"/>
-            <w:shd w:fill="2D3748" w:val="clear"/>
+            <w:shd w:fill="D9E2F3" w:val="clear"/>
           </w:tcPr>
           <w:p>
             <w:r>
               <w:rPr>
                 <w:rFonts w:ascii="Times New Roman" w:hAnsi="Times New Roman"/>
                 <w:b/>
-                <w:color w:val="FFFFFF"/>
                 <w:sz w:val="22"/>
               </w:rPr>
               <w:t>Algorithm</w:t>
@@ -1063,14 +1119,13 @@
         <w:tc>
           <w:tcPr>
             <w:tcW w:type="dxa" w:w="2999"/>
-            <w:shd w:fill="2D3748" w:val="clear"/>
+            <w:shd w:fill="D9E2F3" w:val="clear"/>
           </w:tcPr>
           <w:p>
             <w:r>
               <w:rPr>
                 <w:rFonts w:ascii="Times New Roman" w:hAnsi="Times New Roman"/>
                 <w:b/>
-                <w:color w:val="FFFFFF"/>
                 <w:sz w:val="22"/>
               </w:rPr>
               <w:t>Type</w:t>
@@ -1080,17 +1135,16 @@
         <w:tc>
           <w:tcPr>
             <w:tcW w:type="dxa" w:w="2999"/>
-            <w:shd w:fill="2D3748" w:val="clear"/>
+            <w:shd w:fill="D9E2F3" w:val="clear"/>
           </w:tcPr>
           <w:p>
             <w:r>
               <w:rPr>
                 <w:rFonts w:ascii="Times New Roman" w:hAnsi="Times New Roman"/>
                 <w:b/>
-                <w:color w:val="FFFFFF"/>
                 <w:sz w:val="22"/>
               </w:rPr>
-              <w:t>Key Characteristic</w:t>
+              <w:t>Why It Was Included</w:t>
             </w:r>
           </w:p>
         </w:tc>
@@ -1134,7 +1188,7 @@
                 <w:rFonts w:ascii="Times New Roman" w:hAnsi="Times New Roman"/>
                 <w:sz w:val="22"/>
               </w:rPr>
-              <w:t>Probabilistic baseline; interpretable coefficients</w:t>
+              <w:t>Simple baseline; outputs probabilities directly</w:t>
             </w:r>
           </w:p>
         </w:tc>
@@ -1178,7 +1232,7 @@
                 <w:rFonts w:ascii="Times New Roman" w:hAnsi="Times New Roman"/>
                 <w:sz w:val="22"/>
               </w:rPr>
-              <w:t>Interpretable but prone to overfitting</w:t>
+              <w:t>Highly interpretable; useful for understanding splits</w:t>
             </w:r>
           </w:p>
         </w:tc>
@@ -1194,7 +1248,7 @@
                 <w:rFonts w:ascii="Times New Roman" w:hAnsi="Times New Roman"/>
                 <w:sz w:val="22"/>
               </w:rPr>
-              <w:t>Random Forest (Selected)</w:t>
+              <w:t>Random Forest</w:t>
             </w:r>
           </w:p>
         </w:tc>
@@ -1208,7 +1262,7 @@
                 <w:rFonts w:ascii="Times New Roman" w:hAnsi="Times New Roman"/>
                 <w:sz w:val="22"/>
               </w:rPr>
-              <w:t>Ensemble</w:t>
+              <w:t>Ensemble (bagging)</w:t>
             </w:r>
           </w:p>
         </w:tc>
@@ -1222,7 +1276,7 @@
                 <w:rFonts w:ascii="Times New Roman" w:hAnsi="Times New Roman"/>
                 <w:sz w:val="22"/>
               </w:rPr>
-              <w:t>100-tree bagging; reduces variance</w:t>
+              <w:t>Reduces variance of individual trees; handles mixed feature types well</w:t>
             </w:r>
           </w:p>
         </w:tc>
@@ -1266,7 +1320,7 @@
                 <w:rFonts w:ascii="Times New Roman" w:hAnsi="Times New Roman"/>
                 <w:sz w:val="22"/>
               </w:rPr>
-              <w:t>Effective in high-dimensional spaces</w:t>
+              <w:t>Strong performance in high-dimensional spaces</w:t>
             </w:r>
           </w:p>
         </w:tc>
@@ -1310,7 +1364,7 @@
                 <w:rFonts w:ascii="Times New Roman" w:hAnsi="Times New Roman"/>
                 <w:sz w:val="22"/>
               </w:rPr>
-              <w:t>Non-parametric; sensitive to feature scaling</w:t>
+              <w:t>Non-parametric; no training phase</w:t>
             </w:r>
           </w:p>
         </w:tc>
@@ -1340,7 +1394,7 @@
                 <w:rFonts w:ascii="Times New Roman" w:hAnsi="Times New Roman"/>
                 <w:sz w:val="22"/>
               </w:rPr>
-              <w:t>Ensemble</w:t>
+              <w:t>Ensemble (boosting)</w:t>
             </w:r>
           </w:p>
         </w:tc>
@@ -1354,7 +1408,7 @@
                 <w:rFonts w:ascii="Times New Roman" w:hAnsi="Times New Roman"/>
                 <w:sz w:val="22"/>
               </w:rPr>
-              <w:t>Sequential boosting; high accuracy but slower</w:t>
+              <w:t>Sequentially corrects errors; often top performer</w:t>
             </w:r>
           </w:p>
         </w:tc>
@@ -1384,7 +1438,7 @@
                 <w:rFonts w:ascii="Times New Roman" w:hAnsi="Times New Roman"/>
                 <w:sz w:val="22"/>
               </w:rPr>
-              <w:t>Ensemble</w:t>
+              <w:t>Ensemble (boosting)</w:t>
             </w:r>
           </w:p>
         </w:tc>
@@ -1398,7 +1452,7 @@
                 <w:rFonts w:ascii="Times New Roman" w:hAnsi="Times New Roman"/>
                 <w:sz w:val="22"/>
               </w:rPr>
-              <w:t>Adaptive boosting; focuses on hard examples</w:t>
+              <w:t>Focuses on samples the previous model got wrong</w:t>
             </w:r>
           </w:p>
         </w:tc>
@@ -1417,6 +1471,22 @@
         <w:t>6. Technology Stack</w:t>
       </w:r>
     </w:p>
+    <w:p>
+      <w:pPr>
+        <w:spacing w:after="120"/>
+        <w:ind w:firstLine="0"/>
+        <w:jc w:val="both"/>
+      </w:pPr>
+      <w:r>
+        <w:rPr>
+          <w:rFonts w:ascii="Times New Roman" w:hAnsi="Times New Roman"/>
+          <w:b w:val="0"/>
+          <w:i w:val="0"/>
+          <w:sz w:val="24"/>
+        </w:rPr>
+        <w:t>The following table lists every major technology used in the project, along with its role:</w:t>
+      </w:r>
+    </w:p>
     <w:tbl>
       <w:tblPr>
         <w:tblStyle w:val="TableGrid"/>
@@ -1433,14 +1503,13 @@
         <w:tc>
           <w:tcPr>
             <w:tcW w:type="dxa" w:w="2999"/>
-            <w:shd w:fill="2D3748" w:val="clear"/>
+            <w:shd w:fill="D9E2F3" w:val="clear"/>
           </w:tcPr>
           <w:p>
             <w:r>
               <w:rPr>
                 <w:rFonts w:ascii="Times New Roman" w:hAnsi="Times New Roman"/>
                 <w:b/>
-                <w:color w:val="FFFFFF"/>
                 <w:sz w:val="22"/>
               </w:rPr>
               <w:t>Component</w:t>
@@ -1450,14 +1519,13 @@
         <w:tc>
           <w:tcPr>
             <w:tcW w:type="dxa" w:w="2999"/>
-            <w:shd w:fill="2D3748" w:val="clear"/>
+            <w:shd w:fill="D9E2F3" w:val="clear"/>
           </w:tcPr>
           <w:p>
             <w:r>
               <w:rPr>
                 <w:rFonts w:ascii="Times New Roman" w:hAnsi="Times New Roman"/>
                 <w:b/>
-                <w:color w:val="FFFFFF"/>
                 <w:sz w:val="22"/>
               </w:rPr>
               <w:t>Technology</w:t>
@@ -1467,17 +1535,16 @@
         <w:tc>
           <w:tcPr>
             <w:tcW w:type="dxa" w:w="2999"/>
-            <w:shd w:fill="2D3748" w:val="clear"/>
+            <w:shd w:fill="D9E2F3" w:val="clear"/>
           </w:tcPr>
           <w:p>
             <w:r>
               <w:rPr>
                 <w:rFonts w:ascii="Times New Roman" w:hAnsi="Times New Roman"/>
                 <w:b/>
-                <w:color w:val="FFFFFF"/>
                 <w:sz w:val="22"/>
               </w:rPr>
-              <w:t>Purpose</w:t>
+              <w:t>Role in the Project</w:t>
             </w:r>
           </w:p>
         </w:tc>
@@ -1493,7 +1560,7 @@
                 <w:rFonts w:ascii="Times New Roman" w:hAnsi="Times New Roman"/>
                 <w:sz w:val="22"/>
               </w:rPr>
-              <w:t>Programming Language</w:t>
+              <w:t>Language</w:t>
             </w:r>
           </w:p>
         </w:tc>
@@ -1521,7 +1588,7 @@
                 <w:rFonts w:ascii="Times New Roman" w:hAnsi="Times New Roman"/>
                 <w:sz w:val="22"/>
               </w:rPr>
-              <w:t>Core language for ML and backend</w:t>
+              <w:t>All backend code, model training, and scripting</w:t>
             </w:r>
           </w:p>
         </w:tc>
@@ -1537,7 +1604,7 @@
                 <w:rFonts w:ascii="Times New Roman" w:hAnsi="Times New Roman"/>
                 <w:sz w:val="22"/>
               </w:rPr>
-              <w:t>ML Libraries</w:t>
+              <w:t>ML libraries</w:t>
             </w:r>
           </w:p>
         </w:tc>
@@ -1565,7 +1632,7 @@
                 <w:rFonts w:ascii="Times New Roman" w:hAnsi="Times New Roman"/>
                 <w:sz w:val="22"/>
               </w:rPr>
-              <w:t>Model training, data processing</w:t>
+              <w:t>Data processing, model training, evaluation</w:t>
             </w:r>
           </w:p>
         </w:tc>
@@ -1609,7 +1676,7 @@
                 <w:rFonts w:ascii="Times New Roman" w:hAnsi="Times New Roman"/>
                 <w:sz w:val="22"/>
               </w:rPr>
-              <w:t>Charts and heatmaps</w:t>
+              <w:t>Training-time charts and heatmaps</w:t>
             </w:r>
           </w:p>
         </w:tc>
@@ -1625,7 +1692,7 @@
                 <w:rFonts w:ascii="Times New Roman" w:hAnsi="Times New Roman"/>
                 <w:sz w:val="22"/>
               </w:rPr>
-              <w:t>Web Framework</w:t>
+              <w:t>Web framework</w:t>
             </w:r>
           </w:p>
         </w:tc>
@@ -1653,7 +1720,7 @@
                 <w:rFonts w:ascii="Times New Roman" w:hAnsi="Times New Roman"/>
                 <w:sz w:val="22"/>
               </w:rPr>
-              <w:t>HTTP routing, template rendering</w:t>
+              <w:t>HTTP routing, request handling, template rendering</w:t>
             </w:r>
           </w:p>
         </w:tc>
@@ -1683,7 +1750,7 @@
                 <w:rFonts w:ascii="Times New Roman" w:hAnsi="Times New Roman"/>
                 <w:sz w:val="22"/>
               </w:rPr>
-              <w:t>HTML5, CSS3, JavaScript ES6</w:t>
+              <w:t>HTML5, CSS3, JavaScript (ES6)</w:t>
             </w:r>
           </w:p>
         </w:tc>
@@ -1697,7 +1764,51 @@
                 <w:rFonts w:ascii="Times New Roman" w:hAnsi="Times New Roman"/>
                 <w:sz w:val="22"/>
               </w:rPr>
-              <w:t>User interface (no frameworks)</w:t>
+              <w:t>Browser UI — no external JS frameworks used</w:t>
+            </w:r>
+          </w:p>
+        </w:tc>
+      </w:tr>
+      <w:tr>
+        <w:tc>
+          <w:tcPr>
+            <w:tcW w:type="dxa" w:w="2999"/>
+          </w:tcPr>
+          <w:p>
+            <w:r>
+              <w:rPr>
+                <w:rFonts w:ascii="Times New Roman" w:hAnsi="Times New Roman"/>
+                <w:sz w:val="22"/>
+              </w:rPr>
+              <w:t>Templating</w:t>
+            </w:r>
+          </w:p>
+        </w:tc>
+        <w:tc>
+          <w:tcPr>
+            <w:tcW w:type="dxa" w:w="2999"/>
+          </w:tcPr>
+          <w:p>
+            <w:r>
+              <w:rPr>
+                <w:rFonts w:ascii="Times New Roman" w:hAnsi="Times New Roman"/>
+                <w:sz w:val="22"/>
+              </w:rPr>
+              <w:t>Jinja2</w:t>
+            </w:r>
+          </w:p>
+        </w:tc>
+        <w:tc>
+          <w:tcPr>
+            <w:tcW w:type="dxa" w:w="2999"/>
+          </w:tcPr>
+          <w:p>
+            <w:r>
+              <w:rPr>
+                <w:rFonts w:ascii="Times New Roman" w:hAnsi="Times New Roman"/>
+                <w:sz w:val="22"/>
+              </w:rPr>
+              <w:t>Server-side HTML rendering with template inheritance</w:t>
             </w:r>
           </w:p>
         </w:tc>
@@ -1741,7 +1852,7 @@
                 <w:rFonts w:ascii="Times New Roman" w:hAnsi="Times New Roman"/>
                 <w:sz w:val="22"/>
               </w:rPr>
-              <w:t>Prediction history storage</w:t>
+              <w:t>Lightweight prediction history storage</w:t>
             </w:r>
           </w:p>
         </w:tc>
@@ -1829,7 +1940,7 @@
                 <w:rFonts w:ascii="Times New Roman" w:hAnsi="Times New Roman"/>
                 <w:sz w:val="22"/>
               </w:rPr>
-              <w:t>Portable deployment</w:t>
+              <w:t>One-command deployment on any machine</w:t>
             </w:r>
           </w:p>
         </w:tc>
@@ -1845,7 +1956,7 @@
                 <w:rFonts w:ascii="Times New Roman" w:hAnsi="Times New Roman"/>
                 <w:sz w:val="22"/>
               </w:rPr>
-              <w:t>Production Server</w:t>
+              <w:t>Production server</w:t>
             </w:r>
           </w:p>
         </w:tc>
@@ -1873,7 +1984,7 @@
                 <w:rFonts w:ascii="Times New Roman" w:hAnsi="Times New Roman"/>
                 <w:sz w:val="22"/>
               </w:rPr>
-              <w:t>WSGI server for production</w:t>
+              <w:t>Multi-worker WSGI server for production use</w:t>
             </w:r>
           </w:p>
         </w:tc>
@@ -1889,7 +2000,7 @@
                 <w:rFonts w:ascii="Times New Roman" w:hAnsi="Times New Roman"/>
                 <w:sz w:val="22"/>
               </w:rPr>
-              <w:t>Version Control</w:t>
+              <w:t>Version control</w:t>
             </w:r>
           </w:p>
         </w:tc>
@@ -1917,7 +2028,7 @@
                 <w:rFonts w:ascii="Times New Roman" w:hAnsi="Times New Roman"/>
                 <w:sz w:val="22"/>
               </w:rPr>
-              <w:t>Source code management</w:t>
+              <w:t>Source code management and collaboration</w:t>
             </w:r>
           </w:p>
         </w:tc>
@@ -1946,61 +2057,58 @@
         <w:rPr>
           <w:rFonts w:ascii="Times New Roman" w:hAnsi="Times New Roman"/>
           <w:b w:val="0"/>
+          <w:i w:val="0"/>
           <w:sz w:val="24"/>
         </w:rPr>
-        <w:t>CardioPredict follows a Model-View-Controller (MVC) architecture implemented within a client-server framework:</w:t>
+        <w:t>CardioPredict is built on a straightforward Model-View-Controller (MVC) pattern, running inside a client-server architecture. Here is how the pieces fit together:</w:t>
       </w:r>
     </w:p>
     <w:p>
       <w:pPr>
         <w:pStyle w:val="ListBullet"/>
-        <w:ind w:left="720"/>
       </w:pPr>
       <w:r>
         <w:rPr>
           <w:rFonts w:ascii="Times New Roman" w:hAnsi="Times New Roman"/>
           <w:sz w:val="24"/>
         </w:rPr>
-        <w:t>Client (Browser): Renders HTML/CSS/JS interface, captures user inputs, stores preferences in localStorage, communicates via HTTP.</w:t>
+        <w:t>The client is any modern web browser. It renders the HTML/CSS/JS interface, handles basic input validation using HTML5 form constraints, and stores user preferences (like dark mode and font size) in localStorage.</w:t>
       </w:r>
     </w:p>
     <w:p>
       <w:pPr>
         <w:pStyle w:val="ListBullet"/>
-        <w:ind w:left="720"/>
       </w:pPr>
       <w:r>
         <w:rPr>
           <w:rFonts w:ascii="Times New Roman" w:hAnsi="Times New Roman"/>
           <w:sz w:val="24"/>
         </w:rPr>
-        <w:t>Controller (Flask Routes): Receives HTTP requests, extracts and validates input data, invokes the ML model, manages database operations, returns rendered templates or JSON responses.</w:t>
+        <w:t>The controller layer consists of Flask route handlers. Each route receives an HTTP request, extracts the input data, validates it (checking types, ranges, and required fields), calls the ML model, writes the result to the database, and returns a rendered HTML page.</w:t>
       </w:r>
     </w:p>
     <w:p>
       <w:pPr>
         <w:pStyle w:val="ListBullet"/>
-        <w:ind w:left="720"/>
       </w:pPr>
       <w:r>
         <w:rPr>
           <w:rFonts w:ascii="Times New Roman" w:hAnsi="Times New Roman"/>
           <w:sz w:val="24"/>
         </w:rPr>
-        <w:t>Model (Random Forest + SQLite): The pre-trained classifier performs inference; SQLite stores prediction records.</w:t>
+        <w:t>The model layer has two parts: the pre-trained Random Forest classifier (loaded from a .pkl file at startup) that performs inference, and the SQLite database that stores prediction records.</w:t>
       </w:r>
     </w:p>
     <w:p>
       <w:pPr>
         <w:pStyle w:val="ListBullet"/>
-        <w:ind w:left="720"/>
       </w:pPr>
       <w:r>
         <w:rPr>
           <w:rFonts w:ascii="Times New Roman" w:hAnsi="Times New Roman"/>
           <w:sz w:val="24"/>
         </w:rPr>
-        <w:t>View (Jinja2 Templates): Seven HTML templates render dynamic content using template inheritance for consistency.</w:t>
+        <w:t>The view layer consists of seven Jinja2 HTML templates that share a common base layout through template inheritance, ensuring visual consistency across all pages.</w:t>
       </w:r>
     </w:p>
     <w:p>
@@ -2012,7 +2120,7 @@
           <w:rFonts w:ascii="Times New Roman" w:hAnsi="Times New Roman"/>
           <w:color w:val="000000"/>
         </w:rPr>
-        <w:t>7.1 Data Flow</w:t>
+        <w:t>7.1 Request Flow</w:t>
       </w:r>
     </w:p>
     <w:p>
@@ -2025,9 +2133,10 @@
         <w:rPr>
           <w:rFonts w:ascii="Times New Roman" w:hAnsi="Times New Roman"/>
           <w:b w:val="0"/>
+          <w:i w:val="0"/>
           <w:sz w:val="24"/>
         </w:rPr>
-        <w:t>User enters 13 clinical parameters → Browser validates inputs (HTML5 constraints) → Form data submitted via HTTP POST → Flask extracts and validates server-side → NumPy array constructed → StandardScaler transforms features → Random Forest predicts probability → Result and inputs persisted to SQLite → Result page rendered with colour-coded risk indicator and animated probability bar.</w:t>
+        <w:t>When a clinician submits a prediction, the data flows through the system as follows: the browser validates the 13 input fields → the form data is POSTed to the /predict route → Flask extracts each field, converts it to the correct numeric type, and checks that every value falls within its expected range → a NumPy array is constructed from the validated inputs → the StandardScaler normalises the array → the Random Forest calls predict_proba() to get the disease probability → the result is saved to SQLite along with a timestamp and the original inputs → the result page is rendered with a colour-coded risk indicator (green for low, amber for moderate, red for high) and an animated probability bar.</w:t>
       </w:r>
     </w:p>
     <w:p>
@@ -2044,14 +2153,18 @@
     </w:p>
     <w:p>
       <w:pPr>
-        <w:pStyle w:val="ListNumber"/>
+        <w:spacing w:after="120"/>
+        <w:ind w:firstLine="0"/>
+        <w:jc w:val="both"/>
       </w:pPr>
       <w:r>
         <w:rPr>
           <w:rFonts w:ascii="Times New Roman" w:hAnsi="Times New Roman"/>
+          <w:b w:val="0"/>
+          <w:i w:val="0"/>
           <w:sz w:val="24"/>
         </w:rPr>
-        <w:t>A trained Random Forest model achieving ≥80% accuracy on the test set.</w:t>
+        <w:t>By the end of this project, the following deliverables are expected:</w:t>
       </w:r>
     </w:p>
     <w:p>
@@ -2063,7 +2176,7 @@
           <w:rFonts w:ascii="Times New Roman" w:hAnsi="Times New Roman"/>
           <w:sz w:val="24"/>
         </w:rPr>
-        <w:t>A fully functional, responsive web application accessible via any modern browser.</w:t>
+        <w:t>A trained Random Forest classifier that achieves at least 80% accuracy on the held-out test set.</w:t>
       </w:r>
     </w:p>
     <w:p>
@@ -2075,7 +2188,7 @@
           <w:rFonts w:ascii="Times New Roman" w:hAnsi="Times New Roman"/>
           <w:sz w:val="24"/>
         </w:rPr>
-        <w:t>Colour-coded risk visualisation (green/amber/red) for immediate clinical interpretation.</w:t>
+        <w:t>A fully functional, responsive web application that works on any modern browser — desktop or mobile.</w:t>
       </w:r>
     </w:p>
     <w:p>
@@ -2087,7 +2200,7 @@
           <w:rFonts w:ascii="Times New Roman" w:hAnsi="Times New Roman"/>
           <w:sz w:val="24"/>
         </w:rPr>
-        <w:t>Prediction history with CRUD operations for longitudinal tracking.</w:t>
+        <w:t>A colour-coded risk visualisation system (green/amber/red) that enables immediate clinical interpretation.</w:t>
       </w:r>
     </w:p>
     <w:p>
@@ -2099,7 +2212,7 @@
           <w:rFonts w:ascii="Times New Roman" w:hAnsi="Times New Roman"/>
           <w:sz w:val="24"/>
         </w:rPr>
-        <w:t>REST API enabling external system integration.</w:t>
+        <w:t>A prediction history module with the ability to view, track, and delete past predictions.</w:t>
       </w:r>
     </w:p>
     <w:p>
@@ -2111,7 +2224,7 @@
           <w:rFonts w:ascii="Times New Roman" w:hAnsi="Times New Roman"/>
           <w:sz w:val="24"/>
         </w:rPr>
-        <w:t>Docker-containerised deployment ready for production environments.</w:t>
+        <w:t>A REST API endpoint that external systems can call to get predictions in JSON format.</w:t>
       </w:r>
     </w:p>
     <w:p>
@@ -2123,7 +2236,19 @@
           <w:rFonts w:ascii="Times New Roman" w:hAnsi="Times New Roman"/>
           <w:sz w:val="24"/>
         </w:rPr>
-        <w:t>Comprehensive automated test suite ensuring code reliability.</w:t>
+        <w:t>A Docker container image that packages the entire application for one-command deployment.</w:t>
+      </w:r>
+    </w:p>
+    <w:p>
+      <w:pPr>
+        <w:pStyle w:val="ListNumber"/>
+      </w:pPr>
+      <w:r>
+        <w:rPr>
+          <w:rFonts w:ascii="Times New Roman" w:hAnsi="Times New Roman"/>
+          <w:sz w:val="24"/>
+        </w:rPr>
+        <w:t>An automated test suite with at least 25 passing test cases covering all critical paths.</w:t>
       </w:r>
     </w:p>
     <w:p>
@@ -2136,6 +2261,22 @@
           <w:color w:val="000000"/>
         </w:rPr>
         <w:t>9. Project Timeline</w:t>
+      </w:r>
+    </w:p>
+    <w:p>
+      <w:pPr>
+        <w:spacing w:after="120"/>
+        <w:ind w:firstLine="0"/>
+        <w:jc w:val="both"/>
+      </w:pPr>
+      <w:r>
+        <w:rPr>
+          <w:rFonts w:ascii="Times New Roman" w:hAnsi="Times New Roman"/>
+          <w:b w:val="0"/>
+          <w:i w:val="0"/>
+          <w:sz w:val="24"/>
+        </w:rPr>
+        <w:t>The project is planned across seven phases over approximately 16 weeks:</w:t>
       </w:r>
     </w:p>
     <w:tbl>
@@ -2154,14 +2295,13 @@
         <w:tc>
           <w:tcPr>
             <w:tcW w:type="dxa" w:w="2999"/>
-            <w:shd w:fill="2D3748" w:val="clear"/>
+            <w:shd w:fill="D9E2F3" w:val="clear"/>
           </w:tcPr>
           <w:p>
             <w:r>
               <w:rPr>
                 <w:rFonts w:ascii="Times New Roman" w:hAnsi="Times New Roman"/>
                 <w:b/>
-                <w:color w:val="FFFFFF"/>
                 <w:sz w:val="22"/>
               </w:rPr>
               <w:t>Phase</w:t>
@@ -2171,14 +2311,13 @@
         <w:tc>
           <w:tcPr>
             <w:tcW w:type="dxa" w:w="2999"/>
-            <w:shd w:fill="2D3748" w:val="clear"/>
+            <w:shd w:fill="D9E2F3" w:val="clear"/>
           </w:tcPr>
           <w:p>
             <w:r>
               <w:rPr>
                 <w:rFonts w:ascii="Times New Roman" w:hAnsi="Times New Roman"/>
                 <w:b/>
-                <w:color w:val="FFFFFF"/>
                 <w:sz w:val="22"/>
               </w:rPr>
               <w:t>Duration</w:t>
@@ -2188,17 +2327,16 @@
         <w:tc>
           <w:tcPr>
             <w:tcW w:type="dxa" w:w="2999"/>
-            <w:shd w:fill="2D3748" w:val="clear"/>
+            <w:shd w:fill="D9E2F3" w:val="clear"/>
           </w:tcPr>
           <w:p>
             <w:r>
               <w:rPr>
                 <w:rFonts w:ascii="Times New Roman" w:hAnsi="Times New Roman"/>
                 <w:b/>
-                <w:color w:val="FFFFFF"/>
                 <w:sz w:val="22"/>
               </w:rPr>
-              <w:t>Activities</w:t>
+              <w:t>Key Activities</w:t>
             </w:r>
           </w:p>
         </w:tc>
@@ -2214,7 +2352,7 @@
                 <w:rFonts w:ascii="Times New Roman" w:hAnsi="Times New Roman"/>
                 <w:sz w:val="22"/>
               </w:rPr>
-              <w:t>Phase 1: Research</w:t>
+              <w:t>Research &amp; planning</w:t>
             </w:r>
           </w:p>
         </w:tc>
@@ -2242,7 +2380,7 @@
                 <w:rFonts w:ascii="Times New Roman" w:hAnsi="Times New Roman"/>
                 <w:sz w:val="22"/>
               </w:rPr>
-              <w:t>Literature review, dataset study, tool selection</w:t>
+              <w:t>Literature survey, dataset selection, finalise tech stack</w:t>
             </w:r>
           </w:p>
         </w:tc>
@@ -2258,7 +2396,7 @@
                 <w:rFonts w:ascii="Times New Roman" w:hAnsi="Times New Roman"/>
                 <w:sz w:val="22"/>
               </w:rPr>
-              <w:t>Phase 2: Data Analysis</w:t>
+              <w:t>Data analysis</w:t>
             </w:r>
           </w:p>
         </w:tc>
@@ -2286,7 +2424,7 @@
                 <w:rFonts w:ascii="Times New Roman" w:hAnsi="Times New Roman"/>
                 <w:sz w:val="22"/>
               </w:rPr>
-              <w:t>EDA, preprocessing, feature engineering</w:t>
+              <w:t>EDA, cleaning, preprocessing, feature engineering</w:t>
             </w:r>
           </w:p>
         </w:tc>
@@ -2302,7 +2440,7 @@
                 <w:rFonts w:ascii="Times New Roman" w:hAnsi="Times New Roman"/>
                 <w:sz w:val="22"/>
               </w:rPr>
-              <w:t>Phase 3: Model Development</w:t>
+              <w:t>Model development</w:t>
             </w:r>
           </w:p>
         </w:tc>
@@ -2330,7 +2468,7 @@
                 <w:rFonts w:ascii="Times New Roman" w:hAnsi="Times New Roman"/>
                 <w:sz w:val="22"/>
               </w:rPr>
-              <w:t>Algorithm comparison, training, evaluation</w:t>
+              <w:t>Train all 7 algorithms, cross-validate, select winner</w:t>
             </w:r>
           </w:p>
         </w:tc>
@@ -2346,7 +2484,7 @@
                 <w:rFonts w:ascii="Times New Roman" w:hAnsi="Times New Roman"/>
                 <w:sz w:val="22"/>
               </w:rPr>
-              <w:t>Phase 4: Web Development</w:t>
+              <w:t>Web application</w:t>
             </w:r>
           </w:p>
         </w:tc>
@@ -2374,7 +2512,7 @@
                 <w:rFonts w:ascii="Times New Roman" w:hAnsi="Times New Roman"/>
                 <w:sz w:val="22"/>
               </w:rPr>
-              <w:t>Flask backend, frontend UI, database integration</w:t>
+              <w:t>Build Flask backend, design frontend, integrate database</w:t>
             </w:r>
           </w:p>
         </w:tc>
@@ -2390,7 +2528,7 @@
                 <w:rFonts w:ascii="Times New Roman" w:hAnsi="Times New Roman"/>
                 <w:sz w:val="22"/>
               </w:rPr>
-              <w:t>Phase 5: Testing</w:t>
+              <w:t>Testing</w:t>
             </w:r>
           </w:p>
         </w:tc>
@@ -2418,7 +2556,7 @@
                 <w:rFonts w:ascii="Times New Roman" w:hAnsi="Times New Roman"/>
                 <w:sz w:val="22"/>
               </w:rPr>
-              <w:t>Unit tests, integration tests, edge cases</w:t>
+              <w:t>Write unit/integration tests, fix bugs, validate edge cases</w:t>
             </w:r>
           </w:p>
         </w:tc>
@@ -2434,7 +2572,7 @@
                 <w:rFonts w:ascii="Times New Roman" w:hAnsi="Times New Roman"/>
                 <w:sz w:val="22"/>
               </w:rPr>
-              <w:t>Phase 6: Deployment</w:t>
+              <w:t>Deployment</w:t>
             </w:r>
           </w:p>
         </w:tc>
@@ -2462,7 +2600,7 @@
                 <w:rFonts w:ascii="Times New Roman" w:hAnsi="Times New Roman"/>
                 <w:sz w:val="22"/>
               </w:rPr>
-              <w:t>Docker containerisation, documentation</w:t>
+              <w:t>Dockerise, configure Gunicorn, document deployment steps</w:t>
             </w:r>
           </w:p>
         </w:tc>
@@ -2478,7 +2616,7 @@
                 <w:rFonts w:ascii="Times New Roman" w:hAnsi="Times New Roman"/>
                 <w:sz w:val="22"/>
               </w:rPr>
-              <w:t>Phase 7: Report &amp; Viva</w:t>
+              <w:t>Documentation</w:t>
             </w:r>
           </w:p>
         </w:tc>
@@ -2506,7 +2644,7 @@
                 <w:rFonts w:ascii="Times New Roman" w:hAnsi="Times New Roman"/>
                 <w:sz w:val="22"/>
               </w:rPr>
-              <w:t>Report writing, synopsis, presentation prep</w:t>
+              <w:t>Write synopsis, project report, and prepare presentation</w:t>
             </w:r>
           </w:p>
         </w:tc>
@@ -2534,7 +2672,7 @@
           <w:rFonts w:ascii="Times New Roman" w:hAnsi="Times New Roman"/>
           <w:sz w:val="24"/>
         </w:rPr>
-        <w:t>Janosi, A., Steinbrunn, W., Pfisterer, M., &amp; Detrano, R. (1988). Heart Disease Data Set. UCI Machine Learning Repository.</w:t>
+        <w:t>Janosi, A., Steinbrunn, W., Pfisterer, M., &amp; Detrano, R. (1988). Heart Disease Data Set. UCI Machine Learning Repository. https://archive.ics.uci.edu/ml/datasets/heart+disease</w:t>
       </w:r>
     </w:p>
     <w:p>
@@ -2546,7 +2684,7 @@
           <w:rFonts w:ascii="Times New Roman" w:hAnsi="Times New Roman"/>
           <w:sz w:val="24"/>
         </w:rPr>
-        <w:t>Pedregosa, F. et al. (2011). Scikit-learn: Machine Learning in Python. Journal of Machine Learning Research, 12, 2825–2830.</w:t>
+        <w:t>Pedregosa, F., Varoquaux, G., Gramfort, A., Michel, V., Thirion, B., Grisel, O., ... &amp; Duchesnay, É. (2011). Scikit-learn: Machine Learning in Python. Journal of Machine Learning Research, 12, 2825–2830.</w:t>
       </w:r>
     </w:p>
     <w:p>
@@ -2582,7 +2720,7 @@
           <w:rFonts w:ascii="Times New Roman" w:hAnsi="Times New Roman"/>
           <w:sz w:val="24"/>
         </w:rPr>
-        <w:t>World Health Organization. (2025). Cardiovascular Diseases (CVDs) — Key Facts.</w:t>
+        <w:t>World Health Organization. (2025). Cardiovascular Diseases (CVDs) — Key Facts. https://www.who.int/news-room/fact-sheets/detail/cardiovascular-diseases</w:t>
       </w:r>
     </w:p>
     <w:p>
@@ -2594,7 +2732,7 @@
           <w:rFonts w:ascii="Times New Roman" w:hAnsi="Times New Roman"/>
           <w:sz w:val="24"/>
         </w:rPr>
-        <w:t>Friedman, J., Hastie, T., &amp; Tibshirani, R. (2001). The Elements of Statistical Learning. Springer.</w:t>
+        <w:t>Friedman, J., Hastie, T., &amp; Tibshirani, R. (2001). The Elements of Statistical Learning: Data Mining, Inference, and Prediction. Springer.</w:t>
       </w:r>
     </w:p>
     <w:p>

</xml_diff>

<commit_message>
Clean minimalist PPT and single-page synopsis title
</commit_message>
<xml_diff>
--- a/CardioPredict_Synopsis.docx
+++ b/CardioPredict_Synopsis.docx
@@ -2,10 +2,51 @@
 <file path=word/document.xml><?xml version="1.0" encoding="utf-8"?>
 <w:document xmlns:wpc="http://schemas.microsoft.com/office/word/2010/wordprocessingCanvas" xmlns:mo="http://schemas.microsoft.com/office/mac/office/2008/main" xmlns:mc="http://schemas.openxmlformats.org/markup-compatibility/2006" xmlns:mv="urn:schemas-microsoft-com:mac:vml" xmlns:o="urn:schemas-microsoft-com:office:office" xmlns:r="http://schemas.openxmlformats.org/officeDocument/2006/relationships" xmlns:m="http://schemas.openxmlformats.org/officeDocument/2006/math" xmlns:v="urn:schemas-microsoft-com:vml" xmlns:wp14="http://schemas.microsoft.com/office/word/2010/wordprocessingDrawing" xmlns:wp="http://schemas.openxmlformats.org/drawingml/2006/wordprocessingDrawing" xmlns:w10="urn:schemas-microsoft-com:office:word" xmlns:w="http://schemas.openxmlformats.org/wordprocessingml/2006/main" xmlns:w14="http://schemas.microsoft.com/office/word/2010/wordml" xmlns:wpg="http://schemas.microsoft.com/office/word/2010/wordprocessingGroup" xmlns:wpi="http://schemas.microsoft.com/office/word/2010/wordprocessingInk" xmlns:wne="http://schemas.microsoft.com/office/word/2006/wordml" xmlns:wps="http://schemas.microsoft.com/office/word/2010/wordprocessingShape" mc:Ignorable="w14 wp14">
   <w:body>
-    <w:p/>
     <w:p>
       <w:pPr>
-        <w:spacing w:before="1440" w:after="240"/>
+        <w:spacing w:before="720" w:after="80"/>
+        <w:jc w:val="center"/>
+      </w:pPr>
+      <w:r>
+        <w:rPr>
+          <w:rFonts w:ascii="Times New Roman" w:hAnsi="Times New Roman"/>
+          <w:b/>
+          <w:sz w:val="32"/>
+        </w:rPr>
+        <w:t>SIKKIM MANIPAL UNIVERSITY</w:t>
+      </w:r>
+    </w:p>
+    <w:p>
+      <w:pPr>
+        <w:spacing w:before="0" w:after="480"/>
+        <w:jc w:val="center"/>
+      </w:pPr>
+      <w:r>
+        <w:rPr>
+          <w:rFonts w:ascii="Times New Roman" w:hAnsi="Times New Roman"/>
+          <w:b/>
+          <w:sz w:val="26"/>
+        </w:rPr>
+        <w:t>Department of Computer Applications</w:t>
+      </w:r>
+    </w:p>
+    <w:p>
+      <w:pPr>
+        <w:spacing w:before="240" w:after="360"/>
+        <w:jc w:val="center"/>
+      </w:pPr>
+      <w:r>
+        <w:rPr>
+          <w:rFonts w:ascii="Times New Roman" w:hAnsi="Times New Roman"/>
+          <w:b/>
+          <w:sz w:val="24"/>
+        </w:rPr>
+        <w:t>PROJECT SYNOPSIS</w:t>
+      </w:r>
+    </w:p>
+    <w:p>
+      <w:pPr>
+        <w:spacing w:before="160" w:after="0"/>
         <w:jc w:val="center"/>
       </w:pPr>
       <w:r>
@@ -14,26 +55,53 @@
           <w:b/>
           <w:sz w:val="36"/>
         </w:rPr>
-        <w:t>SIKKIM MANIPAL UNIVERSITY</w:t>
+        <w:t>CardioPredict:</w:t>
       </w:r>
     </w:p>
     <w:p>
       <w:pPr>
-        <w:spacing w:before="0" w:after="960"/>
+        <w:spacing w:before="0" w:after="120"/>
         <w:jc w:val="center"/>
       </w:pPr>
       <w:r>
         <w:rPr>
           <w:rFonts w:ascii="Times New Roman" w:hAnsi="Times New Roman"/>
           <w:b/>
-          <w:sz w:val="28"/>
+          <w:sz w:val="30"/>
         </w:rPr>
-        <w:t>Department of Computer Applications</w:t>
+        <w:t>Heart Disease Prediction System Using Machine Learning</w:t>
       </w:r>
     </w:p>
     <w:p>
       <w:pPr>
-        <w:spacing w:before="480" w:after="600"/>
+        <w:spacing w:before="40" w:after="360"/>
+        <w:jc w:val="center"/>
+      </w:pPr>
+      <w:r>
+        <w:rPr>
+          <w:rFonts w:ascii="Times New Roman" w:hAnsi="Times New Roman"/>
+          <w:b w:val="0"/>
+          <w:sz w:val="22"/>
+        </w:rPr>
+        <w:t>A Flask-Based Clinical Screening Web Application with Random Forest Classification</w:t>
+      </w:r>
+    </w:p>
+    <w:p>
+      <w:pPr>
+        <w:spacing w:before="160" w:after="80"/>
+        <w:jc w:val="center"/>
+      </w:pPr>
+      <w:r>
+        <w:rPr>
+          <w:rFonts w:ascii="Times New Roman" w:hAnsi="Times New Roman"/>
+          <w:sz w:val="22"/>
+        </w:rPr>
+        <w:t>Submitted in Partial Fulfilment of the Requirements for the Award of the Degree of</w:t>
+      </w:r>
+    </w:p>
+    <w:p>
+      <w:pPr>
+        <w:spacing w:before="40" w:after="320"/>
         <w:jc w:val="center"/>
       </w:pPr>
       <w:r>
@@ -42,167 +110,169 @@
           <w:b/>
           <w:sz w:val="26"/>
         </w:rPr>
-        <w:t>PROJECT SYNOPSIS</w:t>
-      </w:r>
-    </w:p>
-    <w:p>
-      <w:pPr>
-        <w:spacing w:before="240" w:after="0"/>
-        <w:jc w:val="center"/>
-      </w:pPr>
-      <w:r>
-        <w:rPr>
-          <w:rFonts w:ascii="Times New Roman" w:hAnsi="Times New Roman"/>
-          <w:b/>
-          <w:sz w:val="40"/>
-        </w:rPr>
-        <w:t>CardioPredict:</w:t>
-      </w:r>
-    </w:p>
-    <w:p>
-      <w:pPr>
-        <w:spacing w:before="0" w:after="0"/>
-        <w:jc w:val="center"/>
-      </w:pPr>
-      <w:r>
-        <w:rPr>
-          <w:rFonts w:ascii="Times New Roman" w:hAnsi="Times New Roman"/>
-          <w:b/>
-          <w:sz w:val="36"/>
-        </w:rPr>
-        <w:t>Heart Disease Prediction System</w:t>
-      </w:r>
-    </w:p>
-    <w:p>
-      <w:pPr>
-        <w:spacing w:before="0" w:after="240"/>
-        <w:jc w:val="center"/>
-      </w:pPr>
-      <w:r>
-        <w:rPr>
-          <w:rFonts w:ascii="Times New Roman" w:hAnsi="Times New Roman"/>
-          <w:b/>
-          <w:sz w:val="36"/>
-        </w:rPr>
-        <w:t>Using Machine Learning</w:t>
-      </w:r>
-    </w:p>
-    <w:p>
-      <w:pPr>
-        <w:spacing w:before="120" w:after="0"/>
-        <w:jc w:val="center"/>
-      </w:pPr>
-      <w:r>
-        <w:rPr>
-          <w:rFonts w:ascii="Times New Roman" w:hAnsi="Times New Roman"/>
-          <w:b w:val="0"/>
-          <w:sz w:val="24"/>
-        </w:rPr>
-        <w:t>A Flask-Based Clinical Screening Web Application</w:t>
-      </w:r>
-    </w:p>
-    <w:p>
-      <w:pPr>
-        <w:spacing w:before="0" w:after="960"/>
-        <w:jc w:val="center"/>
-      </w:pPr>
-      <w:r>
-        <w:rPr>
-          <w:rFonts w:ascii="Times New Roman" w:hAnsi="Times New Roman"/>
-          <w:b w:val="0"/>
-          <w:sz w:val="24"/>
-        </w:rPr>
-        <w:t>with Random Forest Classification</w:t>
-      </w:r>
-    </w:p>
-    <w:p>
-      <w:pPr>
-        <w:spacing w:before="360"/>
-        <w:jc w:val="center"/>
-      </w:pPr>
-      <w:r>
-        <w:rPr>
-          <w:rFonts w:ascii="Times New Roman" w:hAnsi="Times New Roman"/>
-          <w:sz w:val="24"/>
-        </w:rPr>
-        <w:t>Submitted in Partial Fulfilment of the Requirements</w:t>
-        <w:br/>
-        <w:t>for the Award of the Degree of</w:t>
-      </w:r>
-    </w:p>
-    <w:p>
-      <w:pPr>
-        <w:spacing w:before="120" w:after="720"/>
-        <w:jc w:val="center"/>
-      </w:pPr>
-      <w:r>
-        <w:rPr>
-          <w:rFonts w:ascii="Times New Roman" w:hAnsi="Times New Roman"/>
-          <w:b/>
-          <w:sz w:val="28"/>
-        </w:rPr>
         <w:t>Master of Computer Applications (MCA)</w:t>
       </w:r>
     </w:p>
+    <w:tbl>
+      <w:tblPr>
+        <w:tblW w:type="auto" w:w="0"/>
+        <w:jc w:val="center"/>
+        <w:tblLook w:firstColumn="1" w:firstRow="1" w:lastColumn="0" w:lastRow="0" w:noHBand="0" w:noVBand="1" w:val="04A0"/>
+      </w:tblPr>
+      <w:tblGrid>
+        <w:gridCol w:w="4498"/>
+        <w:gridCol w:w="4498"/>
+      </w:tblGrid>
+      <w:tr>
+        <w:tc>
+          <w:tcPr>
+            <w:tcW w:type="dxa" w:w="4498"/>
+            <w:tcBorders>
+              <w:top w:val="none" w:sz="0"/>
+              <w:left w:val="none" w:sz="0"/>
+              <w:bottom w:val="none" w:sz="0"/>
+              <w:right w:val="none" w:sz="0"/>
+            </w:tcBorders>
+          </w:tcPr>
+          <w:p>
+            <w:pPr>
+              <w:jc w:val="center"/>
+            </w:pPr>
+            <w:r>
+              <w:rPr>
+                <w:rFonts w:ascii="Times New Roman" w:hAnsi="Times New Roman"/>
+                <w:sz w:val="20"/>
+              </w:rPr>
+              <w:t>Submitted By</w:t>
+            </w:r>
+          </w:p>
+        </w:tc>
+        <w:tc>
+          <w:tcPr>
+            <w:tcW w:type="dxa" w:w="4498"/>
+            <w:tcBorders>
+              <w:top w:val="none" w:sz="0"/>
+              <w:left w:val="none" w:sz="0"/>
+              <w:bottom w:val="none" w:sz="0"/>
+              <w:right w:val="none" w:sz="0"/>
+            </w:tcBorders>
+          </w:tcPr>
+          <w:p>
+            <w:pPr>
+              <w:jc w:val="center"/>
+            </w:pPr>
+            <w:r>
+              <w:rPr>
+                <w:rFonts w:ascii="Times New Roman" w:hAnsi="Times New Roman"/>
+                <w:sz w:val="20"/>
+              </w:rPr>
+              <w:t>Under the Guidance of</w:t>
+            </w:r>
+          </w:p>
+        </w:tc>
+      </w:tr>
+      <w:tr>
+        <w:tc>
+          <w:tcPr>
+            <w:tcW w:type="dxa" w:w="4498"/>
+            <w:tcBorders>
+              <w:top w:val="none" w:sz="0"/>
+              <w:left w:val="none" w:sz="0"/>
+              <w:bottom w:val="none" w:sz="0"/>
+              <w:right w:val="none" w:sz="0"/>
+            </w:tcBorders>
+          </w:tcPr>
+          <w:p>
+            <w:pPr>
+              <w:jc w:val="center"/>
+            </w:pPr>
+            <w:r>
+              <w:rPr>
+                <w:rFonts w:ascii="Times New Roman" w:hAnsi="Times New Roman"/>
+                <w:b/>
+                <w:sz w:val="26"/>
+              </w:rPr>
+              <w:t>Sandeep Kumar</w:t>
+            </w:r>
+          </w:p>
+        </w:tc>
+        <w:tc>
+          <w:tcPr>
+            <w:tcW w:type="dxa" w:w="4498"/>
+            <w:tcBorders>
+              <w:top w:val="none" w:sz="0"/>
+              <w:left w:val="none" w:sz="0"/>
+              <w:bottom w:val="none" w:sz="0"/>
+              <w:right w:val="none" w:sz="0"/>
+            </w:tcBorders>
+          </w:tcPr>
+          <w:p>
+            <w:pPr>
+              <w:jc w:val="center"/>
+            </w:pPr>
+            <w:r>
+              <w:rPr>
+                <w:rFonts w:ascii="Times New Roman" w:hAnsi="Times New Roman"/>
+                <w:b/>
+                <w:sz w:val="26"/>
+              </w:rPr>
+              <w:t>Amit Kharb</w:t>
+            </w:r>
+          </w:p>
+        </w:tc>
+      </w:tr>
+      <w:tr>
+        <w:tc>
+          <w:tcPr>
+            <w:tcW w:type="dxa" w:w="4498"/>
+            <w:tcBorders>
+              <w:top w:val="none" w:sz="0"/>
+              <w:left w:val="none" w:sz="0"/>
+              <w:bottom w:val="none" w:sz="0"/>
+              <w:right w:val="none" w:sz="0"/>
+            </w:tcBorders>
+          </w:tcPr>
+          <w:p>
+            <w:pPr>
+              <w:jc w:val="center"/>
+            </w:pPr>
+            <w:r>
+              <w:rPr>
+                <w:rFonts w:ascii="Times New Roman" w:hAnsi="Times New Roman"/>
+                <w:sz w:val="20"/>
+              </w:rPr>
+              <w:t>MCA Student</w:t>
+            </w:r>
+          </w:p>
+        </w:tc>
+        <w:tc>
+          <w:tcPr>
+            <w:tcW w:type="dxa" w:w="4498"/>
+            <w:tcBorders>
+              <w:top w:val="none" w:sz="0"/>
+              <w:left w:val="none" w:sz="0"/>
+              <w:bottom w:val="none" w:sz="0"/>
+              <w:right w:val="none" w:sz="0"/>
+            </w:tcBorders>
+          </w:tcPr>
+          <w:p>
+            <w:pPr>
+              <w:jc w:val="center"/>
+            </w:pPr>
+            <w:r>
+              <w:rPr>
+                <w:rFonts w:ascii="Times New Roman" w:hAnsi="Times New Roman"/>
+                <w:sz w:val="20"/>
+              </w:rPr>
+              <w:t>Project Guide</w:t>
+            </w:r>
+          </w:p>
+        </w:tc>
+      </w:tr>
+    </w:tbl>
     <w:p>
       <w:pPr>
-        <w:spacing w:before="240" w:after="0"/>
-        <w:jc w:val="center"/>
-      </w:pPr>
-      <w:r>
-        <w:rPr>
-          <w:rFonts w:ascii="Times New Roman" w:hAnsi="Times New Roman"/>
-          <w:b w:val="0"/>
-          <w:sz w:val="22"/>
-        </w:rPr>
-        <w:t>Submitted By</w:t>
-      </w:r>
-    </w:p>
-    <w:p>
-      <w:pPr>
-        <w:spacing w:before="0" w:after="360"/>
-        <w:jc w:val="center"/>
-      </w:pPr>
-      <w:r>
-        <w:rPr>
-          <w:rFonts w:ascii="Times New Roman" w:hAnsi="Times New Roman"/>
-          <w:b/>
-          <w:sz w:val="28"/>
-        </w:rPr>
-        <w:t>Sandeep Kumar</w:t>
-      </w:r>
-    </w:p>
-    <w:p>
-      <w:pPr>
-        <w:spacing w:before="120" w:after="0"/>
-        <w:jc w:val="center"/>
-      </w:pPr>
-      <w:r>
-        <w:rPr>
-          <w:rFonts w:ascii="Times New Roman" w:hAnsi="Times New Roman"/>
-          <w:b w:val="0"/>
-          <w:sz w:val="22"/>
-        </w:rPr>
-        <w:t>Under the Guidance of</w:t>
-      </w:r>
-    </w:p>
-    <w:p>
-      <w:pPr>
-        <w:spacing w:before="0" w:after="960"/>
-        <w:jc w:val="center"/>
-      </w:pPr>
-      <w:r>
-        <w:rPr>
-          <w:rFonts w:ascii="Times New Roman" w:hAnsi="Times New Roman"/>
-          <w:b/>
-          <w:sz w:val="28"/>
-        </w:rPr>
-        <w:t>Amit Kharb</w:t>
-      </w:r>
-    </w:p>
-    <w:p>
-      <w:pPr>
-        <w:spacing w:before="240" w:after="0"/>
+        <w:spacing w:before="360" w:after="0"/>
         <w:jc w:val="center"/>
       </w:pPr>
       <w:r>
@@ -241,7 +311,6 @@
         <w:rPr>
           <w:rFonts w:ascii="Times New Roman" w:hAnsi="Times New Roman"/>
           <w:b w:val="0"/>
-          <w:i w:val="0"/>
           <w:sz w:val="24"/>
         </w:rPr>
         <w:t>Heart disease remains one of the most pressing health challenges of our time. According to the World Health Organisation, cardiovascular diseases claim roughly 17.9 million lives every year, making them the single largest cause of death worldwide. India is particularly affected — nearly one in four deaths in the country is attributed to some form of cardiovascular condition, and the numbers have been climbing steadily over the past two decades.</w:t>
@@ -257,10 +326,9 @@
         <w:rPr>
           <w:rFonts w:ascii="Times New Roman" w:hAnsi="Times New Roman"/>
           <w:b w:val="0"/>
-          <w:i w:val="0"/>
           <w:sz w:val="24"/>
         </w:rPr>
-        <w:t>What makes this problem especially difficult is the gap between where the patients are and where the diagnostics are. Traditional cardiac screening relies on tests like electrocardiograms, echocardiography, and coronary angiography — all of which require expensive equipment and trained specialists. In rural India, where roughly 70% of the population lives, these facilities are simply not available. Patients often have to travel hours to reach a hospital that can run basic cardiac diagnostics, and by that point, critical time may have been lost.</w:t>
+        <w:t>What makes this problem especially difficult is the gap between where the patients are and where the diagnostics are. Traditional cardiac screening relies on tests like electrocardiograms, echocardiography, and coronary angiography — all of which require expensive equipment and trained specialists. In rural India, where roughly 70% of the population lives, these facilities are simply not available.</w:t>
       </w:r>
     </w:p>
     <w:p>
@@ -273,10 +341,9 @@
         <w:rPr>
           <w:rFonts w:ascii="Times New Roman" w:hAnsi="Times New Roman"/>
           <w:b w:val="0"/>
-          <w:i w:val="0"/>
           <w:sz w:val="24"/>
         </w:rPr>
-        <w:t>Over the past decade, machine learning has shown real promise in bridging this gap. Researchers have demonstrated that trained classifiers can estimate heart disease risk using nothing more than a handful of routine clinical measurements — age, blood pressure, cholesterol, heart rate, and a few other numbers that any primary care physician can collect during a standard check-up. The accuracy of these models, when built carefully, rivals that of many conventional screening methods.</w:t>
+        <w:t>Over the past decade, machine learning has shown real promise in bridging this gap. Researchers have demonstrated that trained classifiers can estimate heart disease risk using nothing more than a handful of routine clinical measurements — age, blood pressure, cholesterol, heart rate, and a few other numbers that any primary care physician can collect during a standard check-up.</w:t>
       </w:r>
     </w:p>
     <w:p>
@@ -289,10 +356,9 @@
         <w:rPr>
           <w:rFonts w:ascii="Times New Roman" w:hAnsi="Times New Roman"/>
           <w:b w:val="0"/>
-          <w:i w:val="0"/>
           <w:sz w:val="24"/>
         </w:rPr>
-        <w:t>CardioPredict is an attempt to take this idea from research papers into practice. It is a web application — built with Flask, Python, and a trained Random Forest model — that accepts 13 clinical parameters through a simple form and returns an instant heart disease probability estimate. The goal is not to replace doctors, but to give them a quick, low-cost screening tool that they can use in settings where advanced diagnostics are out of reach.</w:t>
+        <w:t>CardioPredict is an attempt to take this idea from research papers into practice. It is a web application — built with Flask, Python, and a trained Random Forest model — that accepts 13 clinical parameters through a simple form and returns an instant heart disease probability estimate.</w:t>
       </w:r>
     </w:p>
     <w:p>
@@ -317,7 +383,6 @@
         <w:rPr>
           <w:rFonts w:ascii="Times New Roman" w:hAnsi="Times New Roman"/>
           <w:b w:val="0"/>
-          <w:i w:val="0"/>
           <w:sz w:val="24"/>
         </w:rPr>
         <w:t>The core problem is straightforward: there is no affordable, easy-to-use screening tool that a primary care physician in a small clinic can use to quickly assess whether a patient might have heart disease. The existing path — refer the patient to a specialist, wait for an appointment, run expensive tests, wait for results — is slow, costly, and simply unavailable in many parts of the country.</w:t>
@@ -333,10 +398,9 @@
         <w:rPr>
           <w:rFonts w:ascii="Times New Roman" w:hAnsi="Times New Roman"/>
           <w:b w:val="0"/>
-          <w:i w:val="0"/>
           <w:sz w:val="24"/>
         </w:rPr>
-        <w:t>From a technical standpoint, the gap is not in the machine learning research. Plenty of studies have shown that classifiers trained on the UCI Cleveland Heart Disease dataset can achieve accuracies in the 80–90% range. The gap is in delivery. Most of these models exist as Jupyter notebooks or command-line scripts that no clinician would ever use. They lack a proper user interface, input validation, result interpretation, and the kind of packaging that would make them deployable in a real healthcare setting.</w:t>
+        <w:t>From a technical standpoint, the gap is not in the machine learning research itself. Plenty of studies have shown that classifiers trained on the UCI Cleveland Heart Disease dataset can achieve accuracies in the 80–90% range. The gap is in delivery. Most of these models exist as Jupyter notebooks or command-line scripts that no clinician would ever use.</w:t>
       </w:r>
     </w:p>
     <w:p>
@@ -349,7 +413,6 @@
         <w:rPr>
           <w:rFonts w:ascii="Times New Roman" w:hAnsi="Times New Roman"/>
           <w:b w:val="0"/>
-          <w:i w:val="0"/>
           <w:sz w:val="24"/>
         </w:rPr>
         <w:t>CardioPredict aims to close this gap by building the complete pipeline: data preprocessing, model training and selection, a production-grade web application with proper validation, a prediction history database, and containerised deployment — all in one project.</w:t>
@@ -377,7 +440,6 @@
         <w:rPr>
           <w:rFonts w:ascii="Times New Roman" w:hAnsi="Times New Roman"/>
           <w:b w:val="0"/>
-          <w:i w:val="0"/>
           <w:sz w:val="24"/>
         </w:rPr>
         <w:t>This project has seven specific objectives:</w:t>
@@ -392,7 +454,7 @@
           <w:rFonts w:ascii="Times New Roman" w:hAnsi="Times New Roman"/>
           <w:sz w:val="24"/>
         </w:rPr>
-        <w:t>Perform exploratory data analysis on the Cleveland Heart Disease dataset (303 patients, 13 clinical features) to understand feature distributions, correlations, and class balance.</w:t>
+        <w:t>Perform exploratory data analysis on the Cleveland Heart Disease dataset (303 patients, 13 clinical features).</w:t>
       </w:r>
     </w:p>
     <w:p>
@@ -404,7 +466,7 @@
           <w:rFonts w:ascii="Times New Roman" w:hAnsi="Times New Roman"/>
           <w:sz w:val="24"/>
         </w:rPr>
-        <w:t>Train and evaluate seven different classification algorithms — Logistic Regression, Decision Tree, Random Forest, SVM, KNN, Gradient Boosting, and AdaBoost — using stratified 10-fold cross-validation, and select the best performer.</w:t>
+        <w:t>Train and evaluate seven classification algorithms using stratified 10-fold cross-validation, and select the best performer.</w:t>
       </w:r>
     </w:p>
     <w:p>
@@ -416,7 +478,7 @@
           <w:rFonts w:ascii="Times New Roman" w:hAnsi="Times New Roman"/>
           <w:sz w:val="24"/>
         </w:rPr>
-        <w:t>Develop a complete web application using Flask that lets a clinician enter patient data through an intuitive form and receive an instant prediction with a colour-coded risk level.</w:t>
+        <w:t>Develop a complete web application using Flask that lets a clinician enter patient data and receive an instant prediction.</w:t>
       </w:r>
     </w:p>
     <w:p>
@@ -428,7 +490,7 @@
           <w:rFonts w:ascii="Times New Roman" w:hAnsi="Times New Roman"/>
           <w:sz w:val="24"/>
         </w:rPr>
-        <w:t>Implement input validation on both the client side (HTML5 constraints, JavaScript checks) and the server side (Python type/range validation) so that bad data never reaches the model.</w:t>
+        <w:t>Implement input validation on both the client side (HTML5, JavaScript) and the server side (Python type/range checks).</w:t>
       </w:r>
     </w:p>
     <w:p>
@@ -440,7 +502,7 @@
           <w:rFonts w:ascii="Times New Roman" w:hAnsi="Times New Roman"/>
           <w:sz w:val="24"/>
         </w:rPr>
-        <w:t>Store every prediction in a SQLite database, along with timestamps and input values, to enable longitudinal tracking of patients over time.</w:t>
+        <w:t>Store every prediction in a SQLite database with timestamps for longitudinal patient tracking.</w:t>
       </w:r>
     </w:p>
     <w:p>
@@ -452,7 +514,7 @@
           <w:rFonts w:ascii="Times New Roman" w:hAnsi="Times New Roman"/>
           <w:sz w:val="24"/>
         </w:rPr>
-        <w:t>Containerise the entire application with Docker and configure a production-grade Gunicorn server, so the system can be deployed on any machine with a single command.</w:t>
+        <w:t>Containerise the application with Docker and configure a Gunicorn production server.</w:t>
       </w:r>
     </w:p>
     <w:p>
@@ -464,7 +526,7 @@
           <w:rFonts w:ascii="Times New Roman" w:hAnsi="Times New Roman"/>
           <w:sz w:val="24"/>
         </w:rPr>
-        <w:t>Write a comprehensive test suite using pytest — covering routing, prediction logic, content validation, edge cases, and database operations — to ensure reliability.</w:t>
+        <w:t>Write a comprehensive test suite using pytest covering routing, prediction logic, edge cases, and database operations.</w:t>
       </w:r>
     </w:p>
     <w:p>
@@ -488,7 +550,7 @@
           <w:rFonts w:ascii="Times New Roman" w:hAnsi="Times New Roman"/>
           <w:color w:val="000000"/>
         </w:rPr>
-        <w:t>4.1 What the Project Covers</w:t>
+        <w:t>4.1 Scope</w:t>
       </w:r>
     </w:p>
     <w:p>
@@ -501,10 +563,9 @@
         <w:rPr>
           <w:rFonts w:ascii="Times New Roman" w:hAnsi="Times New Roman"/>
           <w:b w:val="0"/>
-          <w:i w:val="0"/>
           <w:sz w:val="24"/>
         </w:rPr>
-        <w:t>The scope of CardioPredict includes:</w:t>
+        <w:t>The project covers:</w:t>
       </w:r>
     </w:p>
     <w:p>
@@ -516,7 +577,7 @@
           <w:rFonts w:ascii="Times New Roman" w:hAnsi="Times New Roman"/>
           <w:sz w:val="24"/>
         </w:rPr>
-        <w:t>Binary classification (disease present / disease absent) using 13 clinical parameters.</w:t>
+        <w:t>Binary classification (disease / no disease) based on 13 clinical parameters.</w:t>
       </w:r>
     </w:p>
     <w:p>
@@ -528,7 +589,7 @@
           <w:rFonts w:ascii="Times New Roman" w:hAnsi="Times New Roman"/>
           <w:sz w:val="24"/>
         </w:rPr>
-        <w:t>A multi-page web application with a prediction form, result display, prediction history, model information page, and a parameter reference page.</w:t>
+        <w:t>A multi-page web application with prediction form, result display, history, model information, and parameter reference.</w:t>
       </w:r>
     </w:p>
     <w:p>
@@ -540,7 +601,7 @@
           <w:rFonts w:ascii="Times New Roman" w:hAnsi="Times New Roman"/>
           <w:sz w:val="24"/>
         </w:rPr>
-        <w:t>Accessibility features: dark mode toggle, adjustable font sizes, and text scaling.</w:t>
+        <w:t>Accessibility features: dark mode, adjustable font sizes, text scaling.</w:t>
       </w:r>
     </w:p>
     <w:p>
@@ -552,7 +613,7 @@
           <w:rFonts w:ascii="Times New Roman" w:hAnsi="Times New Roman"/>
           <w:sz w:val="24"/>
         </w:rPr>
-        <w:t>A REST API endpoint that returns predictions in JSON format for programmatic access.</w:t>
+        <w:t>A REST API endpoint returning predictions in JSON format.</w:t>
       </w:r>
     </w:p>
     <w:p>
@@ -576,7 +637,7 @@
           <w:rFonts w:ascii="Times New Roman" w:hAnsi="Times New Roman"/>
           <w:color w:val="000000"/>
         </w:rPr>
-        <w:t>4.2 Known Limitations</w:t>
+        <w:t>4.2 Limitations</w:t>
       </w:r>
     </w:p>
     <w:p>
@@ -588,7 +649,7 @@
           <w:rFonts w:ascii="Times New Roman" w:hAnsi="Times New Roman"/>
           <w:sz w:val="24"/>
         </w:rPr>
-        <w:t>The training dataset has only 303 records from a single hospital (Cleveland Clinic). A production system would need data from multiple institutions across different demographics.</w:t>
+        <w:t>Training data contains only 303 records from a single hospital. A production system would need multi-institutional data.</w:t>
       </w:r>
     </w:p>
     <w:p>
@@ -600,7 +661,7 @@
           <w:rFonts w:ascii="Times New Roman" w:hAnsi="Times New Roman"/>
           <w:sz w:val="24"/>
         </w:rPr>
-        <w:t>The system is a screening aid, not a diagnostic tool. It should always be used alongside clinical judgement, never as a standalone replacement for professional evaluation.</w:t>
+        <w:t>The system is a screening aid, not a diagnostic tool — it should always be used alongside clinical judgement.</w:t>
       </w:r>
     </w:p>
     <w:p>
@@ -612,7 +673,7 @@
           <w:rFonts w:ascii="Times New Roman" w:hAnsi="Times New Roman"/>
           <w:sz w:val="24"/>
         </w:rPr>
-        <w:t>There is no user authentication in the current version. In a real deployment, role-based access control would be needed to protect patient data.</w:t>
+        <w:t>No user authentication in the current version.</w:t>
       </w:r>
     </w:p>
     <w:p>
@@ -649,10 +710,9 @@
         <w:rPr>
           <w:rFonts w:ascii="Times New Roman" w:hAnsi="Times New Roman"/>
           <w:b w:val="0"/>
-          <w:i w:val="0"/>
           <w:sz w:val="24"/>
         </w:rPr>
-        <w:t>The project uses the Cleveland Heart Disease dataset, originally collected at the Cleveland Clinic Foundation and made available through the UCI Machine Learning Repository. It contains 303 patient records, each described by 13 clinical features: age, sex, chest pain type (4 categories), resting blood pressure, serum cholesterol, fasting blood sugar, resting ECG results (3 categories), maximum heart rate achieved, exercise-induced angina, ST depression induced by exercise, the slope of the peak exercise ST segment, number of major vessels coloured by fluoroscopy (0–3), and thalassemia type (3 categories). The target variable is binary: 0 for no disease, 1 for disease present.</w:t>
+        <w:t>The project uses the Cleveland Heart Disease dataset from the UCI Machine Learning Repository — 303 patient records with 13 clinical features and a binary target (0 = no disease, 1 = disease). Features include age, sex, chest pain type, blood pressure, cholesterol, fasting blood sugar, resting ECG, maximum heart rate, exercise-induced angina, ST depression, ST slope, major vessels, and thalassemia type.</w:t>
       </w:r>
     </w:p>
     <w:p>
@@ -664,23 +724,7 @@
           <w:rFonts w:ascii="Times New Roman" w:hAnsi="Times New Roman"/>
           <w:color w:val="000000"/>
         </w:rPr>
-        <w:t>5.2 Data Preprocessing</w:t>
-      </w:r>
-    </w:p>
-    <w:p>
-      <w:pPr>
-        <w:spacing w:after="120"/>
-        <w:ind w:firstLine="0"/>
-        <w:jc w:val="both"/>
-      </w:pPr>
-      <w:r>
-        <w:rPr>
-          <w:rFonts w:ascii="Times New Roman" w:hAnsi="Times New Roman"/>
-          <w:b w:val="0"/>
-          <w:i w:val="0"/>
-          <w:sz w:val="24"/>
-        </w:rPr>
-        <w:t>The preprocessing pipeline involves three steps:</w:t>
+        <w:t>5.2 Preprocessing</w:t>
       </w:r>
     </w:p>
     <w:p>
@@ -692,7 +736,7 @@
           <w:rFonts w:ascii="Times New Roman" w:hAnsi="Times New Roman"/>
           <w:sz w:val="24"/>
         </w:rPr>
-        <w:t>Missing value imputation: The ca (major vessels) and thal (thalassemia) columns have missing values in a few records. These are filled using the median of each column, which is robust to outliers and preserves the overall distribution.</w:t>
+        <w:t>Missing value imputation: median imputation for ca and thal columns.</w:t>
       </w:r>
     </w:p>
     <w:p>
@@ -704,7 +748,7 @@
           <w:rFonts w:ascii="Times New Roman" w:hAnsi="Times New Roman"/>
           <w:sz w:val="24"/>
         </w:rPr>
-        <w:t>Feature scaling: All 13 features are normalised using StandardScaler, which transforms each feature to have zero mean and unit variance. This step is essential for algorithms like SVM and KNN that are sensitive to the scale of input features.</w:t>
+        <w:t>Feature scaling: StandardScaler (z-score normalisation) applied to all 13 features.</w:t>
       </w:r>
     </w:p>
     <w:p>
@@ -716,7 +760,7 @@
           <w:rFonts w:ascii="Times New Roman" w:hAnsi="Times New Roman"/>
           <w:sz w:val="24"/>
         </w:rPr>
-        <w:t>Train-test split: The data is split 80/20 (242 training, 61 testing) using stratified sampling to ensure both sets have the same proportion of disease/no-disease cases.</w:t>
+        <w:t>Train-test split: 80/20 stratified split (242 training, 61 testing samples).</w:t>
       </w:r>
     </w:p>
     <w:p>
@@ -728,7 +772,7 @@
           <w:rFonts w:ascii="Times New Roman" w:hAnsi="Times New Roman"/>
           <w:color w:val="000000"/>
         </w:rPr>
-        <w:t>5.3 Model Training Pipeline</w:t>
+        <w:t>5.3 Pipeline</w:t>
       </w:r>
     </w:p>
     <w:tbl>
@@ -788,7 +832,7 @@
                 <w:b/>
                 <w:sz w:val="22"/>
               </w:rPr>
-              <w:t>Tools Used</w:t>
+              <w:t>Tools</w:t>
             </w:r>
           </w:p>
         </w:tc>
@@ -818,7 +862,7 @@
                 <w:rFonts w:ascii="Times New Roman" w:hAnsi="Times New Roman"/>
                 <w:sz w:val="22"/>
               </w:rPr>
-              <w:t>Read the CSV, inspect shape and types</w:t>
+              <w:t>Read CSV, inspect shape and types</w:t>
             </w:r>
           </w:p>
         </w:tc>
@@ -848,7 +892,7 @@
                 <w:rFonts w:ascii="Times New Roman" w:hAnsi="Times New Roman"/>
                 <w:sz w:val="22"/>
               </w:rPr>
-              <w:t>Exploratory analysis</w:t>
+              <w:t>EDA</w:t>
             </w:r>
           </w:p>
         </w:tc>
@@ -936,7 +980,7 @@
                 <w:rFonts w:ascii="Times New Roman" w:hAnsi="Times New Roman"/>
                 <w:sz w:val="22"/>
               </w:rPr>
-              <w:t>Model training</w:t>
+              <w:t>Training</w:t>
             </w:r>
           </w:p>
         </w:tc>
@@ -1038,7 +1082,7 @@
                 <w:rFonts w:ascii="Times New Roman" w:hAnsi="Times New Roman"/>
                 <w:sz w:val="22"/>
               </w:rPr>
-              <w:t>Save the best model and scaler as .pkl files</w:t>
+              <w:t>Save best model and scaler as .pkl files</w:t>
             </w:r>
           </w:p>
         </w:tc>
@@ -1068,23 +1112,7 @@
           <w:rFonts w:ascii="Times New Roman" w:hAnsi="Times New Roman"/>
           <w:color w:val="000000"/>
         </w:rPr>
-        <w:t>5.4 Algorithms Compared</w:t>
-      </w:r>
-    </w:p>
-    <w:p>
-      <w:pPr>
-        <w:spacing w:after="120"/>
-        <w:ind w:firstLine="0"/>
-        <w:jc w:val="both"/>
-      </w:pPr>
-      <w:r>
-        <w:rPr>
-          <w:rFonts w:ascii="Times New Roman" w:hAnsi="Times New Roman"/>
-          <w:b w:val="0"/>
-          <w:i w:val="0"/>
-          <w:sz w:val="24"/>
-        </w:rPr>
-        <w:t>Seven algorithms were trained and compared. The table below lists each one with its type and the reason it was included in the comparison:</w:t>
+        <w:t>5.4 Algorithms</w:t>
       </w:r>
     </w:p>
     <w:tbl>
@@ -1144,7 +1172,7 @@
                 <w:b/>
                 <w:sz w:val="22"/>
               </w:rPr>
-              <w:t>Why It Was Included</w:t>
+              <w:t>Why Included</w:t>
             </w:r>
           </w:p>
         </w:tc>
@@ -1232,7 +1260,7 @@
                 <w:rFonts w:ascii="Times New Roman" w:hAnsi="Times New Roman"/>
                 <w:sz w:val="22"/>
               </w:rPr>
-              <w:t>Highly interpretable; useful for understanding splits</w:t>
+              <w:t>Interpretable; useful for understanding splits</w:t>
             </w:r>
           </w:p>
         </w:tc>
@@ -1276,7 +1304,7 @@
                 <w:rFonts w:ascii="Times New Roman" w:hAnsi="Times New Roman"/>
                 <w:sz w:val="22"/>
               </w:rPr>
-              <w:t>Reduces variance of individual trees; handles mixed feature types well</w:t>
+              <w:t>Reduces variance; handles mixed features well</w:t>
             </w:r>
           </w:p>
         </w:tc>
@@ -1320,7 +1348,7 @@
                 <w:rFonts w:ascii="Times New Roman" w:hAnsi="Times New Roman"/>
                 <w:sz w:val="22"/>
               </w:rPr>
-              <w:t>Strong performance in high-dimensional spaces</w:t>
+              <w:t>Strong in high-dimensional spaces</w:t>
             </w:r>
           </w:p>
         </w:tc>
@@ -1408,7 +1436,7 @@
                 <w:rFonts w:ascii="Times New Roman" w:hAnsi="Times New Roman"/>
                 <w:sz w:val="22"/>
               </w:rPr>
-              <w:t>Sequentially corrects errors; often top performer</w:t>
+              <w:t>Sequentially corrects errors</w:t>
             </w:r>
           </w:p>
         </w:tc>
@@ -1452,7 +1480,7 @@
                 <w:rFonts w:ascii="Times New Roman" w:hAnsi="Times New Roman"/>
                 <w:sz w:val="22"/>
               </w:rPr>
-              <w:t>Focuses on samples the previous model got wrong</w:t>
+              <w:t>Focuses on hard examples</w:t>
             </w:r>
           </w:p>
         </w:tc>
@@ -1469,22 +1497,6 @@
           <w:color w:val="000000"/>
         </w:rPr>
         <w:t>6. Technology Stack</w:t>
-      </w:r>
-    </w:p>
-    <w:p>
-      <w:pPr>
-        <w:spacing w:after="120"/>
-        <w:ind w:firstLine="0"/>
-        <w:jc w:val="both"/>
-      </w:pPr>
-      <w:r>
-        <w:rPr>
-          <w:rFonts w:ascii="Times New Roman" w:hAnsi="Times New Roman"/>
-          <w:b w:val="0"/>
-          <w:i w:val="0"/>
-          <w:sz w:val="24"/>
-        </w:rPr>
-        <w:t>The following table lists every major technology used in the project, along with its role:</w:t>
       </w:r>
     </w:p>
     <w:tbl>
@@ -1544,7 +1556,7 @@
                 <w:b/>
                 <w:sz w:val="22"/>
               </w:rPr>
-              <w:t>Role in the Project</w:t>
+              <w:t>Role</w:t>
             </w:r>
           </w:p>
         </w:tc>
@@ -1588,7 +1600,7 @@
                 <w:rFonts w:ascii="Times New Roman" w:hAnsi="Times New Roman"/>
                 <w:sz w:val="22"/>
               </w:rPr>
-              <w:t>All backend code, model training, and scripting</w:t>
+              <w:t>All backend code and ML training</w:t>
             </w:r>
           </w:p>
         </w:tc>
@@ -1632,7 +1644,7 @@
                 <w:rFonts w:ascii="Times New Roman" w:hAnsi="Times New Roman"/>
                 <w:sz w:val="22"/>
               </w:rPr>
-              <w:t>Data processing, model training, evaluation</w:t>
+              <w:t>Data processing and model training</w:t>
             </w:r>
           </w:p>
         </w:tc>
@@ -1676,7 +1688,7 @@
                 <w:rFonts w:ascii="Times New Roman" w:hAnsi="Times New Roman"/>
                 <w:sz w:val="22"/>
               </w:rPr>
-              <w:t>Training-time charts and heatmaps</w:t>
+              <w:t>Training-time charts</w:t>
             </w:r>
           </w:p>
         </w:tc>
@@ -1720,7 +1732,7 @@
                 <w:rFonts w:ascii="Times New Roman" w:hAnsi="Times New Roman"/>
                 <w:sz w:val="22"/>
               </w:rPr>
-              <w:t>HTTP routing, request handling, template rendering</w:t>
+              <w:t>HTTP routing, template rendering</w:t>
             </w:r>
           </w:p>
         </w:tc>
@@ -1750,7 +1762,7 @@
                 <w:rFonts w:ascii="Times New Roman" w:hAnsi="Times New Roman"/>
                 <w:sz w:val="22"/>
               </w:rPr>
-              <w:t>HTML5, CSS3, JavaScript (ES6)</w:t>
+              <w:t>HTML5, CSS3, JavaScript</w:t>
             </w:r>
           </w:p>
         </w:tc>
@@ -1764,51 +1776,7 @@
                 <w:rFonts w:ascii="Times New Roman" w:hAnsi="Times New Roman"/>
                 <w:sz w:val="22"/>
               </w:rPr>
-              <w:t>Browser UI — no external JS frameworks used</w:t>
-            </w:r>
-          </w:p>
-        </w:tc>
-      </w:tr>
-      <w:tr>
-        <w:tc>
-          <w:tcPr>
-            <w:tcW w:type="dxa" w:w="2999"/>
-          </w:tcPr>
-          <w:p>
-            <w:r>
-              <w:rPr>
-                <w:rFonts w:ascii="Times New Roman" w:hAnsi="Times New Roman"/>
-                <w:sz w:val="22"/>
-              </w:rPr>
-              <w:t>Templating</w:t>
-            </w:r>
-          </w:p>
-        </w:tc>
-        <w:tc>
-          <w:tcPr>
-            <w:tcW w:type="dxa" w:w="2999"/>
-          </w:tcPr>
-          <w:p>
-            <w:r>
-              <w:rPr>
-                <w:rFonts w:ascii="Times New Roman" w:hAnsi="Times New Roman"/>
-                <w:sz w:val="22"/>
-              </w:rPr>
-              <w:t>Jinja2</w:t>
-            </w:r>
-          </w:p>
-        </w:tc>
-        <w:tc>
-          <w:tcPr>
-            <w:tcW w:type="dxa" w:w="2999"/>
-          </w:tcPr>
-          <w:p>
-            <w:r>
-              <w:rPr>
-                <w:rFonts w:ascii="Times New Roman" w:hAnsi="Times New Roman"/>
-                <w:sz w:val="22"/>
-              </w:rPr>
-              <w:t>Server-side HTML rendering with template inheritance</w:t>
+              <w:t>Browser UI (no frameworks)</w:t>
             </w:r>
           </w:p>
         </w:tc>
@@ -1852,7 +1820,7 @@
                 <w:rFonts w:ascii="Times New Roman" w:hAnsi="Times New Roman"/>
                 <w:sz w:val="22"/>
               </w:rPr>
-              <w:t>Lightweight prediction history storage</w:t>
+              <w:t>Prediction history storage</w:t>
             </w:r>
           </w:p>
         </w:tc>
@@ -1926,7 +1894,7 @@
                 <w:rFonts w:ascii="Times New Roman" w:hAnsi="Times New Roman"/>
                 <w:sz w:val="22"/>
               </w:rPr>
-              <w:t>Docker + Docker Compose</w:t>
+              <w:t>Docker + Gunicorn</w:t>
             </w:r>
           </w:p>
         </w:tc>
@@ -1940,51 +1908,7 @@
                 <w:rFonts w:ascii="Times New Roman" w:hAnsi="Times New Roman"/>
                 <w:sz w:val="22"/>
               </w:rPr>
-              <w:t>One-command deployment on any machine</w:t>
-            </w:r>
-          </w:p>
-        </w:tc>
-      </w:tr>
-      <w:tr>
-        <w:tc>
-          <w:tcPr>
-            <w:tcW w:type="dxa" w:w="2999"/>
-          </w:tcPr>
-          <w:p>
-            <w:r>
-              <w:rPr>
-                <w:rFonts w:ascii="Times New Roman" w:hAnsi="Times New Roman"/>
-                <w:sz w:val="22"/>
-              </w:rPr>
-              <w:t>Production server</w:t>
-            </w:r>
-          </w:p>
-        </w:tc>
-        <w:tc>
-          <w:tcPr>
-            <w:tcW w:type="dxa" w:w="2999"/>
-          </w:tcPr>
-          <w:p>
-            <w:r>
-              <w:rPr>
-                <w:rFonts w:ascii="Times New Roman" w:hAnsi="Times New Roman"/>
-                <w:sz w:val="22"/>
-              </w:rPr>
-              <w:t>Gunicorn</w:t>
-            </w:r>
-          </w:p>
-        </w:tc>
-        <w:tc>
-          <w:tcPr>
-            <w:tcW w:type="dxa" w:w="2999"/>
-          </w:tcPr>
-          <w:p>
-            <w:r>
-              <w:rPr>
-                <w:rFonts w:ascii="Times New Roman" w:hAnsi="Times New Roman"/>
-                <w:sz w:val="22"/>
-              </w:rPr>
-              <w:t>Multi-worker WSGI server for production use</w:t>
+              <w:t>Production deployment</w:t>
             </w:r>
           </w:p>
         </w:tc>
@@ -2028,7 +1952,7 @@
                 <w:rFonts w:ascii="Times New Roman" w:hAnsi="Times New Roman"/>
                 <w:sz w:val="22"/>
               </w:rPr>
-              <w:t>Source code management and collaboration</w:t>
+              <w:t>Source code management</w:t>
             </w:r>
           </w:p>
         </w:tc>
@@ -2057,10 +1981,9 @@
         <w:rPr>
           <w:rFonts w:ascii="Times New Roman" w:hAnsi="Times New Roman"/>
           <w:b w:val="0"/>
-          <w:i w:val="0"/>
           <w:sz w:val="24"/>
         </w:rPr>
-        <w:t>CardioPredict is built on a straightforward Model-View-Controller (MVC) pattern, running inside a client-server architecture. Here is how the pieces fit together:</w:t>
+        <w:t>CardioPredict uses a Model-View-Controller pattern:</w:t>
       </w:r>
     </w:p>
     <w:p>
@@ -2072,7 +1995,7 @@
           <w:rFonts w:ascii="Times New Roman" w:hAnsi="Times New Roman"/>
           <w:sz w:val="24"/>
         </w:rPr>
-        <w:t>The client is any modern web browser. It renders the HTML/CSS/JS interface, handles basic input validation using HTML5 form constraints, and stores user preferences (like dark mode and font size) in localStorage.</w:t>
+        <w:t>Client (Browser): renders the interface, handles basic input validation, stores user preferences.</w:t>
       </w:r>
     </w:p>
     <w:p>
@@ -2084,7 +2007,7 @@
           <w:rFonts w:ascii="Times New Roman" w:hAnsi="Times New Roman"/>
           <w:sz w:val="24"/>
         </w:rPr>
-        <w:t>The controller layer consists of Flask route handlers. Each route receives an HTTP request, extracts the input data, validates it (checking types, ranges, and required fields), calls the ML model, writes the result to the database, and returns a rendered HTML page.</w:t>
+        <w:t>Controller (Flask routes): receives requests, validates data, calls the model, writes to the database.</w:t>
       </w:r>
     </w:p>
     <w:p>
@@ -2096,7 +2019,7 @@
           <w:rFonts w:ascii="Times New Roman" w:hAnsi="Times New Roman"/>
           <w:sz w:val="24"/>
         </w:rPr>
-        <w:t>The model layer has two parts: the pre-trained Random Forest classifier (loaded from a .pkl file at startup) that performs inference, and the SQLite database that stores prediction records.</w:t>
+        <w:t>Model layer: pre-trained Random Forest for inference; SQLite for data persistence.</w:t>
       </w:r>
     </w:p>
     <w:p>
@@ -2108,7 +2031,7 @@
           <w:rFonts w:ascii="Times New Roman" w:hAnsi="Times New Roman"/>
           <w:sz w:val="24"/>
         </w:rPr>
-        <w:t>The view layer consists of seven Jinja2 HTML templates that share a common base layout through template inheritance, ensuring visual consistency across all pages.</w:t>
+        <w:t>View layer: seven Jinja2 templates sharing a common base layout.</w:t>
       </w:r>
     </w:p>
     <w:p>
@@ -2133,10 +2056,9 @@
         <w:rPr>
           <w:rFonts w:ascii="Times New Roman" w:hAnsi="Times New Roman"/>
           <w:b w:val="0"/>
-          <w:i w:val="0"/>
           <w:sz w:val="24"/>
         </w:rPr>
-        <w:t>When a clinician submits a prediction, the data flows through the system as follows: the browser validates the 13 input fields → the form data is POSTed to the /predict route → Flask extracts each field, converts it to the correct numeric type, and checks that every value falls within its expected range → a NumPy array is constructed from the validated inputs → the StandardScaler normalises the array → the Random Forest calls predict_proba() to get the disease probability → the result is saved to SQLite along with a timestamp and the original inputs → the result page is rendered with a colour-coded risk indicator (green for low, amber for moderate, red for high) and an animated probability bar.</w:t>
+        <w:t>User fills 13 fields → browser validates → POST to /predict → Flask validates server-side → NumPy array built → StandardScaler transforms → Random Forest predicts → result saved to SQLite → colour-coded result page rendered.</w:t>
       </w:r>
     </w:p>
     <w:p>
@@ -2153,18 +2075,14 @@
     </w:p>
     <w:p>
       <w:pPr>
-        <w:spacing w:after="120"/>
-        <w:ind w:firstLine="0"/>
-        <w:jc w:val="both"/>
+        <w:pStyle w:val="ListNumber"/>
       </w:pPr>
       <w:r>
         <w:rPr>
           <w:rFonts w:ascii="Times New Roman" w:hAnsi="Times New Roman"/>
-          <w:b w:val="0"/>
-          <w:i w:val="0"/>
           <w:sz w:val="24"/>
         </w:rPr>
-        <w:t>By the end of this project, the following deliverables are expected:</w:t>
+        <w:t>A trained model achieving at least 80% accuracy on the test set.</w:t>
       </w:r>
     </w:p>
     <w:p>
@@ -2176,7 +2094,7 @@
           <w:rFonts w:ascii="Times New Roman" w:hAnsi="Times New Roman"/>
           <w:sz w:val="24"/>
         </w:rPr>
-        <w:t>A trained Random Forest classifier that achieves at least 80% accuracy on the held-out test set.</w:t>
+        <w:t>A fully functional, responsive web application.</w:t>
       </w:r>
     </w:p>
     <w:p>
@@ -2188,7 +2106,7 @@
           <w:rFonts w:ascii="Times New Roman" w:hAnsi="Times New Roman"/>
           <w:sz w:val="24"/>
         </w:rPr>
-        <w:t>A fully functional, responsive web application that works on any modern browser — desktop or mobile.</w:t>
+        <w:t>Colour-coded risk visualisation (green/amber/red) for clinical interpretation.</w:t>
       </w:r>
     </w:p>
     <w:p>
@@ -2200,7 +2118,7 @@
           <w:rFonts w:ascii="Times New Roman" w:hAnsi="Times New Roman"/>
           <w:sz w:val="24"/>
         </w:rPr>
-        <w:t>A colour-coded risk visualisation system (green/amber/red) that enables immediate clinical interpretation.</w:t>
+        <w:t>Prediction history with CRUD operations.</w:t>
       </w:r>
     </w:p>
     <w:p>
@@ -2212,7 +2130,7 @@
           <w:rFonts w:ascii="Times New Roman" w:hAnsi="Times New Roman"/>
           <w:sz w:val="24"/>
         </w:rPr>
-        <w:t>A prediction history module with the ability to view, track, and delete past predictions.</w:t>
+        <w:t>A REST API endpoint for external integration.</w:t>
       </w:r>
     </w:p>
     <w:p>
@@ -2224,7 +2142,7 @@
           <w:rFonts w:ascii="Times New Roman" w:hAnsi="Times New Roman"/>
           <w:sz w:val="24"/>
         </w:rPr>
-        <w:t>A REST API endpoint that external systems can call to get predictions in JSON format.</w:t>
+        <w:t>Docker container for one-command deployment.</w:t>
       </w:r>
     </w:p>
     <w:p>
@@ -2236,19 +2154,7 @@
           <w:rFonts w:ascii="Times New Roman" w:hAnsi="Times New Roman"/>
           <w:sz w:val="24"/>
         </w:rPr>
-        <w:t>A Docker container image that packages the entire application for one-command deployment.</w:t>
-      </w:r>
-    </w:p>
-    <w:p>
-      <w:pPr>
-        <w:pStyle w:val="ListNumber"/>
-      </w:pPr>
-      <w:r>
-        <w:rPr>
-          <w:rFonts w:ascii="Times New Roman" w:hAnsi="Times New Roman"/>
-          <w:sz w:val="24"/>
-        </w:rPr>
-        <w:t>An automated test suite with at least 25 passing test cases covering all critical paths.</w:t>
+        <w:t>An automated test suite with 28+ passing test cases.</w:t>
       </w:r>
     </w:p>
     <w:p>
@@ -2261,22 +2167,6 @@
           <w:color w:val="000000"/>
         </w:rPr>
         <w:t>9. Project Timeline</w:t>
-      </w:r>
-    </w:p>
-    <w:p>
-      <w:pPr>
-        <w:spacing w:after="120"/>
-        <w:ind w:firstLine="0"/>
-        <w:jc w:val="both"/>
-      </w:pPr>
-      <w:r>
-        <w:rPr>
-          <w:rFonts w:ascii="Times New Roman" w:hAnsi="Times New Roman"/>
-          <w:b w:val="0"/>
-          <w:i w:val="0"/>
-          <w:sz w:val="24"/>
-        </w:rPr>
-        <w:t>The project is planned across seven phases over approximately 16 weeks:</w:t>
       </w:r>
     </w:p>
     <w:tbl>
@@ -2336,7 +2226,7 @@
                 <w:b/>
                 <w:sz w:val="22"/>
               </w:rPr>
-              <w:t>Key Activities</w:t>
+              <w:t>Activities</w:t>
             </w:r>
           </w:p>
         </w:tc>
@@ -2352,7 +2242,7 @@
                 <w:rFonts w:ascii="Times New Roman" w:hAnsi="Times New Roman"/>
                 <w:sz w:val="22"/>
               </w:rPr>
-              <w:t>Research &amp; planning</w:t>
+              <w:t>Research</w:t>
             </w:r>
           </w:p>
         </w:tc>
@@ -2380,7 +2270,7 @@
                 <w:rFonts w:ascii="Times New Roman" w:hAnsi="Times New Roman"/>
                 <w:sz w:val="22"/>
               </w:rPr>
-              <w:t>Literature survey, dataset selection, finalise tech stack</w:t>
+              <w:t>Literature survey, dataset selection, tech stack</w:t>
             </w:r>
           </w:p>
         </w:tc>
@@ -2424,7 +2314,7 @@
                 <w:rFonts w:ascii="Times New Roman" w:hAnsi="Times New Roman"/>
                 <w:sz w:val="22"/>
               </w:rPr>
-              <w:t>EDA, cleaning, preprocessing, feature engineering</w:t>
+              <w:t>EDA, cleaning, preprocessing</w:t>
             </w:r>
           </w:p>
         </w:tc>
@@ -2468,7 +2358,7 @@
                 <w:rFonts w:ascii="Times New Roman" w:hAnsi="Times New Roman"/>
                 <w:sz w:val="22"/>
               </w:rPr>
-              <w:t>Train all 7 algorithms, cross-validate, select winner</w:t>
+              <w:t>Train 7 algorithms, cross-validate, select winner</w:t>
             </w:r>
           </w:p>
         </w:tc>
@@ -2512,7 +2402,7 @@
                 <w:rFonts w:ascii="Times New Roman" w:hAnsi="Times New Roman"/>
                 <w:sz w:val="22"/>
               </w:rPr>
-              <w:t>Build Flask backend, design frontend, integrate database</w:t>
+              <w:t>Flask backend, frontend, database integration</w:t>
             </w:r>
           </w:p>
         </w:tc>
@@ -2556,7 +2446,7 @@
                 <w:rFonts w:ascii="Times New Roman" w:hAnsi="Times New Roman"/>
                 <w:sz w:val="22"/>
               </w:rPr>
-              <w:t>Write unit/integration tests, fix bugs, validate edge cases</w:t>
+              <w:t>Unit and integration tests, bug fixes</w:t>
             </w:r>
           </w:p>
         </w:tc>
@@ -2600,7 +2490,7 @@
                 <w:rFonts w:ascii="Times New Roman" w:hAnsi="Times New Roman"/>
                 <w:sz w:val="22"/>
               </w:rPr>
-              <w:t>Dockerise, configure Gunicorn, document deployment steps</w:t>
+              <w:t>Docker, Gunicorn, documentation</w:t>
             </w:r>
           </w:p>
         </w:tc>
@@ -2644,7 +2534,7 @@
                 <w:rFonts w:ascii="Times New Roman" w:hAnsi="Times New Roman"/>
                 <w:sz w:val="22"/>
               </w:rPr>
-              <w:t>Write synopsis, project report, and prepare presentation</w:t>
+              <w:t>Synopsis, report, presentation</w:t>
             </w:r>
           </w:p>
         </w:tc>
@@ -2672,7 +2562,7 @@
           <w:rFonts w:ascii="Times New Roman" w:hAnsi="Times New Roman"/>
           <w:sz w:val="24"/>
         </w:rPr>
-        <w:t>Janosi, A., Steinbrunn, W., Pfisterer, M., &amp; Detrano, R. (1988). Heart Disease Data Set. UCI Machine Learning Repository. https://archive.ics.uci.edu/ml/datasets/heart+disease</w:t>
+        <w:t>Janosi, A., et al. (1988). Heart Disease Data Set. UCI Machine Learning Repository.</w:t>
       </w:r>
     </w:p>
     <w:p>
@@ -2684,7 +2574,7 @@
           <w:rFonts w:ascii="Times New Roman" w:hAnsi="Times New Roman"/>
           <w:sz w:val="24"/>
         </w:rPr>
-        <w:t>Pedregosa, F., Varoquaux, G., Gramfort, A., Michel, V., Thirion, B., Grisel, O., ... &amp; Duchesnay, É. (2011). Scikit-learn: Machine Learning in Python. Journal of Machine Learning Research, 12, 2825–2830.</w:t>
+        <w:t>Pedregosa, F., et al. (2011). Scikit-learn: Machine Learning in Python. JMLR, 12, 2825–2830.</w:t>
       </w:r>
     </w:p>
     <w:p>
@@ -2708,7 +2598,7 @@
           <w:rFonts w:ascii="Times New Roman" w:hAnsi="Times New Roman"/>
           <w:sz w:val="24"/>
         </w:rPr>
-        <w:t>Grinberg, M. (2018). Flask Web Development: Developing Web Applications with Python (2nd ed.). O'Reilly Media.</w:t>
+        <w:t>Grinberg, M. (2018). Flask Web Development (2nd ed.). O'Reilly Media.</w:t>
       </w:r>
     </w:p>
     <w:p>
@@ -2720,7 +2610,7 @@
           <w:rFonts w:ascii="Times New Roman" w:hAnsi="Times New Roman"/>
           <w:sz w:val="24"/>
         </w:rPr>
-        <w:t>World Health Organization. (2025). Cardiovascular Diseases (CVDs) — Key Facts. https://www.who.int/news-room/fact-sheets/detail/cardiovascular-diseases</w:t>
+        <w:t>WHO (2025). Cardiovascular Diseases — Key Facts.</w:t>
       </w:r>
     </w:p>
     <w:p>
@@ -2732,7 +2622,7 @@
           <w:rFonts w:ascii="Times New Roman" w:hAnsi="Times New Roman"/>
           <w:sz w:val="24"/>
         </w:rPr>
-        <w:t>Friedman, J., Hastie, T., &amp; Tibshirani, R. (2001). The Elements of Statistical Learning: Data Mining, Inference, and Prediction. Springer.</w:t>
+        <w:t>Friedman, J., Hastie, T., &amp; Tibshirani, R. (2001). The Elements of Statistical Learning. Springer.</w:t>
       </w:r>
     </w:p>
     <w:p>
@@ -2744,7 +2634,7 @@
           <w:rFonts w:ascii="Times New Roman" w:hAnsi="Times New Roman"/>
           <w:sz w:val="24"/>
         </w:rPr>
-        <w:t>McKinney, W. (2012). Python for Data Analysis: Data Wrangling with Pandas, NumPy, and IPython. O'Reilly Media.</w:t>
+        <w:t>McKinney, W. (2012). Python for Data Analysis. O'Reilly Media.</w:t>
       </w:r>
     </w:p>
     <w:sectPr>

</xml_diff>

<commit_message>
Synopsis: exact university formatting - TNR 12/14/16pt, 1.5 spacing, 1-inch margins, single title page
</commit_message>
<xml_diff>
--- a/CardioPredict_Synopsis.docx
+++ b/CardioPredict_Synopsis.docx
@@ -4,7 +4,33 @@
   <w:body>
     <w:p>
       <w:pPr>
-        <w:spacing w:before="720" w:after="80"/>
+        <w:spacing w:line="360" w:lineRule="auto" w:before="0" w:after="0"/>
+        <w:jc w:val="center"/>
+      </w:pPr>
+      <w:r>
+        <w:rPr>
+          <w:rFonts w:ascii="Times New Roman" w:hAnsi="Times New Roman"/>
+          <w:b w:val="0"/>
+          <w:sz w:val="24"/>
+        </w:rPr>
+      </w:r>
+    </w:p>
+    <w:p>
+      <w:pPr>
+        <w:spacing w:line="360" w:lineRule="auto" w:before="0" w:after="0"/>
+        <w:jc w:val="center"/>
+      </w:pPr>
+      <w:r>
+        <w:rPr>
+          <w:rFonts w:ascii="Times New Roman" w:hAnsi="Times New Roman"/>
+          <w:b w:val="0"/>
+          <w:sz w:val="24"/>
+        </w:rPr>
+      </w:r>
+    </w:p>
+    <w:p>
+      <w:pPr>
+        <w:spacing w:line="360" w:lineRule="auto" w:before="480" w:after="120"/>
         <w:jc w:val="center"/>
       </w:pPr>
       <w:r>
@@ -18,97 +44,140 @@
     </w:p>
     <w:p>
       <w:pPr>
-        <w:spacing w:before="0" w:after="480"/>
+        <w:spacing w:line="360" w:lineRule="auto" w:before="0" w:after="600"/>
         <w:jc w:val="center"/>
       </w:pPr>
       <w:r>
         <w:rPr>
           <w:rFonts w:ascii="Times New Roman" w:hAnsi="Times New Roman"/>
           <w:b/>
-          <w:sz w:val="26"/>
+          <w:sz w:val="28"/>
         </w:rPr>
         <w:t>Department of Computer Applications</w:t>
       </w:r>
     </w:p>
     <w:p>
       <w:pPr>
-        <w:spacing w:before="240" w:after="360"/>
+        <w:spacing w:line="360" w:lineRule="auto" w:before="240" w:after="480"/>
         <w:jc w:val="center"/>
       </w:pPr>
       <w:r>
         <w:rPr>
           <w:rFonts w:ascii="Times New Roman" w:hAnsi="Times New Roman"/>
           <w:b/>
-          <w:sz w:val="24"/>
+          <w:sz w:val="28"/>
         </w:rPr>
         <w:t>PROJECT SYNOPSIS</w:t>
       </w:r>
     </w:p>
     <w:p>
       <w:pPr>
-        <w:spacing w:before="160" w:after="0"/>
+        <w:spacing w:line="360" w:lineRule="auto" w:before="120" w:after="0"/>
         <w:jc w:val="center"/>
       </w:pPr>
       <w:r>
         <w:rPr>
           <w:rFonts w:ascii="Times New Roman" w:hAnsi="Times New Roman"/>
           <w:b/>
-          <w:sz w:val="36"/>
+          <w:sz w:val="32"/>
         </w:rPr>
-        <w:t>CardioPredict:</w:t>
+        <w:t>CARDIOPREDICT:</w:t>
       </w:r>
     </w:p>
     <w:p>
       <w:pPr>
-        <w:spacing w:before="0" w:after="120"/>
+        <w:spacing w:line="360" w:lineRule="auto" w:before="0" w:after="0"/>
         <w:jc w:val="center"/>
       </w:pPr>
       <w:r>
         <w:rPr>
           <w:rFonts w:ascii="Times New Roman" w:hAnsi="Times New Roman"/>
           <w:b/>
-          <w:sz w:val="30"/>
+          <w:sz w:val="32"/>
         </w:rPr>
-        <w:t>Heart Disease Prediction System Using Machine Learning</w:t>
+        <w:t>HEART DISEASE PREDICTION SYSTEM</w:t>
       </w:r>
     </w:p>
     <w:p>
       <w:pPr>
-        <w:spacing w:before="40" w:after="360"/>
+        <w:spacing w:line="360" w:lineRule="auto" w:before="0" w:after="160"/>
+        <w:jc w:val="center"/>
+      </w:pPr>
+      <w:r>
+        <w:rPr>
+          <w:rFonts w:ascii="Times New Roman" w:hAnsi="Times New Roman"/>
+          <w:b/>
+          <w:sz w:val="32"/>
+        </w:rPr>
+        <w:t>USING MACHINE LEARNING</w:t>
+      </w:r>
+    </w:p>
+    <w:p>
+      <w:pPr>
+        <w:spacing w:line="360" w:lineRule="auto" w:before="120" w:after="0"/>
         <w:jc w:val="center"/>
       </w:pPr>
       <w:r>
         <w:rPr>
           <w:rFonts w:ascii="Times New Roman" w:hAnsi="Times New Roman"/>
           <w:b w:val="0"/>
-          <w:sz w:val="22"/>
+          <w:sz w:val="24"/>
         </w:rPr>
-        <w:t>A Flask-Based Clinical Screening Web Application with Random Forest Classification</w:t>
+        <w:t>A Flask-Based Clinical Screening Web Application</w:t>
       </w:r>
     </w:p>
     <w:p>
       <w:pPr>
-        <w:spacing w:before="160" w:after="80"/>
+        <w:spacing w:line="360" w:lineRule="auto" w:before="0" w:after="480"/>
         <w:jc w:val="center"/>
       </w:pPr>
       <w:r>
         <w:rPr>
           <w:rFonts w:ascii="Times New Roman" w:hAnsi="Times New Roman"/>
-          <w:sz w:val="22"/>
+          <w:b w:val="0"/>
+          <w:sz w:val="24"/>
         </w:rPr>
-        <w:t>Submitted in Partial Fulfilment of the Requirements for the Award of the Degree of</w:t>
+        <w:t>with Random Forest Classification</w:t>
       </w:r>
     </w:p>
     <w:p>
       <w:pPr>
-        <w:spacing w:before="40" w:after="320"/>
+        <w:spacing w:line="360" w:lineRule="auto" w:before="120" w:after="0"/>
+        <w:jc w:val="center"/>
+      </w:pPr>
+      <w:r>
+        <w:rPr>
+          <w:rFonts w:ascii="Times New Roman" w:hAnsi="Times New Roman"/>
+          <w:b w:val="0"/>
+          <w:sz w:val="24"/>
+        </w:rPr>
+        <w:t>Submitted in Partial Fulfilment of the Requirements</w:t>
+      </w:r>
+    </w:p>
+    <w:p>
+      <w:pPr>
+        <w:spacing w:line="360" w:lineRule="auto" w:before="0" w:after="80"/>
+        <w:jc w:val="center"/>
+      </w:pPr>
+      <w:r>
+        <w:rPr>
+          <w:rFonts w:ascii="Times New Roman" w:hAnsi="Times New Roman"/>
+          <w:b w:val="0"/>
+          <w:sz w:val="24"/>
+        </w:rPr>
+        <w:t>for the Award of the Degree of</w:t>
+      </w:r>
+    </w:p>
+    <w:p>
+      <w:pPr>
+        <w:spacing w:line="360" w:lineRule="auto" w:before="80" w:after="480"/>
         <w:jc w:val="center"/>
       </w:pPr>
       <w:r>
         <w:rPr>
           <w:rFonts w:ascii="Times New Roman" w:hAnsi="Times New Roman"/>
           <w:b/>
-          <w:sz w:val="26"/>
+          <w:sz w:val="28"/>
         </w:rPr>
         <w:t>Master of Computer Applications (MCA)</w:t>
       </w:r>
@@ -120,53 +189,63 @@
         <w:tblLook w:firstColumn="1" w:firstRow="1" w:lastColumn="0" w:lastRow="0" w:noHBand="0" w:noVBand="1" w:val="04A0"/>
       </w:tblPr>
       <w:tblGrid>
-        <w:gridCol w:w="4498"/>
-        <w:gridCol w:w="4498"/>
+        <w:gridCol w:w="4680"/>
+        <w:gridCol w:w="4680"/>
       </w:tblGrid>
       <w:tr>
         <w:tc>
           <w:tcPr>
-            <w:tcW w:type="dxa" w:w="4498"/>
+            <w:tcW w:type="dxa" w:w="4680"/>
             <w:tcBorders>
-              <w:top w:val="none" w:sz="0"/>
-              <w:left w:val="none" w:sz="0"/>
-              <w:bottom w:val="none" w:sz="0"/>
-              <w:right w:val="none" w:sz="0"/>
+              <w:top w:val="none" w:sz="0" w:space="0" w:color="auto"/>
+              <w:left w:val="none" w:sz="0" w:space="0" w:color="auto"/>
+              <w:bottom w:val="none" w:sz="0" w:space="0" w:color="auto"/>
+              <w:right w:val="none" w:sz="0" w:space="0" w:color="auto"/>
+              <w:insideH w:val="none" w:sz="0" w:space="0" w:color="auto"/>
+              <w:insideV w:val="none" w:sz="0" w:space="0" w:color="auto"/>
             </w:tcBorders>
           </w:tcPr>
           <w:p>
             <w:pPr>
+              <w:spacing w:line="360" w:lineRule="auto"/>
               <w:jc w:val="center"/>
             </w:pPr>
+            <w:r/>
             <w:r>
               <w:rPr>
                 <w:rFonts w:ascii="Times New Roman" w:hAnsi="Times New Roman"/>
-                <w:sz w:val="20"/>
+                <w:b w:val="0"/>
+                <w:sz w:val="22"/>
               </w:rPr>
-              <w:t>Submitted By</w:t>
+              <w:t>Submitted By:</w:t>
             </w:r>
           </w:p>
         </w:tc>
         <w:tc>
           <w:tcPr>
-            <w:tcW w:type="dxa" w:w="4498"/>
+            <w:tcW w:type="dxa" w:w="4680"/>
             <w:tcBorders>
-              <w:top w:val="none" w:sz="0"/>
-              <w:left w:val="none" w:sz="0"/>
-              <w:bottom w:val="none" w:sz="0"/>
-              <w:right w:val="none" w:sz="0"/>
+              <w:top w:val="none" w:sz="0" w:space="0" w:color="auto"/>
+              <w:left w:val="none" w:sz="0" w:space="0" w:color="auto"/>
+              <w:bottom w:val="none" w:sz="0" w:space="0" w:color="auto"/>
+              <w:right w:val="none" w:sz="0" w:space="0" w:color="auto"/>
+              <w:insideH w:val="none" w:sz="0" w:space="0" w:color="auto"/>
+              <w:insideV w:val="none" w:sz="0" w:space="0" w:color="auto"/>
             </w:tcBorders>
           </w:tcPr>
           <w:p>
             <w:pPr>
+              <w:spacing w:line="360" w:lineRule="auto"/>
               <w:jc w:val="center"/>
             </w:pPr>
+            <w:r/>
             <w:r>
               <w:rPr>
                 <w:rFonts w:ascii="Times New Roman" w:hAnsi="Times New Roman"/>
-                <w:sz w:val="20"/>
+                <w:b w:val="0"/>
+                <w:sz w:val="22"/>
               </w:rPr>
-              <w:t>Under the Guidance of</w:t>
+              <w:t>Under the Guidance of:</w:t>
             </w:r>
           </w:p>
         </w:tc>
@@ -174,23 +253,27 @@
       <w:tr>
         <w:tc>
           <w:tcPr>
-            <w:tcW w:type="dxa" w:w="4498"/>
+            <w:tcW w:type="dxa" w:w="4680"/>
             <w:tcBorders>
-              <w:top w:val="none" w:sz="0"/>
-              <w:left w:val="none" w:sz="0"/>
-              <w:bottom w:val="none" w:sz="0"/>
-              <w:right w:val="none" w:sz="0"/>
+              <w:top w:val="none" w:sz="0" w:space="0" w:color="auto"/>
+              <w:left w:val="none" w:sz="0" w:space="0" w:color="auto"/>
+              <w:bottom w:val="none" w:sz="0" w:space="0" w:color="auto"/>
+              <w:right w:val="none" w:sz="0" w:space="0" w:color="auto"/>
+              <w:insideH w:val="none" w:sz="0" w:space="0" w:color="auto"/>
+              <w:insideV w:val="none" w:sz="0" w:space="0" w:color="auto"/>
             </w:tcBorders>
           </w:tcPr>
           <w:p>
             <w:pPr>
+              <w:spacing w:line="360" w:lineRule="auto"/>
               <w:jc w:val="center"/>
             </w:pPr>
+            <w:r/>
             <w:r>
               <w:rPr>
                 <w:rFonts w:ascii="Times New Roman" w:hAnsi="Times New Roman"/>
                 <w:b/>
-                <w:sz w:val="26"/>
+                <w:sz w:val="28"/>
               </w:rPr>
               <w:t>Sandeep Kumar</w:t>
             </w:r>
@@ -198,23 +281,27 @@
         </w:tc>
         <w:tc>
           <w:tcPr>
-            <w:tcW w:type="dxa" w:w="4498"/>
+            <w:tcW w:type="dxa" w:w="4680"/>
             <w:tcBorders>
-              <w:top w:val="none" w:sz="0"/>
-              <w:left w:val="none" w:sz="0"/>
-              <w:bottom w:val="none" w:sz="0"/>
-              <w:right w:val="none" w:sz="0"/>
+              <w:top w:val="none" w:sz="0" w:space="0" w:color="auto"/>
+              <w:left w:val="none" w:sz="0" w:space="0" w:color="auto"/>
+              <w:bottom w:val="none" w:sz="0" w:space="0" w:color="auto"/>
+              <w:right w:val="none" w:sz="0" w:space="0" w:color="auto"/>
+              <w:insideH w:val="none" w:sz="0" w:space="0" w:color="auto"/>
+              <w:insideV w:val="none" w:sz="0" w:space="0" w:color="auto"/>
             </w:tcBorders>
           </w:tcPr>
           <w:p>
             <w:pPr>
+              <w:spacing w:line="360" w:lineRule="auto"/>
               <w:jc w:val="center"/>
             </w:pPr>
+            <w:r/>
             <w:r>
               <w:rPr>
                 <w:rFonts w:ascii="Times New Roman" w:hAnsi="Times New Roman"/>
                 <w:b/>
-                <w:sz w:val="26"/>
+                <w:sz w:val="28"/>
               </w:rPr>
               <w:t>Amit Kharb</w:t>
             </w:r>
@@ -224,22 +311,27 @@
       <w:tr>
         <w:tc>
           <w:tcPr>
-            <w:tcW w:type="dxa" w:w="4498"/>
+            <w:tcW w:type="dxa" w:w="4680"/>
             <w:tcBorders>
-              <w:top w:val="none" w:sz="0"/>
-              <w:left w:val="none" w:sz="0"/>
-              <w:bottom w:val="none" w:sz="0"/>
-              <w:right w:val="none" w:sz="0"/>
+              <w:top w:val="none" w:sz="0" w:space="0" w:color="auto"/>
+              <w:left w:val="none" w:sz="0" w:space="0" w:color="auto"/>
+              <w:bottom w:val="none" w:sz="0" w:space="0" w:color="auto"/>
+              <w:right w:val="none" w:sz="0" w:space="0" w:color="auto"/>
+              <w:insideH w:val="none" w:sz="0" w:space="0" w:color="auto"/>
+              <w:insideV w:val="none" w:sz="0" w:space="0" w:color="auto"/>
             </w:tcBorders>
           </w:tcPr>
           <w:p>
             <w:pPr>
+              <w:spacing w:line="360" w:lineRule="auto"/>
               <w:jc w:val="center"/>
             </w:pPr>
+            <w:r/>
             <w:r>
               <w:rPr>
                 <w:rFonts w:ascii="Times New Roman" w:hAnsi="Times New Roman"/>
-                <w:sz w:val="20"/>
+                <w:b w:val="0"/>
+                <w:sz w:val="22"/>
               </w:rPr>
               <w:t>MCA Student</w:t>
             </w:r>
@@ -247,22 +339,27 @@
         </w:tc>
         <w:tc>
           <w:tcPr>
-            <w:tcW w:type="dxa" w:w="4498"/>
+            <w:tcW w:type="dxa" w:w="4680"/>
             <w:tcBorders>
-              <w:top w:val="none" w:sz="0"/>
-              <w:left w:val="none" w:sz="0"/>
-              <w:bottom w:val="none" w:sz="0"/>
-              <w:right w:val="none" w:sz="0"/>
+              <w:top w:val="none" w:sz="0" w:space="0" w:color="auto"/>
+              <w:left w:val="none" w:sz="0" w:space="0" w:color="auto"/>
+              <w:bottom w:val="none" w:sz="0" w:space="0" w:color="auto"/>
+              <w:right w:val="none" w:sz="0" w:space="0" w:color="auto"/>
+              <w:insideH w:val="none" w:sz="0" w:space="0" w:color="auto"/>
+              <w:insideV w:val="none" w:sz="0" w:space="0" w:color="auto"/>
             </w:tcBorders>
           </w:tcPr>
           <w:p>
             <w:pPr>
+              <w:spacing w:line="360" w:lineRule="auto"/>
               <w:jc w:val="center"/>
             </w:pPr>
+            <w:r/>
             <w:r>
               <w:rPr>
                 <w:rFonts w:ascii="Times New Roman" w:hAnsi="Times New Roman"/>
-                <w:sz w:val="20"/>
+                <w:b w:val="0"/>
+                <w:sz w:val="22"/>
               </w:rPr>
               <w:t>Project Guide</w:t>
             </w:r>
@@ -272,13 +369,39 @@
     </w:tbl>
     <w:p>
       <w:pPr>
-        <w:spacing w:before="360" w:after="0"/>
+        <w:spacing w:line="360" w:lineRule="auto" w:before="0" w:after="0"/>
         <w:jc w:val="center"/>
       </w:pPr>
       <w:r>
         <w:rPr>
           <w:rFonts w:ascii="Times New Roman" w:hAnsi="Times New Roman"/>
           <w:b w:val="0"/>
+          <w:sz w:val="24"/>
+        </w:rPr>
+      </w:r>
+    </w:p>
+    <w:p>
+      <w:pPr>
+        <w:spacing w:line="360" w:lineRule="auto" w:before="0" w:after="0"/>
+        <w:jc w:val="center"/>
+      </w:pPr>
+      <w:r>
+        <w:rPr>
+          <w:rFonts w:ascii="Times New Roman" w:hAnsi="Times New Roman"/>
+          <w:b w:val="0"/>
+          <w:sz w:val="24"/>
+        </w:rPr>
+      </w:r>
+    </w:p>
+    <w:p>
+      <w:pPr>
+        <w:spacing w:line="360" w:lineRule="auto" w:before="240" w:after="0"/>
+        <w:jc w:val="center"/>
+      </w:pPr>
+      <w:r>
+        <w:rPr>
+          <w:rFonts w:ascii="Times New Roman" w:hAnsi="Times New Roman"/>
+          <w:b/>
           <w:sz w:val="24"/>
         </w:rPr>
         <w:t>Academic Year 2025–2026</w:t>
@@ -291,98 +414,99 @@
     </w:p>
     <w:p>
       <w:pPr>
-        <w:pStyle w:val="Heading1"/>
+        <w:spacing w:line="360" w:lineRule="auto" w:before="360" w:after="120"/>
+        <w:jc w:val="left"/>
       </w:pPr>
       <w:r>
         <w:rPr>
           <w:rFonts w:ascii="Times New Roman" w:hAnsi="Times New Roman"/>
+          <w:b/>
           <w:color w:val="000000"/>
+          <w:sz w:val="28"/>
         </w:rPr>
         <w:t>1. Introduction</w:t>
       </w:r>
     </w:p>
     <w:p>
       <w:pPr>
-        <w:spacing w:after="120"/>
+        <w:spacing w:line="360" w:lineRule="auto" w:before="0" w:after="120"/>
         <w:ind w:firstLine="720"/>
         <w:jc w:val="both"/>
       </w:pPr>
       <w:r>
         <w:rPr>
           <w:rFonts w:ascii="Times New Roman" w:hAnsi="Times New Roman"/>
-          <w:b w:val="0"/>
           <w:sz w:val="24"/>
         </w:rPr>
-        <w:t>Heart disease remains one of the most pressing health challenges of our time. According to the World Health Organisation, cardiovascular diseases claim roughly 17.9 million lives every year, making them the single largest cause of death worldwide. India is particularly affected — nearly one in four deaths in the country is attributed to some form of cardiovascular condition, and the numbers have been climbing steadily over the past two decades.</w:t>
+        <w:t>Heart disease remains one of the most pressing health challenges of our time. According to the World Health Organisation, cardiovascular diseases (CVDs) claim roughly 17.9 million lives every year, making them the single largest cause of death worldwide. India is particularly affected — nearly one in four deaths in the country is attributed to some form of cardiovascular condition, and the numbers have been climbing steadily over the past two decades.</w:t>
       </w:r>
     </w:p>
     <w:p>
       <w:pPr>
-        <w:spacing w:after="120"/>
+        <w:spacing w:line="360" w:lineRule="auto" w:before="0" w:after="120"/>
         <w:ind w:firstLine="720"/>
         <w:jc w:val="both"/>
       </w:pPr>
       <w:r>
         <w:rPr>
           <w:rFonts w:ascii="Times New Roman" w:hAnsi="Times New Roman"/>
-          <w:b w:val="0"/>
           <w:sz w:val="24"/>
         </w:rPr>
-        <w:t>What makes this problem especially difficult is the gap between where the patients are and where the diagnostics are. Traditional cardiac screening relies on tests like electrocardiograms, echocardiography, and coronary angiography — all of which require expensive equipment and trained specialists. In rural India, where roughly 70% of the population lives, these facilities are simply not available.</w:t>
+        <w:t>What makes this problem especially difficult is the gap between where the patients are and where the diagnostics are. Traditional cardiac screening relies on tests like electrocardiograms, echocardiography, and coronary angiography — all of which require expensive equipment and trained specialists. In rural India, where roughly 70% of the population lives, these facilities are simply not available. Patients often have to travel hours to reach a hospital that can run basic cardiac diagnostics, and by that point, critical time may have been lost.</w:t>
       </w:r>
     </w:p>
     <w:p>
       <w:pPr>
-        <w:spacing w:after="120"/>
+        <w:spacing w:line="360" w:lineRule="auto" w:before="0" w:after="120"/>
         <w:ind w:firstLine="720"/>
         <w:jc w:val="both"/>
       </w:pPr>
       <w:r>
         <w:rPr>
           <w:rFonts w:ascii="Times New Roman" w:hAnsi="Times New Roman"/>
-          <w:b w:val="0"/>
           <w:sz w:val="24"/>
         </w:rPr>
-        <w:t>Over the past decade, machine learning has shown real promise in bridging this gap. Researchers have demonstrated that trained classifiers can estimate heart disease risk using nothing more than a handful of routine clinical measurements — age, blood pressure, cholesterol, heart rate, and a few other numbers that any primary care physician can collect during a standard check-up.</w:t>
+        <w:t>Over the past decade, machine learning has shown real promise in bridging this gap. Researchers have demonstrated that trained classifiers can estimate heart disease risk using nothing more than a handful of routine clinical measurements — age, blood pressure, cholesterol levels, heart rate, and a few other numbers that any primary care physician can collect during a standard check-up. The accuracy of these models, when built carefully, rivals that of many conventional screening methods.</w:t>
       </w:r>
     </w:p>
     <w:p>
       <w:pPr>
-        <w:spacing w:after="120"/>
+        <w:spacing w:line="360" w:lineRule="auto" w:before="0" w:after="120"/>
         <w:ind w:firstLine="720"/>
         <w:jc w:val="both"/>
       </w:pPr>
       <w:r>
         <w:rPr>
           <w:rFonts w:ascii="Times New Roman" w:hAnsi="Times New Roman"/>
-          <w:b w:val="0"/>
           <w:sz w:val="24"/>
         </w:rPr>
-        <w:t>CardioPredict is an attempt to take this idea from research papers into practice. It is a web application — built with Flask, Python, and a trained Random Forest model — that accepts 13 clinical parameters through a simple form and returns an instant heart disease probability estimate.</w:t>
+        <w:t>CardioPredict is an attempt to take this idea from research papers into practice. It is a web application — built with Flask, Python, and a trained Random Forest model — that accepts 13 clinical parameters through a simple form and returns an instant heart disease probability estimate. The goal is not to replace doctors, but to give them a quick, low-cost screening tool that they can use in settings where advanced diagnostics are out of reach.</w:t>
       </w:r>
     </w:p>
     <w:p>
       <w:pPr>
-        <w:pStyle w:val="Heading1"/>
+        <w:spacing w:line="360" w:lineRule="auto" w:before="360" w:after="120"/>
+        <w:jc w:val="left"/>
       </w:pPr>
       <w:r>
         <w:rPr>
           <w:rFonts w:ascii="Times New Roman" w:hAnsi="Times New Roman"/>
+          <w:b/>
           <w:color w:val="000000"/>
+          <w:sz w:val="28"/>
         </w:rPr>
         <w:t>2. Problem Statement</w:t>
       </w:r>
     </w:p>
     <w:p>
       <w:pPr>
-        <w:spacing w:after="120"/>
+        <w:spacing w:line="360" w:lineRule="auto" w:before="0" w:after="120"/>
         <w:ind w:firstLine="720"/>
         <w:jc w:val="both"/>
       </w:pPr>
       <w:r>
         <w:rPr>
           <w:rFonts w:ascii="Times New Roman" w:hAnsi="Times New Roman"/>
-          <w:b w:val="0"/>
           <w:sz w:val="24"/>
         </w:rPr>
         <w:t>The core problem is straightforward: there is no affordable, easy-to-use screening tool that a primary care physician in a small clinic can use to quickly assess whether a patient might have heart disease. The existing path — refer the patient to a specialist, wait for an appointment, run expensive tests, wait for results — is slow, costly, and simply unavailable in many parts of the country.</w:t>
@@ -390,29 +514,27 @@
     </w:p>
     <w:p>
       <w:pPr>
-        <w:spacing w:after="120"/>
+        <w:spacing w:line="360" w:lineRule="auto" w:before="0" w:after="120"/>
         <w:ind w:firstLine="720"/>
         <w:jc w:val="both"/>
       </w:pPr>
       <w:r>
         <w:rPr>
           <w:rFonts w:ascii="Times New Roman" w:hAnsi="Times New Roman"/>
-          <w:b w:val="0"/>
           <w:sz w:val="24"/>
         </w:rPr>
-        <w:t>From a technical standpoint, the gap is not in the machine learning research itself. Plenty of studies have shown that classifiers trained on the UCI Cleveland Heart Disease dataset can achieve accuracies in the 80–90% range. The gap is in delivery. Most of these models exist as Jupyter notebooks or command-line scripts that no clinician would ever use.</w:t>
+        <w:t>From a technical standpoint, the gap is not in the machine learning research itself. Plenty of studies have shown that classifiers trained on the UCI Cleveland Heart Disease dataset can achieve accuracies in the 80–90% range. The gap is in delivery. Most of these models exist as Jupyter notebooks or command-line scripts that no clinician would ever use. They lack a proper user interface, input validation, result interpretation, and the kind of packaging that would make them deployable in a real healthcare setting.</w:t>
       </w:r>
     </w:p>
     <w:p>
       <w:pPr>
-        <w:spacing w:after="120"/>
+        <w:spacing w:line="360" w:lineRule="auto" w:before="0" w:after="120"/>
         <w:ind w:firstLine="720"/>
         <w:jc w:val="both"/>
       </w:pPr>
       <w:r>
         <w:rPr>
           <w:rFonts w:ascii="Times New Roman" w:hAnsi="Times New Roman"/>
-          <w:b w:val="0"/>
           <w:sz w:val="24"/>
         </w:rPr>
         <w:t>CardioPredict aims to close this gap by building the complete pipeline: data preprocessing, model training and selection, a production-grade web application with proper validation, a prediction history database, and containerised deployment — all in one project.</w:t>
@@ -420,26 +542,27 @@
     </w:p>
     <w:p>
       <w:pPr>
-        <w:pStyle w:val="Heading1"/>
+        <w:spacing w:line="360" w:lineRule="auto" w:before="360" w:after="120"/>
+        <w:jc w:val="left"/>
       </w:pPr>
       <w:r>
         <w:rPr>
           <w:rFonts w:ascii="Times New Roman" w:hAnsi="Times New Roman"/>
+          <w:b/>
           <w:color w:val="000000"/>
+          <w:sz w:val="28"/>
         </w:rPr>
         <w:t>3. Objectives</w:t>
       </w:r>
     </w:p>
     <w:p>
       <w:pPr>
-        <w:spacing w:after="120"/>
-        <w:ind w:firstLine="0"/>
+        <w:spacing w:line="360" w:lineRule="auto" w:after="120"/>
         <w:jc w:val="both"/>
       </w:pPr>
       <w:r>
         <w:rPr>
           <w:rFonts w:ascii="Times New Roman" w:hAnsi="Times New Roman"/>
-          <w:b w:val="0"/>
           <w:sz w:val="24"/>
         </w:rPr>
         <w:t>This project has seven specific objectives:</w:t>
@@ -448,177 +571,209 @@
     <w:p>
       <w:pPr>
         <w:pStyle w:val="ListNumber"/>
+        <w:spacing w:line="360" w:lineRule="auto" w:after="40"/>
+        <w:jc w:val="both"/>
       </w:pPr>
       <w:r>
         <w:rPr>
           <w:rFonts w:ascii="Times New Roman" w:hAnsi="Times New Roman"/>
           <w:sz w:val="24"/>
         </w:rPr>
-        <w:t>Perform exploratory data analysis on the Cleveland Heart Disease dataset (303 patients, 13 clinical features).</w:t>
+        <w:t>Perform exploratory data analysis on the Cleveland Heart Disease dataset (303 patients, 13 clinical features) to understand feature distributions, correlations, and class balance.</w:t>
       </w:r>
     </w:p>
     <w:p>
       <w:pPr>
         <w:pStyle w:val="ListNumber"/>
+        <w:spacing w:line="360" w:lineRule="auto" w:after="40"/>
+        <w:jc w:val="both"/>
       </w:pPr>
       <w:r>
         <w:rPr>
           <w:rFonts w:ascii="Times New Roman" w:hAnsi="Times New Roman"/>
           <w:sz w:val="24"/>
         </w:rPr>
-        <w:t>Train and evaluate seven classification algorithms using stratified 10-fold cross-validation, and select the best performer.</w:t>
+        <w:t>Train and evaluate seven different classification algorithms — Logistic Regression, Decision Tree, Random Forest, Support Vector Machine (SVM), K-Nearest Neighbours (KNN), Gradient Boosting, and AdaBoost — using stratified 10-fold cross-validation, and select the best performer.</w:t>
       </w:r>
     </w:p>
     <w:p>
       <w:pPr>
         <w:pStyle w:val="ListNumber"/>
+        <w:spacing w:line="360" w:lineRule="auto" w:after="40"/>
+        <w:jc w:val="both"/>
       </w:pPr>
       <w:r>
         <w:rPr>
           <w:rFonts w:ascii="Times New Roman" w:hAnsi="Times New Roman"/>
           <w:sz w:val="24"/>
         </w:rPr>
-        <w:t>Develop a complete web application using Flask that lets a clinician enter patient data and receive an instant prediction.</w:t>
+        <w:t>Develop a complete web application using Flask that lets a clinician enter patient data through an intuitive form and receive an instant prediction with a colour-coded risk level.</w:t>
       </w:r>
     </w:p>
     <w:p>
       <w:pPr>
         <w:pStyle w:val="ListNumber"/>
+        <w:spacing w:line="360" w:lineRule="auto" w:after="40"/>
+        <w:jc w:val="both"/>
       </w:pPr>
       <w:r>
         <w:rPr>
           <w:rFonts w:ascii="Times New Roman" w:hAnsi="Times New Roman"/>
           <w:sz w:val="24"/>
         </w:rPr>
-        <w:t>Implement input validation on both the client side (HTML5, JavaScript) and the server side (Python type/range checks).</w:t>
+        <w:t>Implement input validation on both the client side (HTML5 constraints, JavaScript checks) and the server side (Python type and range validation) so that invalid data never reaches the model.</w:t>
       </w:r>
     </w:p>
     <w:p>
       <w:pPr>
         <w:pStyle w:val="ListNumber"/>
+        <w:spacing w:line="360" w:lineRule="auto" w:after="40"/>
+        <w:jc w:val="both"/>
       </w:pPr>
       <w:r>
         <w:rPr>
           <w:rFonts w:ascii="Times New Roman" w:hAnsi="Times New Roman"/>
           <w:sz w:val="24"/>
         </w:rPr>
-        <w:t>Store every prediction in a SQLite database with timestamps for longitudinal patient tracking.</w:t>
+        <w:t>Store every prediction in a SQLite database, along with timestamps and input values, to enable longitudinal tracking of patients over time.</w:t>
       </w:r>
     </w:p>
     <w:p>
       <w:pPr>
         <w:pStyle w:val="ListNumber"/>
+        <w:spacing w:line="360" w:lineRule="auto" w:after="40"/>
+        <w:jc w:val="both"/>
       </w:pPr>
       <w:r>
         <w:rPr>
           <w:rFonts w:ascii="Times New Roman" w:hAnsi="Times New Roman"/>
           <w:sz w:val="24"/>
         </w:rPr>
-        <w:t>Containerise the application with Docker and configure a Gunicorn production server.</w:t>
+        <w:t>Containerise the entire application with Docker and configure a production-grade Gunicorn server, so the system can be deployed on any machine with a single command.</w:t>
       </w:r>
     </w:p>
     <w:p>
       <w:pPr>
         <w:pStyle w:val="ListNumber"/>
+        <w:spacing w:line="360" w:lineRule="auto" w:after="40"/>
+        <w:jc w:val="both"/>
       </w:pPr>
       <w:r>
         <w:rPr>
           <w:rFonts w:ascii="Times New Roman" w:hAnsi="Times New Roman"/>
           <w:sz w:val="24"/>
         </w:rPr>
-        <w:t>Write a comprehensive test suite using pytest covering routing, prediction logic, edge cases, and database operations.</w:t>
+        <w:t>Write a comprehensive test suite using pytest — covering routing, prediction logic, content validation, edge cases, and database operations — to ensure reliability.</w:t>
+      </w:r>
+    </w:p>
+    <w:p>
+      <w:r>
+        <w:br w:type="page"/>
       </w:r>
     </w:p>
     <w:p>
       <w:pPr>
-        <w:pStyle w:val="Heading1"/>
+        <w:spacing w:line="360" w:lineRule="auto" w:before="360" w:after="120"/>
+        <w:jc w:val="left"/>
       </w:pPr>
       <w:r>
         <w:rPr>
           <w:rFonts w:ascii="Times New Roman" w:hAnsi="Times New Roman"/>
+          <w:b/>
           <w:color w:val="000000"/>
+          <w:sz w:val="28"/>
         </w:rPr>
         <w:t>4. Scope and Limitations</w:t>
       </w:r>
     </w:p>
     <w:p>
       <w:pPr>
-        <w:pStyle w:val="Heading2"/>
+        <w:spacing w:line="360" w:lineRule="auto" w:before="240" w:after="120"/>
+        <w:jc w:val="left"/>
       </w:pPr>
       <w:r>
         <w:rPr>
           <w:rFonts w:ascii="Times New Roman" w:hAnsi="Times New Roman"/>
-          <w:color w:val="000000"/>
+          <w:b/>
+          <w:sz w:val="24"/>
         </w:rPr>
         <w:t>4.1 Scope</w:t>
       </w:r>
     </w:p>
     <w:p>
       <w:pPr>
-        <w:spacing w:after="120"/>
-        <w:ind w:firstLine="0"/>
+        <w:spacing w:line="360" w:lineRule="auto" w:after="80"/>
         <w:jc w:val="both"/>
-      </w:pPr>
-      <w:r>
-        <w:rPr>
-          <w:rFonts w:ascii="Times New Roman" w:hAnsi="Times New Roman"/>
-          <w:b w:val="0"/>
-          <w:sz w:val="24"/>
-        </w:rPr>
-        <w:t>The project covers:</w:t>
-      </w:r>
-    </w:p>
-    <w:p>
-      <w:pPr>
-        <w:pStyle w:val="ListBullet"/>
       </w:pPr>
       <w:r>
         <w:rPr>
           <w:rFonts w:ascii="Times New Roman" w:hAnsi="Times New Roman"/>
           <w:sz w:val="24"/>
         </w:rPr>
-        <w:t>Binary classification (disease / no disease) based on 13 clinical parameters.</w:t>
+        <w:t>The scope of CardioPredict includes:</w:t>
       </w:r>
     </w:p>
     <w:p>
       <w:pPr>
         <w:pStyle w:val="ListBullet"/>
+        <w:spacing w:line="360" w:lineRule="auto" w:after="40"/>
+        <w:jc w:val="both"/>
       </w:pPr>
       <w:r>
         <w:rPr>
           <w:rFonts w:ascii="Times New Roman" w:hAnsi="Times New Roman"/>
           <w:sz w:val="24"/>
         </w:rPr>
-        <w:t>A multi-page web application with prediction form, result display, history, model information, and parameter reference.</w:t>
+        <w:t>Binary classification (disease present or absent) based on 13 clinical parameters.</w:t>
       </w:r>
     </w:p>
     <w:p>
       <w:pPr>
         <w:pStyle w:val="ListBullet"/>
+        <w:spacing w:line="360" w:lineRule="auto" w:after="40"/>
+        <w:jc w:val="both"/>
       </w:pPr>
       <w:r>
         <w:rPr>
           <w:rFonts w:ascii="Times New Roman" w:hAnsi="Times New Roman"/>
           <w:sz w:val="24"/>
         </w:rPr>
-        <w:t>Accessibility features: dark mode, adjustable font sizes, text scaling.</w:t>
+        <w:t>A multi-page web application with a prediction form, result display, prediction history, model information page, and parameter reference page.</w:t>
       </w:r>
     </w:p>
     <w:p>
       <w:pPr>
         <w:pStyle w:val="ListBullet"/>
+        <w:spacing w:line="360" w:lineRule="auto" w:after="40"/>
+        <w:jc w:val="both"/>
       </w:pPr>
       <w:r>
         <w:rPr>
           <w:rFonts w:ascii="Times New Roman" w:hAnsi="Times New Roman"/>
           <w:sz w:val="24"/>
         </w:rPr>
-        <w:t>A REST API endpoint returning predictions in JSON format.</w:t>
+        <w:t>Accessibility features including dark mode toggle, adjustable font sizes, and text scaling.</w:t>
       </w:r>
     </w:p>
     <w:p>
       <w:pPr>
         <w:pStyle w:val="ListBullet"/>
+        <w:spacing w:line="360" w:lineRule="auto" w:after="40"/>
+        <w:jc w:val="both"/>
+      </w:pPr>
+      <w:r>
+        <w:rPr>
+          <w:rFonts w:ascii="Times New Roman" w:hAnsi="Times New Roman"/>
+          <w:sz w:val="24"/>
+        </w:rPr>
+        <w:t>A REST API endpoint that returns predictions in JSON format for programmatic access.</w:t>
+      </w:r>
+    </w:p>
+    <w:p>
+      <w:pPr>
+        <w:pStyle w:val="ListBullet"/>
+        <w:spacing w:line="360" w:lineRule="auto" w:after="40"/>
+        <w:jc w:val="both"/>
       </w:pPr>
       <w:r>
         <w:rPr>
@@ -630,12 +785,14 @@
     </w:p>
     <w:p>
       <w:pPr>
-        <w:pStyle w:val="Heading2"/>
+        <w:spacing w:line="360" w:lineRule="auto" w:before="240" w:after="120"/>
+        <w:jc w:val="left"/>
       </w:pPr>
       <w:r>
         <w:rPr>
           <w:rFonts w:ascii="Times New Roman" w:hAnsi="Times New Roman"/>
-          <w:color w:val="000000"/>
+          <w:b/>
+          <w:sz w:val="24"/>
         </w:rPr>
         <w:t>4.2 Limitations</w:t>
       </w:r>
@@ -643,136 +800,161 @@
     <w:p>
       <w:pPr>
         <w:pStyle w:val="ListBullet"/>
+        <w:spacing w:line="360" w:lineRule="auto" w:after="40"/>
+        <w:jc w:val="both"/>
       </w:pPr>
       <w:r>
         <w:rPr>
           <w:rFonts w:ascii="Times New Roman" w:hAnsi="Times New Roman"/>
           <w:sz w:val="24"/>
         </w:rPr>
-        <w:t>Training data contains only 303 records from a single hospital. A production system would need multi-institutional data.</w:t>
+        <w:t>The training dataset contains only 303 records from a single hospital (Cleveland Clinic). A production system would require data from multiple institutions across different demographics.</w:t>
       </w:r>
     </w:p>
     <w:p>
       <w:pPr>
         <w:pStyle w:val="ListBullet"/>
+        <w:spacing w:line="360" w:lineRule="auto" w:after="40"/>
+        <w:jc w:val="both"/>
       </w:pPr>
       <w:r>
         <w:rPr>
           <w:rFonts w:ascii="Times New Roman" w:hAnsi="Times New Roman"/>
           <w:sz w:val="24"/>
         </w:rPr>
-        <w:t>The system is a screening aid, not a diagnostic tool — it should always be used alongside clinical judgement.</w:t>
+        <w:t>The system is a screening aid, not a diagnostic tool. It should always be used in conjunction with professional clinical judgement and is not intended as a standalone replacement for medical evaluation.</w:t>
       </w:r>
     </w:p>
     <w:p>
       <w:pPr>
         <w:pStyle w:val="ListBullet"/>
+        <w:spacing w:line="360" w:lineRule="auto" w:after="40"/>
+        <w:jc w:val="both"/>
       </w:pPr>
       <w:r>
         <w:rPr>
           <w:rFonts w:ascii="Times New Roman" w:hAnsi="Times New Roman"/>
           <w:sz w:val="24"/>
         </w:rPr>
-        <w:t>No user authentication in the current version.</w:t>
+        <w:t>User authentication and role-based access control are not implemented in the current version. In a real deployment, these would be required to protect patient data.</w:t>
       </w:r>
     </w:p>
     <w:p>
       <w:pPr>
-        <w:pStyle w:val="Heading1"/>
+        <w:spacing w:line="360" w:lineRule="auto" w:before="360" w:after="120"/>
+        <w:jc w:val="left"/>
       </w:pPr>
       <w:r>
         <w:rPr>
           <w:rFonts w:ascii="Times New Roman" w:hAnsi="Times New Roman"/>
+          <w:b/>
           <w:color w:val="000000"/>
+          <w:sz w:val="28"/>
         </w:rPr>
         <w:t>5. Proposed Methodology</w:t>
       </w:r>
     </w:p>
     <w:p>
       <w:pPr>
-        <w:pStyle w:val="Heading2"/>
+        <w:spacing w:line="360" w:lineRule="auto" w:before="240" w:after="120"/>
+        <w:jc w:val="left"/>
       </w:pPr>
       <w:r>
         <w:rPr>
           <w:rFonts w:ascii="Times New Roman" w:hAnsi="Times New Roman"/>
-          <w:color w:val="000000"/>
+          <w:b/>
+          <w:sz w:val="24"/>
         </w:rPr>
         <w:t>5.1 Dataset</w:t>
       </w:r>
     </w:p>
     <w:p>
       <w:pPr>
-        <w:spacing w:after="120"/>
+        <w:spacing w:line="360" w:lineRule="auto" w:before="0" w:after="120"/>
         <w:ind w:firstLine="720"/>
         <w:jc w:val="both"/>
       </w:pPr>
       <w:r>
         <w:rPr>
           <w:rFonts w:ascii="Times New Roman" w:hAnsi="Times New Roman"/>
-          <w:b w:val="0"/>
           <w:sz w:val="24"/>
         </w:rPr>
-        <w:t>The project uses the Cleveland Heart Disease dataset from the UCI Machine Learning Repository — 303 patient records with 13 clinical features and a binary target (0 = no disease, 1 = disease). Features include age, sex, chest pain type, blood pressure, cholesterol, fasting blood sugar, resting ECG, maximum heart rate, exercise-induced angina, ST depression, ST slope, major vessels, and thalassemia type.</w:t>
+        <w:t>The project uses the Cleveland Heart Disease dataset, originally collected at the Cleveland Clinic Foundation and made publicly available through the UCI Machine Learning Repository. It contains 303 patient records, each described by 13 clinical features: age, sex, chest pain type (four categories), resting blood pressure, serum cholesterol, fasting blood sugar, resting electrocardiogram results (three categories), maximum heart rate achieved, exercise-induced angina, ST depression induced by exercise relative to rest, the slope of the peak exercise ST segment, number of major vessels coloured by fluoroscopy (zero to three), and thalassemia type (three categories). The target variable is binary: 0 indicates no disease, and 1 indicates disease present.</w:t>
       </w:r>
     </w:p>
     <w:p>
       <w:pPr>
-        <w:pStyle w:val="Heading2"/>
+        <w:spacing w:line="360" w:lineRule="auto" w:before="240" w:after="120"/>
+        <w:jc w:val="left"/>
       </w:pPr>
       <w:r>
         <w:rPr>
           <w:rFonts w:ascii="Times New Roman" w:hAnsi="Times New Roman"/>
-          <w:color w:val="000000"/>
+          <w:b/>
+          <w:sz w:val="24"/>
         </w:rPr>
-        <w:t>5.2 Preprocessing</w:t>
+        <w:t>5.2 Data Preprocessing</w:t>
       </w:r>
     </w:p>
     <w:p>
       <w:pPr>
         <w:pStyle w:val="ListBullet"/>
+        <w:spacing w:line="360" w:lineRule="auto" w:after="40"/>
+        <w:jc w:val="both"/>
       </w:pPr>
       <w:r>
         <w:rPr>
           <w:rFonts w:ascii="Times New Roman" w:hAnsi="Times New Roman"/>
           <w:sz w:val="24"/>
         </w:rPr>
-        <w:t>Missing value imputation: median imputation for ca and thal columns.</w:t>
+        <w:t>Missing Value Imputation: The ca (major vessels) and thal (thalassemia) columns contain missing values in a small number of records. These are filled using the median of each respective column, which is robust to outliers and preserves the overall distribution.</w:t>
       </w:r>
     </w:p>
     <w:p>
       <w:pPr>
         <w:pStyle w:val="ListBullet"/>
+        <w:spacing w:line="360" w:lineRule="auto" w:after="40"/>
+        <w:jc w:val="both"/>
       </w:pPr>
       <w:r>
         <w:rPr>
           <w:rFonts w:ascii="Times New Roman" w:hAnsi="Times New Roman"/>
           <w:sz w:val="24"/>
         </w:rPr>
-        <w:t>Feature scaling: StandardScaler (z-score normalisation) applied to all 13 features.</w:t>
+        <w:t>Feature Scaling: All 13 features are normalised using StandardScaler from scikit-learn, which transforms each feature to have zero mean and unit variance. This step is essential for distance-based algorithms such as SVM and KNN that are sensitive to the scale of input features.</w:t>
       </w:r>
     </w:p>
     <w:p>
       <w:pPr>
         <w:pStyle w:val="ListBullet"/>
+        <w:spacing w:line="360" w:lineRule="auto" w:after="40"/>
+        <w:jc w:val="both"/>
       </w:pPr>
       <w:r>
         <w:rPr>
           <w:rFonts w:ascii="Times New Roman" w:hAnsi="Times New Roman"/>
           <w:sz w:val="24"/>
         </w:rPr>
-        <w:t>Train-test split: 80/20 stratified split (242 training, 61 testing samples).</w:t>
+        <w:t>Train-Test Split: The dataset is split into 80% training (242 samples) and 20% testing (61 samples) using stratified sampling to ensure both subsets maintain the same proportion of disease and non-disease cases.</w:t>
+      </w:r>
+    </w:p>
+    <w:p>
+      <w:r>
+        <w:br w:type="page"/>
       </w:r>
     </w:p>
     <w:p>
       <w:pPr>
-        <w:pStyle w:val="Heading2"/>
+        <w:spacing w:line="360" w:lineRule="auto" w:before="240" w:after="120"/>
+        <w:jc w:val="left"/>
       </w:pPr>
       <w:r>
         <w:rPr>
           <w:rFonts w:ascii="Times New Roman" w:hAnsi="Times New Roman"/>
-          <w:color w:val="000000"/>
+          <w:b/>
+          <w:sz w:val="24"/>
         </w:rPr>
-        <w:t>5.3 Pipeline</w:t>
+        <w:t>5.3 Machine Learning Pipeline</w:t>
       </w:r>
     </w:p>
     <w:tbl>
@@ -783,17 +965,19 @@
         <w:tblLook w:firstColumn="1" w:firstRow="1" w:lastColumn="0" w:lastRow="0" w:noHBand="0" w:noVBand="1" w:val="04A0"/>
       </w:tblPr>
       <w:tblGrid>
-        <w:gridCol w:w="2999"/>
-        <w:gridCol w:w="2999"/>
-        <w:gridCol w:w="2999"/>
+        <w:gridCol w:w="3120"/>
+        <w:gridCol w:w="3120"/>
+        <w:gridCol w:w="3120"/>
       </w:tblGrid>
       <w:tr>
         <w:tc>
           <w:tcPr>
-            <w:tcW w:type="dxa" w:w="2999"/>
-            <w:shd w:fill="D9E2F3" w:val="clear"/>
+            <w:tcW w:type="dxa" w:w="3120"/>
           </w:tcPr>
           <w:p>
+            <w:pPr>
+              <w:jc w:val="center"/>
+            </w:pPr>
             <w:r>
               <w:rPr>
                 <w:rFonts w:ascii="Times New Roman" w:hAnsi="Times New Roman"/>
@@ -806,33 +990,37 @@
         </w:tc>
         <w:tc>
           <w:tcPr>
-            <w:tcW w:type="dxa" w:w="2999"/>
-            <w:shd w:fill="D9E2F3" w:val="clear"/>
+            <w:tcW w:type="dxa" w:w="3120"/>
           </w:tcPr>
           <w:p>
+            <w:pPr>
+              <w:jc w:val="center"/>
+            </w:pPr>
             <w:r>
               <w:rPr>
                 <w:rFonts w:ascii="Times New Roman" w:hAnsi="Times New Roman"/>
                 <w:b/>
                 <w:sz w:val="22"/>
               </w:rPr>
-              <w:t>What Happens</w:t>
+              <w:t>Description</w:t>
             </w:r>
           </w:p>
         </w:tc>
         <w:tc>
           <w:tcPr>
-            <w:tcW w:type="dxa" w:w="2999"/>
-            <w:shd w:fill="D9E2F3" w:val="clear"/>
+            <w:tcW w:type="dxa" w:w="3120"/>
           </w:tcPr>
           <w:p>
+            <w:pPr>
+              <w:jc w:val="center"/>
+            </w:pPr>
             <w:r>
               <w:rPr>
                 <w:rFonts w:ascii="Times New Roman" w:hAnsi="Times New Roman"/>
                 <w:b/>
                 <w:sz w:val="22"/>
               </w:rPr>
-              <w:t>Tools</w:t>
+              <w:t>Tools Used</w:t>
             </w:r>
           </w:p>
         </w:tc>
@@ -840,7 +1028,7 @@
       <w:tr>
         <w:tc>
           <w:tcPr>
-            <w:tcW w:type="dxa" w:w="2999"/>
+            <w:tcW w:type="dxa" w:w="3120"/>
           </w:tcPr>
           <w:p>
             <w:r>
@@ -848,13 +1036,13 @@
                 <w:rFonts w:ascii="Times New Roman" w:hAnsi="Times New Roman"/>
                 <w:sz w:val="22"/>
               </w:rPr>
-              <w:t>Data loading</w:t>
+              <w:t>Data Loading</w:t>
             </w:r>
           </w:p>
         </w:tc>
         <w:tc>
           <w:tcPr>
-            <w:tcW w:type="dxa" w:w="2999"/>
+            <w:tcW w:type="dxa" w:w="3120"/>
           </w:tcPr>
           <w:p>
             <w:r>
@@ -862,13 +1050,13 @@
                 <w:rFonts w:ascii="Times New Roman" w:hAnsi="Times New Roman"/>
                 <w:sz w:val="22"/>
               </w:rPr>
-              <w:t>Read CSV, inspect shape and types</w:t>
+              <w:t>Read the CSV file, inspect shape and data types</w:t>
             </w:r>
           </w:p>
         </w:tc>
         <w:tc>
           <w:tcPr>
-            <w:tcW w:type="dxa" w:w="2999"/>
+            <w:tcW w:type="dxa" w:w="3120"/>
           </w:tcPr>
           <w:p>
             <w:r>
@@ -876,7 +1064,7 @@
                 <w:rFonts w:ascii="Times New Roman" w:hAnsi="Times New Roman"/>
                 <w:sz w:val="22"/>
               </w:rPr>
-              <w:t>pandas, numpy</w:t>
+              <w:t>pandas, NumPy</w:t>
             </w:r>
           </w:p>
         </w:tc>
@@ -884,7 +1072,7 @@
       <w:tr>
         <w:tc>
           <w:tcPr>
-            <w:tcW w:type="dxa" w:w="2999"/>
+            <w:tcW w:type="dxa" w:w="3120"/>
           </w:tcPr>
           <w:p>
             <w:r>
@@ -892,13 +1080,13 @@
                 <w:rFonts w:ascii="Times New Roman" w:hAnsi="Times New Roman"/>
                 <w:sz w:val="22"/>
               </w:rPr>
-              <w:t>EDA</w:t>
+              <w:t>Exploratory Analysis</w:t>
             </w:r>
           </w:p>
         </w:tc>
         <w:tc>
           <w:tcPr>
-            <w:tcW w:type="dxa" w:w="2999"/>
+            <w:tcW w:type="dxa" w:w="3120"/>
           </w:tcPr>
           <w:p>
             <w:r>
@@ -906,13 +1094,13 @@
                 <w:rFonts w:ascii="Times New Roman" w:hAnsi="Times New Roman"/>
                 <w:sz w:val="22"/>
               </w:rPr>
-              <w:t>Correlation heatmaps, class distribution plots</w:t>
+              <w:t>Generate correlation heatmaps, class distribution plots</w:t>
             </w:r>
           </w:p>
         </w:tc>
         <w:tc>
           <w:tcPr>
-            <w:tcW w:type="dxa" w:w="2999"/>
+            <w:tcW w:type="dxa" w:w="3120"/>
           </w:tcPr>
           <w:p>
             <w:r>
@@ -920,7 +1108,7 @@
                 <w:rFonts w:ascii="Times New Roman" w:hAnsi="Times New Roman"/>
                 <w:sz w:val="22"/>
               </w:rPr>
-              <w:t>matplotlib, seaborn</w:t>
+              <w:t>Matplotlib, Seaborn</w:t>
             </w:r>
           </w:p>
         </w:tc>
@@ -928,7 +1116,7 @@
       <w:tr>
         <w:tc>
           <w:tcPr>
-            <w:tcW w:type="dxa" w:w="2999"/>
+            <w:tcW w:type="dxa" w:w="3120"/>
           </w:tcPr>
           <w:p>
             <w:r>
@@ -942,7 +1130,7 @@
         </w:tc>
         <w:tc>
           <w:tcPr>
-            <w:tcW w:type="dxa" w:w="2999"/>
+            <w:tcW w:type="dxa" w:w="3120"/>
           </w:tcPr>
           <w:p>
             <w:r>
@@ -950,13 +1138,13 @@
                 <w:rFonts w:ascii="Times New Roman" w:hAnsi="Times New Roman"/>
                 <w:sz w:val="22"/>
               </w:rPr>
-              <w:t>Handle missing values, scale features</w:t>
+              <w:t>Handle missing values, apply feature scaling</w:t>
             </w:r>
           </w:p>
         </w:tc>
         <w:tc>
           <w:tcPr>
-            <w:tcW w:type="dxa" w:w="2999"/>
+            <w:tcW w:type="dxa" w:w="3120"/>
           </w:tcPr>
           <w:p>
             <w:r>
@@ -972,7 +1160,7 @@
       <w:tr>
         <w:tc>
           <w:tcPr>
-            <w:tcW w:type="dxa" w:w="2999"/>
+            <w:tcW w:type="dxa" w:w="3120"/>
           </w:tcPr>
           <w:p>
             <w:r>
@@ -980,13 +1168,13 @@
                 <w:rFonts w:ascii="Times New Roman" w:hAnsi="Times New Roman"/>
                 <w:sz w:val="22"/>
               </w:rPr>
-              <w:t>Training</w:t>
+              <w:t>Model Training</w:t>
             </w:r>
           </w:p>
         </w:tc>
         <w:tc>
           <w:tcPr>
-            <w:tcW w:type="dxa" w:w="2999"/>
+            <w:tcW w:type="dxa" w:w="3120"/>
           </w:tcPr>
           <w:p>
             <w:r>
@@ -994,13 +1182,13 @@
                 <w:rFonts w:ascii="Times New Roman" w:hAnsi="Times New Roman"/>
                 <w:sz w:val="22"/>
               </w:rPr>
-              <w:t>Fit 7 algorithms with 10-fold stratified CV</w:t>
+              <w:t>Fit seven algorithms with 10-fold stratified cross-validation</w:t>
             </w:r>
           </w:p>
         </w:tc>
         <w:tc>
           <w:tcPr>
-            <w:tcW w:type="dxa" w:w="2999"/>
+            <w:tcW w:type="dxa" w:w="3120"/>
           </w:tcPr>
           <w:p>
             <w:r>
@@ -1016,7 +1204,7 @@
       <w:tr>
         <w:tc>
           <w:tcPr>
-            <w:tcW w:type="dxa" w:w="2999"/>
+            <w:tcW w:type="dxa" w:w="3120"/>
           </w:tcPr>
           <w:p>
             <w:r>
@@ -1030,7 +1218,7 @@
         </w:tc>
         <w:tc>
           <w:tcPr>
-            <w:tcW w:type="dxa" w:w="2999"/>
+            <w:tcW w:type="dxa" w:w="3120"/>
           </w:tcPr>
           <w:p>
             <w:r>
@@ -1038,13 +1226,13 @@
                 <w:rFonts w:ascii="Times New Roman" w:hAnsi="Times New Roman"/>
                 <w:sz w:val="22"/>
               </w:rPr>
-              <w:t>Accuracy, Precision, Recall, F1, confusion matrix</w:t>
+              <w:t>Compute Accuracy, Precision, Recall, F1-Score, Confusion Matrix</w:t>
             </w:r>
           </w:p>
         </w:tc>
         <w:tc>
           <w:tcPr>
-            <w:tcW w:type="dxa" w:w="2999"/>
+            <w:tcW w:type="dxa" w:w="3120"/>
           </w:tcPr>
           <w:p>
             <w:r>
@@ -1060,7 +1248,7 @@
       <w:tr>
         <w:tc>
           <w:tcPr>
-            <w:tcW w:type="dxa" w:w="2999"/>
+            <w:tcW w:type="dxa" w:w="3120"/>
           </w:tcPr>
           <w:p>
             <w:r>
@@ -1074,7 +1262,7 @@
         </w:tc>
         <w:tc>
           <w:tcPr>
-            <w:tcW w:type="dxa" w:w="2999"/>
+            <w:tcW w:type="dxa" w:w="3120"/>
           </w:tcPr>
           <w:p>
             <w:r>
@@ -1082,13 +1270,13 @@
                 <w:rFonts w:ascii="Times New Roman" w:hAnsi="Times New Roman"/>
                 <w:sz w:val="22"/>
               </w:rPr>
-              <w:t>Save best model and scaler as .pkl files</w:t>
+              <w:t>Save the best model and scaler as .pkl files for deployment</w:t>
             </w:r>
           </w:p>
         </w:tc>
         <w:tc>
           <w:tcPr>
-            <w:tcW w:type="dxa" w:w="2999"/>
+            <w:tcW w:type="dxa" w:w="3120"/>
           </w:tcPr>
           <w:p>
             <w:r>
@@ -1102,17 +1290,37 @@
         </w:tc>
       </w:tr>
     </w:tbl>
-    <w:p/>
     <w:p>
       <w:pPr>
-        <w:pStyle w:val="Heading2"/>
+        <w:spacing w:before="120" w:after="120"/>
+      </w:pPr>
+    </w:p>
+    <w:p>
+      <w:pPr>
+        <w:spacing w:line="360" w:lineRule="auto" w:before="240" w:after="120"/>
+        <w:jc w:val="left"/>
       </w:pPr>
       <w:r>
         <w:rPr>
           <w:rFonts w:ascii="Times New Roman" w:hAnsi="Times New Roman"/>
-          <w:color w:val="000000"/>
+          <w:b/>
+          <w:sz w:val="24"/>
         </w:rPr>
-        <w:t>5.4 Algorithms</w:t>
+        <w:t>5.4 Classification Algorithms Evaluated</w:t>
+      </w:r>
+    </w:p>
+    <w:p>
+      <w:pPr>
+        <w:spacing w:line="360" w:lineRule="auto" w:before="0" w:after="120"/>
+        <w:ind w:firstLine="720"/>
+        <w:jc w:val="both"/>
+      </w:pPr>
+      <w:r>
+        <w:rPr>
+          <w:rFonts w:ascii="Times New Roman" w:hAnsi="Times New Roman"/>
+          <w:sz w:val="24"/>
+        </w:rPr>
+        <w:t>Seven algorithms were trained and compared to determine which one offers the best balance of accuracy, stability, and clinical suitability. The following table lists each algorithm along with its type and the rationale for its inclusion in the study:</w:t>
       </w:r>
     </w:p>
     <w:tbl>
@@ -1123,17 +1331,19 @@
         <w:tblLook w:firstColumn="1" w:firstRow="1" w:lastColumn="0" w:lastRow="0" w:noHBand="0" w:noVBand="1" w:val="04A0"/>
       </w:tblPr>
       <w:tblGrid>
-        <w:gridCol w:w="2999"/>
-        <w:gridCol w:w="2999"/>
-        <w:gridCol w:w="2999"/>
+        <w:gridCol w:w="3120"/>
+        <w:gridCol w:w="3120"/>
+        <w:gridCol w:w="3120"/>
       </w:tblGrid>
       <w:tr>
         <w:tc>
           <w:tcPr>
-            <w:tcW w:type="dxa" w:w="2999"/>
-            <w:shd w:fill="D9E2F3" w:val="clear"/>
+            <w:tcW w:type="dxa" w:w="3120"/>
           </w:tcPr>
           <w:p>
+            <w:pPr>
+              <w:jc w:val="center"/>
+            </w:pPr>
             <w:r>
               <w:rPr>
                 <w:rFonts w:ascii="Times New Roman" w:hAnsi="Times New Roman"/>
@@ -1146,10 +1356,12 @@
         </w:tc>
         <w:tc>
           <w:tcPr>
-            <w:tcW w:type="dxa" w:w="2999"/>
-            <w:shd w:fill="D9E2F3" w:val="clear"/>
+            <w:tcW w:type="dxa" w:w="3120"/>
           </w:tcPr>
           <w:p>
+            <w:pPr>
+              <w:jc w:val="center"/>
+            </w:pPr>
             <w:r>
               <w:rPr>
                 <w:rFonts w:ascii="Times New Roman" w:hAnsi="Times New Roman"/>
@@ -1162,17 +1374,19 @@
         </w:tc>
         <w:tc>
           <w:tcPr>
-            <w:tcW w:type="dxa" w:w="2999"/>
-            <w:shd w:fill="D9E2F3" w:val="clear"/>
+            <w:tcW w:type="dxa" w:w="3120"/>
           </w:tcPr>
           <w:p>
+            <w:pPr>
+              <w:jc w:val="center"/>
+            </w:pPr>
             <w:r>
               <w:rPr>
                 <w:rFonts w:ascii="Times New Roman" w:hAnsi="Times New Roman"/>
                 <w:b/>
                 <w:sz w:val="22"/>
               </w:rPr>
-              <w:t>Why Included</w:t>
+              <w:t>Rationale for Inclusion</w:t>
             </w:r>
           </w:p>
         </w:tc>
@@ -1180,7 +1394,7 @@
       <w:tr>
         <w:tc>
           <w:tcPr>
-            <w:tcW w:type="dxa" w:w="2999"/>
+            <w:tcW w:type="dxa" w:w="3120"/>
           </w:tcPr>
           <w:p>
             <w:r>
@@ -1194,7 +1408,7 @@
         </w:tc>
         <w:tc>
           <w:tcPr>
-            <w:tcW w:type="dxa" w:w="2999"/>
+            <w:tcW w:type="dxa" w:w="3120"/>
           </w:tcPr>
           <w:p>
             <w:r>
@@ -1208,7 +1422,7 @@
         </w:tc>
         <w:tc>
           <w:tcPr>
-            <w:tcW w:type="dxa" w:w="2999"/>
+            <w:tcW w:type="dxa" w:w="3120"/>
           </w:tcPr>
           <w:p>
             <w:r>
@@ -1216,7 +1430,7 @@
                 <w:rFonts w:ascii="Times New Roman" w:hAnsi="Times New Roman"/>
                 <w:sz w:val="22"/>
               </w:rPr>
-              <w:t>Simple baseline; outputs probabilities directly</w:t>
+              <w:t>Simple probabilistic baseline; outputs interpretable coefficients</w:t>
             </w:r>
           </w:p>
         </w:tc>
@@ -1224,7 +1438,7 @@
       <w:tr>
         <w:tc>
           <w:tcPr>
-            <w:tcW w:type="dxa" w:w="2999"/>
+            <w:tcW w:type="dxa" w:w="3120"/>
           </w:tcPr>
           <w:p>
             <w:r>
@@ -1238,7 +1452,7 @@
         </w:tc>
         <w:tc>
           <w:tcPr>
-            <w:tcW w:type="dxa" w:w="2999"/>
+            <w:tcW w:type="dxa" w:w="3120"/>
           </w:tcPr>
           <w:p>
             <w:r>
@@ -1252,7 +1466,7 @@
         </w:tc>
         <w:tc>
           <w:tcPr>
-            <w:tcW w:type="dxa" w:w="2999"/>
+            <w:tcW w:type="dxa" w:w="3120"/>
           </w:tcPr>
           <w:p>
             <w:r>
@@ -1260,7 +1474,7 @@
                 <w:rFonts w:ascii="Times New Roman" w:hAnsi="Times New Roman"/>
                 <w:sz w:val="22"/>
               </w:rPr>
-              <w:t>Interpretable; useful for understanding splits</w:t>
+              <w:t>Highly interpretable; useful for understanding feature-level splits</w:t>
             </w:r>
           </w:p>
         </w:tc>
@@ -1268,7 +1482,7 @@
       <w:tr>
         <w:tc>
           <w:tcPr>
-            <w:tcW w:type="dxa" w:w="2999"/>
+            <w:tcW w:type="dxa" w:w="3120"/>
           </w:tcPr>
           <w:p>
             <w:r>
@@ -1282,7 +1496,7 @@
         </w:tc>
         <w:tc>
           <w:tcPr>
-            <w:tcW w:type="dxa" w:w="2999"/>
+            <w:tcW w:type="dxa" w:w="3120"/>
           </w:tcPr>
           <w:p>
             <w:r>
@@ -1290,13 +1504,13 @@
                 <w:rFonts w:ascii="Times New Roman" w:hAnsi="Times New Roman"/>
                 <w:sz w:val="22"/>
               </w:rPr>
-              <w:t>Ensemble (bagging)</w:t>
+              <w:t>Ensemble (Bagging)</w:t>
             </w:r>
           </w:p>
         </w:tc>
         <w:tc>
           <w:tcPr>
-            <w:tcW w:type="dxa" w:w="2999"/>
+            <w:tcW w:type="dxa" w:w="3120"/>
           </w:tcPr>
           <w:p>
             <w:r>
@@ -1304,7 +1518,7 @@
                 <w:rFonts w:ascii="Times New Roman" w:hAnsi="Times New Roman"/>
                 <w:sz w:val="22"/>
               </w:rPr>
-              <w:t>Reduces variance; handles mixed features well</w:t>
+              <w:t>Reduces variance of individual trees; handles mixed feature types well</w:t>
             </w:r>
           </w:p>
         </w:tc>
@@ -1312,7 +1526,7 @@
       <w:tr>
         <w:tc>
           <w:tcPr>
-            <w:tcW w:type="dxa" w:w="2999"/>
+            <w:tcW w:type="dxa" w:w="3120"/>
           </w:tcPr>
           <w:p>
             <w:r>
@@ -1326,7 +1540,7 @@
         </w:tc>
         <w:tc>
           <w:tcPr>
-            <w:tcW w:type="dxa" w:w="2999"/>
+            <w:tcW w:type="dxa" w:w="3120"/>
           </w:tcPr>
           <w:p>
             <w:r>
@@ -1340,7 +1554,7 @@
         </w:tc>
         <w:tc>
           <w:tcPr>
-            <w:tcW w:type="dxa" w:w="2999"/>
+            <w:tcW w:type="dxa" w:w="3120"/>
           </w:tcPr>
           <w:p>
             <w:r>
@@ -1348,7 +1562,7 @@
                 <w:rFonts w:ascii="Times New Roman" w:hAnsi="Times New Roman"/>
                 <w:sz w:val="22"/>
               </w:rPr>
-              <w:t>Strong in high-dimensional spaces</w:t>
+              <w:t>Strong performance in high-dimensional feature spaces</w:t>
             </w:r>
           </w:p>
         </w:tc>
@@ -1356,7 +1570,7 @@
       <w:tr>
         <w:tc>
           <w:tcPr>
-            <w:tcW w:type="dxa" w:w="2999"/>
+            <w:tcW w:type="dxa" w:w="3120"/>
           </w:tcPr>
           <w:p>
             <w:r>
@@ -1370,7 +1584,7 @@
         </w:tc>
         <w:tc>
           <w:tcPr>
-            <w:tcW w:type="dxa" w:w="2999"/>
+            <w:tcW w:type="dxa" w:w="3120"/>
           </w:tcPr>
           <w:p>
             <w:r>
@@ -1384,7 +1598,7 @@
         </w:tc>
         <w:tc>
           <w:tcPr>
-            <w:tcW w:type="dxa" w:w="2999"/>
+            <w:tcW w:type="dxa" w:w="3120"/>
           </w:tcPr>
           <w:p>
             <w:r>
@@ -1392,7 +1606,7 @@
                 <w:rFonts w:ascii="Times New Roman" w:hAnsi="Times New Roman"/>
                 <w:sz w:val="22"/>
               </w:rPr>
-              <w:t>Non-parametric; no training phase</w:t>
+              <w:t>Non-parametric approach; no explicit training phase required</w:t>
             </w:r>
           </w:p>
         </w:tc>
@@ -1400,7 +1614,7 @@
       <w:tr>
         <w:tc>
           <w:tcPr>
-            <w:tcW w:type="dxa" w:w="2999"/>
+            <w:tcW w:type="dxa" w:w="3120"/>
           </w:tcPr>
           <w:p>
             <w:r>
@@ -1414,7 +1628,7 @@
         </w:tc>
         <w:tc>
           <w:tcPr>
-            <w:tcW w:type="dxa" w:w="2999"/>
+            <w:tcW w:type="dxa" w:w="3120"/>
           </w:tcPr>
           <w:p>
             <w:r>
@@ -1422,13 +1636,13 @@
                 <w:rFonts w:ascii="Times New Roman" w:hAnsi="Times New Roman"/>
                 <w:sz w:val="22"/>
               </w:rPr>
-              <w:t>Ensemble (boosting)</w:t>
+              <w:t>Ensemble (Boosting)</w:t>
             </w:r>
           </w:p>
         </w:tc>
         <w:tc>
           <w:tcPr>
-            <w:tcW w:type="dxa" w:w="2999"/>
+            <w:tcW w:type="dxa" w:w="3120"/>
           </w:tcPr>
           <w:p>
             <w:r>
@@ -1436,7 +1650,7 @@
                 <w:rFonts w:ascii="Times New Roman" w:hAnsi="Times New Roman"/>
                 <w:sz w:val="22"/>
               </w:rPr>
-              <w:t>Sequentially corrects errors</w:t>
+              <w:t>Sequentially corrects errors from previous iterations</w:t>
             </w:r>
           </w:p>
         </w:tc>
@@ -1444,7 +1658,7 @@
       <w:tr>
         <w:tc>
           <w:tcPr>
-            <w:tcW w:type="dxa" w:w="2999"/>
+            <w:tcW w:type="dxa" w:w="3120"/>
           </w:tcPr>
           <w:p>
             <w:r>
@@ -1458,7 +1672,7 @@
         </w:tc>
         <w:tc>
           <w:tcPr>
-            <w:tcW w:type="dxa" w:w="2999"/>
+            <w:tcW w:type="dxa" w:w="3120"/>
           </w:tcPr>
           <w:p>
             <w:r>
@@ -1466,13 +1680,13 @@
                 <w:rFonts w:ascii="Times New Roman" w:hAnsi="Times New Roman"/>
                 <w:sz w:val="22"/>
               </w:rPr>
-              <w:t>Ensemble (boosting)</w:t>
+              <w:t>Ensemble (Boosting)</w:t>
             </w:r>
           </w:p>
         </w:tc>
         <w:tc>
           <w:tcPr>
-            <w:tcW w:type="dxa" w:w="2999"/>
+            <w:tcW w:type="dxa" w:w="3120"/>
           </w:tcPr>
           <w:p>
             <w:r>
@@ -1480,23 +1694,44 @@
                 <w:rFonts w:ascii="Times New Roman" w:hAnsi="Times New Roman"/>
                 <w:sz w:val="22"/>
               </w:rPr>
-              <w:t>Focuses on hard examples</w:t>
+              <w:t>Assigns higher weight to misclassified samples in each round</w:t>
             </w:r>
           </w:p>
         </w:tc>
       </w:tr>
     </w:tbl>
-    <w:p/>
     <w:p>
       <w:pPr>
-        <w:pStyle w:val="Heading1"/>
+        <w:spacing w:before="120" w:after="120"/>
+      </w:pPr>
+    </w:p>
+    <w:p>
+      <w:pPr>
+        <w:spacing w:line="360" w:lineRule="auto" w:before="360" w:after="120"/>
+        <w:jc w:val="left"/>
       </w:pPr>
       <w:r>
         <w:rPr>
           <w:rFonts w:ascii="Times New Roman" w:hAnsi="Times New Roman"/>
+          <w:b/>
           <w:color w:val="000000"/>
+          <w:sz w:val="28"/>
         </w:rPr>
         <w:t>6. Technology Stack</w:t>
+      </w:r>
+    </w:p>
+    <w:p>
+      <w:pPr>
+        <w:spacing w:line="360" w:lineRule="auto" w:before="0" w:after="120"/>
+        <w:ind w:firstLine="720"/>
+        <w:jc w:val="both"/>
+      </w:pPr>
+      <w:r>
+        <w:rPr>
+          <w:rFonts w:ascii="Times New Roman" w:hAnsi="Times New Roman"/>
+          <w:sz w:val="24"/>
+        </w:rPr>
+        <w:t>The following table lists every major technology used in the project, along with its specific role in the system:</w:t>
       </w:r>
     </w:p>
     <w:tbl>
@@ -1507,17 +1742,19 @@
         <w:tblLook w:firstColumn="1" w:firstRow="1" w:lastColumn="0" w:lastRow="0" w:noHBand="0" w:noVBand="1" w:val="04A0"/>
       </w:tblPr>
       <w:tblGrid>
-        <w:gridCol w:w="2999"/>
-        <w:gridCol w:w="2999"/>
-        <w:gridCol w:w="2999"/>
+        <w:gridCol w:w="3120"/>
+        <w:gridCol w:w="3120"/>
+        <w:gridCol w:w="3120"/>
       </w:tblGrid>
       <w:tr>
         <w:tc>
           <w:tcPr>
-            <w:tcW w:type="dxa" w:w="2999"/>
-            <w:shd w:fill="D9E2F3" w:val="clear"/>
+            <w:tcW w:type="dxa" w:w="3120"/>
           </w:tcPr>
           <w:p>
+            <w:pPr>
+              <w:jc w:val="center"/>
+            </w:pPr>
             <w:r>
               <w:rPr>
                 <w:rFonts w:ascii="Times New Roman" w:hAnsi="Times New Roman"/>
@@ -1530,10 +1767,12 @@
         </w:tc>
         <w:tc>
           <w:tcPr>
-            <w:tcW w:type="dxa" w:w="2999"/>
-            <w:shd w:fill="D9E2F3" w:val="clear"/>
+            <w:tcW w:type="dxa" w:w="3120"/>
           </w:tcPr>
           <w:p>
+            <w:pPr>
+              <w:jc w:val="center"/>
+            </w:pPr>
             <w:r>
               <w:rPr>
                 <w:rFonts w:ascii="Times New Roman" w:hAnsi="Times New Roman"/>
@@ -1546,17 +1785,19 @@
         </w:tc>
         <w:tc>
           <w:tcPr>
-            <w:tcW w:type="dxa" w:w="2999"/>
-            <w:shd w:fill="D9E2F3" w:val="clear"/>
+            <w:tcW w:type="dxa" w:w="3120"/>
           </w:tcPr>
           <w:p>
+            <w:pPr>
+              <w:jc w:val="center"/>
+            </w:pPr>
             <w:r>
               <w:rPr>
                 <w:rFonts w:ascii="Times New Roman" w:hAnsi="Times New Roman"/>
                 <w:b/>
                 <w:sz w:val="22"/>
               </w:rPr>
-              <w:t>Role</w:t>
+              <w:t>Role in the Project</w:t>
             </w:r>
           </w:p>
         </w:tc>
@@ -1564,7 +1805,7 @@
       <w:tr>
         <w:tc>
           <w:tcPr>
-            <w:tcW w:type="dxa" w:w="2999"/>
+            <w:tcW w:type="dxa" w:w="3120"/>
           </w:tcPr>
           <w:p>
             <w:r>
@@ -1572,13 +1813,13 @@
                 <w:rFonts w:ascii="Times New Roman" w:hAnsi="Times New Roman"/>
                 <w:sz w:val="22"/>
               </w:rPr>
-              <w:t>Language</w:t>
+              <w:t>Programming Language</w:t>
             </w:r>
           </w:p>
         </w:tc>
         <w:tc>
           <w:tcPr>
-            <w:tcW w:type="dxa" w:w="2999"/>
+            <w:tcW w:type="dxa" w:w="3120"/>
           </w:tcPr>
           <w:p>
             <w:r>
@@ -1592,7 +1833,7 @@
         </w:tc>
         <w:tc>
           <w:tcPr>
-            <w:tcW w:type="dxa" w:w="2999"/>
+            <w:tcW w:type="dxa" w:w="3120"/>
           </w:tcPr>
           <w:p>
             <w:r>
@@ -1600,7 +1841,7 @@
                 <w:rFonts w:ascii="Times New Roman" w:hAnsi="Times New Roman"/>
                 <w:sz w:val="22"/>
               </w:rPr>
-              <w:t>All backend code and ML training</w:t>
+              <w:t>All backend code, model training, and scripting</w:t>
             </w:r>
           </w:p>
         </w:tc>
@@ -1608,7 +1849,7 @@
       <w:tr>
         <w:tc>
           <w:tcPr>
-            <w:tcW w:type="dxa" w:w="2999"/>
+            <w:tcW w:type="dxa" w:w="3120"/>
           </w:tcPr>
           <w:p>
             <w:r>
@@ -1616,13 +1857,13 @@
                 <w:rFonts w:ascii="Times New Roman" w:hAnsi="Times New Roman"/>
                 <w:sz w:val="22"/>
               </w:rPr>
-              <w:t>ML libraries</w:t>
+              <w:t>Machine Learning</w:t>
             </w:r>
           </w:p>
         </w:tc>
         <w:tc>
           <w:tcPr>
-            <w:tcW w:type="dxa" w:w="2999"/>
+            <w:tcW w:type="dxa" w:w="3120"/>
           </w:tcPr>
           <w:p>
             <w:r>
@@ -1630,13 +1871,13 @@
                 <w:rFonts w:ascii="Times New Roman" w:hAnsi="Times New Roman"/>
                 <w:sz w:val="22"/>
               </w:rPr>
-              <w:t>scikit-learn, pandas, numpy</w:t>
+              <w:t>scikit-learn, pandas, NumPy</w:t>
             </w:r>
           </w:p>
         </w:tc>
         <w:tc>
           <w:tcPr>
-            <w:tcW w:type="dxa" w:w="2999"/>
+            <w:tcW w:type="dxa" w:w="3120"/>
           </w:tcPr>
           <w:p>
             <w:r>
@@ -1644,7 +1885,7 @@
                 <w:rFonts w:ascii="Times New Roman" w:hAnsi="Times New Roman"/>
                 <w:sz w:val="22"/>
               </w:rPr>
-              <w:t>Data processing and model training</w:t>
+              <w:t>Data processing, model training, evaluation</w:t>
             </w:r>
           </w:p>
         </w:tc>
@@ -1652,7 +1893,7 @@
       <w:tr>
         <w:tc>
           <w:tcPr>
-            <w:tcW w:type="dxa" w:w="2999"/>
+            <w:tcW w:type="dxa" w:w="3120"/>
           </w:tcPr>
           <w:p>
             <w:r>
@@ -1666,7 +1907,7 @@
         </w:tc>
         <w:tc>
           <w:tcPr>
-            <w:tcW w:type="dxa" w:w="2999"/>
+            <w:tcW w:type="dxa" w:w="3120"/>
           </w:tcPr>
           <w:p>
             <w:r>
@@ -1674,13 +1915,13 @@
                 <w:rFonts w:ascii="Times New Roman" w:hAnsi="Times New Roman"/>
                 <w:sz w:val="22"/>
               </w:rPr>
-              <w:t>matplotlib, seaborn</w:t>
+              <w:t>Matplotlib, Seaborn</w:t>
             </w:r>
           </w:p>
         </w:tc>
         <w:tc>
           <w:tcPr>
-            <w:tcW w:type="dxa" w:w="2999"/>
+            <w:tcW w:type="dxa" w:w="3120"/>
           </w:tcPr>
           <w:p>
             <w:r>
@@ -1688,7 +1929,7 @@
                 <w:rFonts w:ascii="Times New Roman" w:hAnsi="Times New Roman"/>
                 <w:sz w:val="22"/>
               </w:rPr>
-              <w:t>Training-time charts</w:t>
+              <w:t>Training-time charts, correlation heatmaps</w:t>
             </w:r>
           </w:p>
         </w:tc>
@@ -1696,7 +1937,7 @@
       <w:tr>
         <w:tc>
           <w:tcPr>
-            <w:tcW w:type="dxa" w:w="2999"/>
+            <w:tcW w:type="dxa" w:w="3120"/>
           </w:tcPr>
           <w:p>
             <w:r>
@@ -1704,13 +1945,13 @@
                 <w:rFonts w:ascii="Times New Roman" w:hAnsi="Times New Roman"/>
                 <w:sz w:val="22"/>
               </w:rPr>
-              <w:t>Web framework</w:t>
+              <w:t>Web Framework</w:t>
             </w:r>
           </w:p>
         </w:tc>
         <w:tc>
           <w:tcPr>
-            <w:tcW w:type="dxa" w:w="2999"/>
+            <w:tcW w:type="dxa" w:w="3120"/>
           </w:tcPr>
           <w:p>
             <w:r>
@@ -1724,7 +1965,7 @@
         </w:tc>
         <w:tc>
           <w:tcPr>
-            <w:tcW w:type="dxa" w:w="2999"/>
+            <w:tcW w:type="dxa" w:w="3120"/>
           </w:tcPr>
           <w:p>
             <w:r>
@@ -1732,7 +1973,7 @@
                 <w:rFonts w:ascii="Times New Roman" w:hAnsi="Times New Roman"/>
                 <w:sz w:val="22"/>
               </w:rPr>
-              <w:t>HTTP routing, template rendering</w:t>
+              <w:t>HTTP routing, request handling, template rendering</w:t>
             </w:r>
           </w:p>
         </w:tc>
@@ -1740,7 +1981,7 @@
       <w:tr>
         <w:tc>
           <w:tcPr>
-            <w:tcW w:type="dxa" w:w="2999"/>
+            <w:tcW w:type="dxa" w:w="3120"/>
           </w:tcPr>
           <w:p>
             <w:r>
@@ -1754,7 +1995,7 @@
         </w:tc>
         <w:tc>
           <w:tcPr>
-            <w:tcW w:type="dxa" w:w="2999"/>
+            <w:tcW w:type="dxa" w:w="3120"/>
           </w:tcPr>
           <w:p>
             <w:r>
@@ -1762,13 +2003,13 @@
                 <w:rFonts w:ascii="Times New Roman" w:hAnsi="Times New Roman"/>
                 <w:sz w:val="22"/>
               </w:rPr>
-              <w:t>HTML5, CSS3, JavaScript</w:t>
+              <w:t>HTML5, CSS3, JavaScript (ES6)</w:t>
             </w:r>
           </w:p>
         </w:tc>
         <w:tc>
           <w:tcPr>
-            <w:tcW w:type="dxa" w:w="2999"/>
+            <w:tcW w:type="dxa" w:w="3120"/>
           </w:tcPr>
           <w:p>
             <w:r>
@@ -1776,7 +2017,7 @@
                 <w:rFonts w:ascii="Times New Roman" w:hAnsi="Times New Roman"/>
                 <w:sz w:val="22"/>
               </w:rPr>
-              <w:t>Browser UI (no frameworks)</w:t>
+              <w:t>Browser-side user interface (no external frameworks)</w:t>
             </w:r>
           </w:p>
         </w:tc>
@@ -1784,7 +2025,51 @@
       <w:tr>
         <w:tc>
           <w:tcPr>
-            <w:tcW w:type="dxa" w:w="2999"/>
+            <w:tcW w:type="dxa" w:w="3120"/>
+          </w:tcPr>
+          <w:p>
+            <w:r>
+              <w:rPr>
+                <w:rFonts w:ascii="Times New Roman" w:hAnsi="Times New Roman"/>
+                <w:sz w:val="22"/>
+              </w:rPr>
+              <w:t>Templating Engine</w:t>
+            </w:r>
+          </w:p>
+        </w:tc>
+        <w:tc>
+          <w:tcPr>
+            <w:tcW w:type="dxa" w:w="3120"/>
+          </w:tcPr>
+          <w:p>
+            <w:r>
+              <w:rPr>
+                <w:rFonts w:ascii="Times New Roman" w:hAnsi="Times New Roman"/>
+                <w:sz w:val="22"/>
+              </w:rPr>
+              <w:t>Jinja2</w:t>
+            </w:r>
+          </w:p>
+        </w:tc>
+        <w:tc>
+          <w:tcPr>
+            <w:tcW w:type="dxa" w:w="3120"/>
+          </w:tcPr>
+          <w:p>
+            <w:r>
+              <w:rPr>
+                <w:rFonts w:ascii="Times New Roman" w:hAnsi="Times New Roman"/>
+                <w:sz w:val="22"/>
+              </w:rPr>
+              <w:t>Server-side HTML rendering with template inheritance</w:t>
+            </w:r>
+          </w:p>
+        </w:tc>
+      </w:tr>
+      <w:tr>
+        <w:tc>
+          <w:tcPr>
+            <w:tcW w:type="dxa" w:w="3120"/>
           </w:tcPr>
           <w:p>
             <w:r>
@@ -1798,7 +2083,7 @@
         </w:tc>
         <w:tc>
           <w:tcPr>
-            <w:tcW w:type="dxa" w:w="2999"/>
+            <w:tcW w:type="dxa" w:w="3120"/>
           </w:tcPr>
           <w:p>
             <w:r>
@@ -1812,7 +2097,7 @@
         </w:tc>
         <w:tc>
           <w:tcPr>
-            <w:tcW w:type="dxa" w:w="2999"/>
+            <w:tcW w:type="dxa" w:w="3120"/>
           </w:tcPr>
           <w:p>
             <w:r>
@@ -1820,7 +2105,7 @@
                 <w:rFonts w:ascii="Times New Roman" w:hAnsi="Times New Roman"/>
                 <w:sz w:val="22"/>
               </w:rPr>
-              <w:t>Prediction history storage</w:t>
+              <w:t>Lightweight storage for prediction history records</w:t>
             </w:r>
           </w:p>
         </w:tc>
@@ -1828,7 +2113,7 @@
       <w:tr>
         <w:tc>
           <w:tcPr>
-            <w:tcW w:type="dxa" w:w="2999"/>
+            <w:tcW w:type="dxa" w:w="3120"/>
           </w:tcPr>
           <w:p>
             <w:r>
@@ -1836,13 +2121,13 @@
                 <w:rFonts w:ascii="Times New Roman" w:hAnsi="Times New Roman"/>
                 <w:sz w:val="22"/>
               </w:rPr>
-              <w:t>Testing</w:t>
+              <w:t>Testing Framework</w:t>
             </w:r>
           </w:p>
         </w:tc>
         <w:tc>
           <w:tcPr>
-            <w:tcW w:type="dxa" w:w="2999"/>
+            <w:tcW w:type="dxa" w:w="3120"/>
           </w:tcPr>
           <w:p>
             <w:r>
@@ -1856,7 +2141,7 @@
         </w:tc>
         <w:tc>
           <w:tcPr>
-            <w:tcW w:type="dxa" w:w="2999"/>
+            <w:tcW w:type="dxa" w:w="3120"/>
           </w:tcPr>
           <w:p>
             <w:r>
@@ -1864,7 +2149,7 @@
                 <w:rFonts w:ascii="Times New Roman" w:hAnsi="Times New Roman"/>
                 <w:sz w:val="22"/>
               </w:rPr>
-              <w:t>28 automated test cases</w:t>
+              <w:t>28 automated test cases across all critical paths</w:t>
             </w:r>
           </w:p>
         </w:tc>
@@ -1872,7 +2157,7 @@
       <w:tr>
         <w:tc>
           <w:tcPr>
-            <w:tcW w:type="dxa" w:w="2999"/>
+            <w:tcW w:type="dxa" w:w="3120"/>
           </w:tcPr>
           <w:p>
             <w:r>
@@ -1886,7 +2171,7 @@
         </w:tc>
         <w:tc>
           <w:tcPr>
-            <w:tcW w:type="dxa" w:w="2999"/>
+            <w:tcW w:type="dxa" w:w="3120"/>
           </w:tcPr>
           <w:p>
             <w:r>
@@ -1894,13 +2179,13 @@
                 <w:rFonts w:ascii="Times New Roman" w:hAnsi="Times New Roman"/>
                 <w:sz w:val="22"/>
               </w:rPr>
-              <w:t>Docker + Gunicorn</w:t>
+              <w:t>Docker + Docker Compose</w:t>
             </w:r>
           </w:p>
         </w:tc>
         <w:tc>
           <w:tcPr>
-            <w:tcW w:type="dxa" w:w="2999"/>
+            <w:tcW w:type="dxa" w:w="3120"/>
           </w:tcPr>
           <w:p>
             <w:r>
@@ -1908,7 +2193,7 @@
                 <w:rFonts w:ascii="Times New Roman" w:hAnsi="Times New Roman"/>
                 <w:sz w:val="22"/>
               </w:rPr>
-              <w:t>Production deployment</w:t>
+              <w:t>One-command deployment on any machine</w:t>
             </w:r>
           </w:p>
         </w:tc>
@@ -1916,7 +2201,7 @@
       <w:tr>
         <w:tc>
           <w:tcPr>
-            <w:tcW w:type="dxa" w:w="2999"/>
+            <w:tcW w:type="dxa" w:w="3120"/>
           </w:tcPr>
           <w:p>
             <w:r>
@@ -1924,13 +2209,57 @@
                 <w:rFonts w:ascii="Times New Roman" w:hAnsi="Times New Roman"/>
                 <w:sz w:val="22"/>
               </w:rPr>
-              <w:t>Version control</w:t>
+              <w:t>Production Server</w:t>
             </w:r>
           </w:p>
         </w:tc>
         <w:tc>
           <w:tcPr>
-            <w:tcW w:type="dxa" w:w="2999"/>
+            <w:tcW w:type="dxa" w:w="3120"/>
+          </w:tcPr>
+          <w:p>
+            <w:r>
+              <w:rPr>
+                <w:rFonts w:ascii="Times New Roman" w:hAnsi="Times New Roman"/>
+                <w:sz w:val="22"/>
+              </w:rPr>
+              <w:t>Gunicorn</w:t>
+            </w:r>
+          </w:p>
+        </w:tc>
+        <w:tc>
+          <w:tcPr>
+            <w:tcW w:type="dxa" w:w="3120"/>
+          </w:tcPr>
+          <w:p>
+            <w:r>
+              <w:rPr>
+                <w:rFonts w:ascii="Times New Roman" w:hAnsi="Times New Roman"/>
+                <w:sz w:val="22"/>
+              </w:rPr>
+              <w:t>Multi-worker WSGI server for production use</w:t>
+            </w:r>
+          </w:p>
+        </w:tc>
+      </w:tr>
+      <w:tr>
+        <w:tc>
+          <w:tcPr>
+            <w:tcW w:type="dxa" w:w="3120"/>
+          </w:tcPr>
+          <w:p>
+            <w:r>
+              <w:rPr>
+                <w:rFonts w:ascii="Times New Roman" w:hAnsi="Times New Roman"/>
+                <w:sz w:val="22"/>
+              </w:rPr>
+              <w:t>Version Control</w:t>
+            </w:r>
+          </w:p>
+        </w:tc>
+        <w:tc>
+          <w:tcPr>
+            <w:tcW w:type="dxa" w:w="3120"/>
           </w:tcPr>
           <w:p>
             <w:r>
@@ -1944,7 +2273,7 @@
         </w:tc>
         <w:tc>
           <w:tcPr>
-            <w:tcW w:type="dxa" w:w="2999"/>
+            <w:tcW w:type="dxa" w:w="3120"/>
           </w:tcPr>
           <w:p>
             <w:r>
@@ -1952,221 +2281,288 @@
                 <w:rFonts w:ascii="Times New Roman" w:hAnsi="Times New Roman"/>
                 <w:sz w:val="22"/>
               </w:rPr>
-              <w:t>Source code management</w:t>
+              <w:t>Source code management and collaboration</w:t>
             </w:r>
           </w:p>
         </w:tc>
       </w:tr>
     </w:tbl>
-    <w:p/>
     <w:p>
       <w:pPr>
-        <w:pStyle w:val="Heading1"/>
+        <w:spacing w:before="120" w:after="120"/>
+      </w:pPr>
+    </w:p>
+    <w:p>
+      <w:pPr>
+        <w:spacing w:line="360" w:lineRule="auto" w:before="360" w:after="120"/>
+        <w:jc w:val="left"/>
       </w:pPr>
       <w:r>
         <w:rPr>
           <w:rFonts w:ascii="Times New Roman" w:hAnsi="Times New Roman"/>
+          <w:b/>
           <w:color w:val="000000"/>
+          <w:sz w:val="28"/>
         </w:rPr>
         <w:t>7. System Architecture</w:t>
       </w:r>
     </w:p>
     <w:p>
       <w:pPr>
-        <w:spacing w:after="120"/>
-        <w:ind w:firstLine="0"/>
+        <w:spacing w:line="360" w:lineRule="auto" w:before="0" w:after="80"/>
+        <w:ind w:firstLine="720"/>
         <w:jc w:val="both"/>
-      </w:pPr>
-      <w:r>
-        <w:rPr>
-          <w:rFonts w:ascii="Times New Roman" w:hAnsi="Times New Roman"/>
-          <w:b w:val="0"/>
-          <w:sz w:val="24"/>
-        </w:rPr>
-        <w:t>CardioPredict uses a Model-View-Controller pattern:</w:t>
-      </w:r>
-    </w:p>
-    <w:p>
-      <w:pPr>
-        <w:pStyle w:val="ListBullet"/>
       </w:pPr>
       <w:r>
         <w:rPr>
           <w:rFonts w:ascii="Times New Roman" w:hAnsi="Times New Roman"/>
           <w:sz w:val="24"/>
         </w:rPr>
-        <w:t>Client (Browser): renders the interface, handles basic input validation, stores user preferences.</w:t>
+        <w:t>CardioPredict is built on a Model-View-Controller (MVC) pattern, implemented within a standard client-server architecture. The system comprises four distinct layers, each with clearly defined responsibilities:</w:t>
       </w:r>
     </w:p>
     <w:p>
       <w:pPr>
         <w:pStyle w:val="ListBullet"/>
+        <w:spacing w:line="360" w:lineRule="auto" w:after="40"/>
+        <w:jc w:val="both"/>
       </w:pPr>
       <w:r>
         <w:rPr>
           <w:rFonts w:ascii="Times New Roman" w:hAnsi="Times New Roman"/>
           <w:sz w:val="24"/>
         </w:rPr>
-        <w:t>Controller (Flask routes): receives requests, validates data, calls the model, writes to the database.</w:t>
+        <w:t>Client (Browser): Renders the HTML/CSS/JavaScript interface, handles basic input validation using HTML5 form constraints, and stores user preferences (such as dark mode and font size settings) in the browser's localStorage.</w:t>
       </w:r>
     </w:p>
     <w:p>
       <w:pPr>
         <w:pStyle w:val="ListBullet"/>
+        <w:spacing w:line="360" w:lineRule="auto" w:after="40"/>
+        <w:jc w:val="both"/>
       </w:pPr>
       <w:r>
         <w:rPr>
           <w:rFonts w:ascii="Times New Roman" w:hAnsi="Times New Roman"/>
           <w:sz w:val="24"/>
         </w:rPr>
-        <w:t>Model layer: pre-trained Random Forest for inference; SQLite for data persistence.</w:t>
+        <w:t>Controller (Flask Routes): Receives incoming HTTP requests, extracts form data, performs server-side validation (checking data types, value ranges, and required fields), invokes the machine learning model, writes the prediction result to the database, and returns the rendered HTML response.</w:t>
       </w:r>
     </w:p>
     <w:p>
       <w:pPr>
         <w:pStyle w:val="ListBullet"/>
+        <w:spacing w:line="360" w:lineRule="auto" w:after="40"/>
+        <w:jc w:val="both"/>
       </w:pPr>
       <w:r>
         <w:rPr>
           <w:rFonts w:ascii="Times New Roman" w:hAnsi="Times New Roman"/>
           <w:sz w:val="24"/>
         </w:rPr>
-        <w:t>View layer: seven Jinja2 templates sharing a common base layout.</w:t>
+        <w:t>Model Layer: Consists of two components — the pre-trained Random Forest classifier (loaded from a serialised .pkl file at application startup) that performs inference, and the SQLite database that stores all prediction records with timestamps.</w:t>
       </w:r>
     </w:p>
     <w:p>
       <w:pPr>
-        <w:pStyle w:val="Heading2"/>
-      </w:pPr>
-      <w:r>
-        <w:rPr>
-          <w:rFonts w:ascii="Times New Roman" w:hAnsi="Times New Roman"/>
-          <w:color w:val="000000"/>
-        </w:rPr>
-        <w:t>7.1 Request Flow</w:t>
-      </w:r>
-    </w:p>
-    <w:p>
-      <w:pPr>
-        <w:spacing w:after="120"/>
-        <w:ind w:firstLine="0"/>
+        <w:pStyle w:val="ListBullet"/>
+        <w:spacing w:line="360" w:lineRule="auto" w:after="40"/>
         <w:jc w:val="both"/>
       </w:pPr>
       <w:r>
         <w:rPr>
           <w:rFonts w:ascii="Times New Roman" w:hAnsi="Times New Roman"/>
-          <w:b w:val="0"/>
           <w:sz w:val="24"/>
         </w:rPr>
-        <w:t>User fills 13 fields → browser validates → POST to /predict → Flask validates server-side → NumPy array built → StandardScaler transforms → Random Forest predicts → result saved to SQLite → colour-coded result page rendered.</w:t>
+        <w:t>View Layer: Seven Jinja2 HTML templates that share a common base layout through template inheritance, ensuring visual consistency and code reuse across all pages of the application.</w:t>
       </w:r>
     </w:p>
     <w:p>
       <w:pPr>
-        <w:pStyle w:val="Heading1"/>
+        <w:spacing w:line="360" w:lineRule="auto" w:before="240" w:after="120"/>
+        <w:jc w:val="left"/>
       </w:pPr>
       <w:r>
         <w:rPr>
           <w:rFonts w:ascii="Times New Roman" w:hAnsi="Times New Roman"/>
+          <w:b/>
+          <w:sz w:val="24"/>
+        </w:rPr>
+        <w:t>7.1 Data Flow</w:t>
+      </w:r>
+    </w:p>
+    <w:p>
+      <w:pPr>
+        <w:spacing w:line="360" w:lineRule="auto" w:before="0" w:after="120"/>
+        <w:ind w:firstLine="720"/>
+        <w:jc w:val="both"/>
+      </w:pPr>
+      <w:r>
+        <w:rPr>
+          <w:rFonts w:ascii="Times New Roman" w:hAnsi="Times New Roman"/>
+          <w:sz w:val="24"/>
+        </w:rPr>
+        <w:t>When a clinician submits a prediction request, the data flows through the system as follows: the browser validates the 13 input fields using HTML5 constraints → the form data is submitted via HTTP POST to the /predict route → Flask extracts each field, converts it to the correct numeric type, and verifies that every value falls within its expected range → a NumPy array is constructed from the validated inputs → the StandardScaler normalises the array using the same parameters from training → the Random Forest model calls predict_proba() to obtain the disease probability → the result is saved to SQLite along with a timestamp and the original input values → the result page is rendered with a colour-coded risk indicator (green for low risk, amber for moderate, red for high) and an animated probability bar.</w:t>
+      </w:r>
+    </w:p>
+    <w:p>
+      <w:r>
+        <w:br w:type="page"/>
+      </w:r>
+    </w:p>
+    <w:p>
+      <w:pPr>
+        <w:spacing w:line="360" w:lineRule="auto" w:before="360" w:after="120"/>
+        <w:jc w:val="left"/>
+      </w:pPr>
+      <w:r>
+        <w:rPr>
+          <w:rFonts w:ascii="Times New Roman" w:hAnsi="Times New Roman"/>
+          <w:b/>
           <w:color w:val="000000"/>
+          <w:sz w:val="28"/>
         </w:rPr>
         <w:t>8. Expected Outcomes</w:t>
       </w:r>
     </w:p>
     <w:p>
       <w:pPr>
-        <w:pStyle w:val="ListNumber"/>
+        <w:spacing w:line="360" w:lineRule="auto" w:after="120"/>
+        <w:jc w:val="both"/>
       </w:pPr>
       <w:r>
         <w:rPr>
           <w:rFonts w:ascii="Times New Roman" w:hAnsi="Times New Roman"/>
           <w:sz w:val="24"/>
         </w:rPr>
-        <w:t>A trained model achieving at least 80% accuracy on the test set.</w:t>
+        <w:t>By the end of this project, the following deliverables are expected:</w:t>
       </w:r>
     </w:p>
     <w:p>
       <w:pPr>
         <w:pStyle w:val="ListNumber"/>
+        <w:spacing w:line="360" w:lineRule="auto" w:after="40"/>
+        <w:jc w:val="both"/>
       </w:pPr>
       <w:r>
         <w:rPr>
           <w:rFonts w:ascii="Times New Roman" w:hAnsi="Times New Roman"/>
           <w:sz w:val="24"/>
         </w:rPr>
-        <w:t>A fully functional, responsive web application.</w:t>
+        <w:t>A trained Random Forest classifier that achieves at least 80% accuracy on the held-out test set.</w:t>
       </w:r>
     </w:p>
     <w:p>
       <w:pPr>
         <w:pStyle w:val="ListNumber"/>
+        <w:spacing w:line="360" w:lineRule="auto" w:after="40"/>
+        <w:jc w:val="both"/>
       </w:pPr>
       <w:r>
         <w:rPr>
           <w:rFonts w:ascii="Times New Roman" w:hAnsi="Times New Roman"/>
           <w:sz w:val="24"/>
         </w:rPr>
-        <w:t>Colour-coded risk visualisation (green/amber/red) for clinical interpretation.</w:t>
+        <w:t>A fully functional, responsive web application that works correctly on any modern browser, on both desktop and mobile devices.</w:t>
       </w:r>
     </w:p>
     <w:p>
       <w:pPr>
         <w:pStyle w:val="ListNumber"/>
+        <w:spacing w:line="360" w:lineRule="auto" w:after="40"/>
+        <w:jc w:val="both"/>
       </w:pPr>
       <w:r>
         <w:rPr>
           <w:rFonts w:ascii="Times New Roman" w:hAnsi="Times New Roman"/>
           <w:sz w:val="24"/>
         </w:rPr>
-        <w:t>Prediction history with CRUD operations.</w:t>
+        <w:t>A colour-coded risk visualisation system (green for low, amber for moderate, red for high) that enables immediate clinical interpretation of results.</w:t>
       </w:r>
     </w:p>
     <w:p>
       <w:pPr>
         <w:pStyle w:val="ListNumber"/>
+        <w:spacing w:line="360" w:lineRule="auto" w:after="40"/>
+        <w:jc w:val="both"/>
       </w:pPr>
       <w:r>
         <w:rPr>
           <w:rFonts w:ascii="Times New Roman" w:hAnsi="Times New Roman"/>
           <w:sz w:val="24"/>
         </w:rPr>
-        <w:t>A REST API endpoint for external integration.</w:t>
+        <w:t>A prediction history module with the ability to view, track, and delete past predictions for longitudinal patient monitoring.</w:t>
       </w:r>
     </w:p>
     <w:p>
       <w:pPr>
         <w:pStyle w:val="ListNumber"/>
+        <w:spacing w:line="360" w:lineRule="auto" w:after="40"/>
+        <w:jc w:val="both"/>
       </w:pPr>
       <w:r>
         <w:rPr>
           <w:rFonts w:ascii="Times New Roman" w:hAnsi="Times New Roman"/>
           <w:sz w:val="24"/>
         </w:rPr>
-        <w:t>Docker container for one-command deployment.</w:t>
+        <w:t>A REST API endpoint that external systems can call to obtain predictions in JSON format, enabling integration with other healthcare applications.</w:t>
       </w:r>
     </w:p>
     <w:p>
       <w:pPr>
         <w:pStyle w:val="ListNumber"/>
+        <w:spacing w:line="360" w:lineRule="auto" w:after="40"/>
+        <w:jc w:val="both"/>
       </w:pPr>
       <w:r>
         <w:rPr>
           <w:rFonts w:ascii="Times New Roman" w:hAnsi="Times New Roman"/>
           <w:sz w:val="24"/>
         </w:rPr>
-        <w:t>An automated test suite with 28+ passing test cases.</w:t>
+        <w:t>A Docker container image that packages the entire application for one-command deployment on any server.</w:t>
       </w:r>
     </w:p>
     <w:p>
       <w:pPr>
-        <w:pStyle w:val="Heading1"/>
+        <w:pStyle w:val="ListNumber"/>
+        <w:spacing w:line="360" w:lineRule="auto" w:after="40"/>
+        <w:jc w:val="both"/>
       </w:pPr>
       <w:r>
         <w:rPr>
           <w:rFonts w:ascii="Times New Roman" w:hAnsi="Times New Roman"/>
+          <w:sz w:val="24"/>
+        </w:rPr>
+        <w:t>An automated test suite with at least 28 passing test cases covering all critical execution paths.</w:t>
+      </w:r>
+    </w:p>
+    <w:p>
+      <w:pPr>
+        <w:spacing w:line="360" w:lineRule="auto" w:before="360" w:after="120"/>
+        <w:jc w:val="left"/>
+      </w:pPr>
+      <w:r>
+        <w:rPr>
+          <w:rFonts w:ascii="Times New Roman" w:hAnsi="Times New Roman"/>
+          <w:b/>
           <w:color w:val="000000"/>
+          <w:sz w:val="28"/>
         </w:rPr>
         <w:t>9. Project Timeline</w:t>
+      </w:r>
+    </w:p>
+    <w:p>
+      <w:pPr>
+        <w:spacing w:line="360" w:lineRule="auto" w:before="0" w:after="120"/>
+        <w:ind w:firstLine="720"/>
+        <w:jc w:val="both"/>
+      </w:pPr>
+      <w:r>
+        <w:rPr>
+          <w:rFonts w:ascii="Times New Roman" w:hAnsi="Times New Roman"/>
+          <w:sz w:val="24"/>
+        </w:rPr>
+        <w:t>The project is planned across seven phases over a period of approximately sixteen weeks:</w:t>
       </w:r>
     </w:p>
     <w:tbl>
@@ -2177,17 +2573,19 @@
         <w:tblLook w:firstColumn="1" w:firstRow="1" w:lastColumn="0" w:lastRow="0" w:noHBand="0" w:noVBand="1" w:val="04A0"/>
       </w:tblPr>
       <w:tblGrid>
-        <w:gridCol w:w="2999"/>
-        <w:gridCol w:w="2999"/>
-        <w:gridCol w:w="2999"/>
+        <w:gridCol w:w="3120"/>
+        <w:gridCol w:w="3120"/>
+        <w:gridCol w:w="3120"/>
       </w:tblGrid>
       <w:tr>
         <w:tc>
           <w:tcPr>
-            <w:tcW w:type="dxa" w:w="2999"/>
-            <w:shd w:fill="D9E2F3" w:val="clear"/>
+            <w:tcW w:type="dxa" w:w="3120"/>
           </w:tcPr>
           <w:p>
+            <w:pPr>
+              <w:jc w:val="center"/>
+            </w:pPr>
             <w:r>
               <w:rPr>
                 <w:rFonts w:ascii="Times New Roman" w:hAnsi="Times New Roman"/>
@@ -2200,10 +2598,12 @@
         </w:tc>
         <w:tc>
           <w:tcPr>
-            <w:tcW w:type="dxa" w:w="2999"/>
-            <w:shd w:fill="D9E2F3" w:val="clear"/>
+            <w:tcW w:type="dxa" w:w="3120"/>
           </w:tcPr>
           <w:p>
+            <w:pPr>
+              <w:jc w:val="center"/>
+            </w:pPr>
             <w:r>
               <w:rPr>
                 <w:rFonts w:ascii="Times New Roman" w:hAnsi="Times New Roman"/>
@@ -2216,17 +2616,19 @@
         </w:tc>
         <w:tc>
           <w:tcPr>
-            <w:tcW w:type="dxa" w:w="2999"/>
-            <w:shd w:fill="D9E2F3" w:val="clear"/>
+            <w:tcW w:type="dxa" w:w="3120"/>
           </w:tcPr>
           <w:p>
+            <w:pPr>
+              <w:jc w:val="center"/>
+            </w:pPr>
             <w:r>
               <w:rPr>
                 <w:rFonts w:ascii="Times New Roman" w:hAnsi="Times New Roman"/>
                 <w:b/>
                 <w:sz w:val="22"/>
               </w:rPr>
-              <w:t>Activities</w:t>
+              <w:t>Key Activities</w:t>
             </w:r>
           </w:p>
         </w:tc>
@@ -2234,7 +2636,7 @@
       <w:tr>
         <w:tc>
           <w:tcPr>
-            <w:tcW w:type="dxa" w:w="2999"/>
+            <w:tcW w:type="dxa" w:w="3120"/>
           </w:tcPr>
           <w:p>
             <w:r>
@@ -2242,13 +2644,13 @@
                 <w:rFonts w:ascii="Times New Roman" w:hAnsi="Times New Roman"/>
                 <w:sz w:val="22"/>
               </w:rPr>
-              <w:t>Research</w:t>
+              <w:t>Phase 1: Research and Planning</w:t>
             </w:r>
           </w:p>
         </w:tc>
         <w:tc>
           <w:tcPr>
-            <w:tcW w:type="dxa" w:w="2999"/>
+            <w:tcW w:type="dxa" w:w="3120"/>
           </w:tcPr>
           <w:p>
             <w:r>
@@ -2262,7 +2664,7 @@
         </w:tc>
         <w:tc>
           <w:tcPr>
-            <w:tcW w:type="dxa" w:w="2999"/>
+            <w:tcW w:type="dxa" w:w="3120"/>
           </w:tcPr>
           <w:p>
             <w:r>
@@ -2270,7 +2672,7 @@
                 <w:rFonts w:ascii="Times New Roman" w:hAnsi="Times New Roman"/>
                 <w:sz w:val="22"/>
               </w:rPr>
-              <w:t>Literature survey, dataset selection, tech stack</w:t>
+              <w:t>Literature survey, dataset selection, finalise technology stack</w:t>
             </w:r>
           </w:p>
         </w:tc>
@@ -2278,7 +2680,7 @@
       <w:tr>
         <w:tc>
           <w:tcPr>
-            <w:tcW w:type="dxa" w:w="2999"/>
+            <w:tcW w:type="dxa" w:w="3120"/>
           </w:tcPr>
           <w:p>
             <w:r>
@@ -2286,13 +2688,13 @@
                 <w:rFonts w:ascii="Times New Roman" w:hAnsi="Times New Roman"/>
                 <w:sz w:val="22"/>
               </w:rPr>
-              <w:t>Data analysis</w:t>
+              <w:t>Phase 2: Data Analysis</w:t>
             </w:r>
           </w:p>
         </w:tc>
         <w:tc>
           <w:tcPr>
-            <w:tcW w:type="dxa" w:w="2999"/>
+            <w:tcW w:type="dxa" w:w="3120"/>
           </w:tcPr>
           <w:p>
             <w:r>
@@ -2306,7 +2708,7 @@
         </w:tc>
         <w:tc>
           <w:tcPr>
-            <w:tcW w:type="dxa" w:w="2999"/>
+            <w:tcW w:type="dxa" w:w="3120"/>
           </w:tcPr>
           <w:p>
             <w:r>
@@ -2314,7 +2716,7 @@
                 <w:rFonts w:ascii="Times New Roman" w:hAnsi="Times New Roman"/>
                 <w:sz w:val="22"/>
               </w:rPr>
-              <w:t>EDA, cleaning, preprocessing</w:t>
+              <w:t>Exploratory data analysis, data cleaning, preprocessing</w:t>
             </w:r>
           </w:p>
         </w:tc>
@@ -2322,7 +2724,7 @@
       <w:tr>
         <w:tc>
           <w:tcPr>
-            <w:tcW w:type="dxa" w:w="2999"/>
+            <w:tcW w:type="dxa" w:w="3120"/>
           </w:tcPr>
           <w:p>
             <w:r>
@@ -2330,13 +2732,13 @@
                 <w:rFonts w:ascii="Times New Roman" w:hAnsi="Times New Roman"/>
                 <w:sz w:val="22"/>
               </w:rPr>
-              <w:t>Model development</w:t>
+              <w:t>Phase 3: Model Development</w:t>
             </w:r>
           </w:p>
         </w:tc>
         <w:tc>
           <w:tcPr>
-            <w:tcW w:type="dxa" w:w="2999"/>
+            <w:tcW w:type="dxa" w:w="3120"/>
           </w:tcPr>
           <w:p>
             <w:r>
@@ -2350,7 +2752,7 @@
         </w:tc>
         <w:tc>
           <w:tcPr>
-            <w:tcW w:type="dxa" w:w="2999"/>
+            <w:tcW w:type="dxa" w:w="3120"/>
           </w:tcPr>
           <w:p>
             <w:r>
@@ -2358,7 +2760,7 @@
                 <w:rFonts w:ascii="Times New Roman" w:hAnsi="Times New Roman"/>
                 <w:sz w:val="22"/>
               </w:rPr>
-              <w:t>Train 7 algorithms, cross-validate, select winner</w:t>
+              <w:t>Train all seven algorithms, cross-validate, select winner</w:t>
             </w:r>
           </w:p>
         </w:tc>
@@ -2366,7 +2768,7 @@
       <w:tr>
         <w:tc>
           <w:tcPr>
-            <w:tcW w:type="dxa" w:w="2999"/>
+            <w:tcW w:type="dxa" w:w="3120"/>
           </w:tcPr>
           <w:p>
             <w:r>
@@ -2374,13 +2776,13 @@
                 <w:rFonts w:ascii="Times New Roman" w:hAnsi="Times New Roman"/>
                 <w:sz w:val="22"/>
               </w:rPr>
-              <w:t>Web application</w:t>
+              <w:t>Phase 4: Web Application</w:t>
             </w:r>
           </w:p>
         </w:tc>
         <w:tc>
           <w:tcPr>
-            <w:tcW w:type="dxa" w:w="2999"/>
+            <w:tcW w:type="dxa" w:w="3120"/>
           </w:tcPr>
           <w:p>
             <w:r>
@@ -2394,7 +2796,7 @@
         </w:tc>
         <w:tc>
           <w:tcPr>
-            <w:tcW w:type="dxa" w:w="2999"/>
+            <w:tcW w:type="dxa" w:w="3120"/>
           </w:tcPr>
           <w:p>
             <w:r>
@@ -2402,7 +2804,7 @@
                 <w:rFonts w:ascii="Times New Roman" w:hAnsi="Times New Roman"/>
                 <w:sz w:val="22"/>
               </w:rPr>
-              <w:t>Flask backend, frontend, database integration</w:t>
+              <w:t>Build Flask backend, design frontend, integrate database</w:t>
             </w:r>
           </w:p>
         </w:tc>
@@ -2410,7 +2812,7 @@
       <w:tr>
         <w:tc>
           <w:tcPr>
-            <w:tcW w:type="dxa" w:w="2999"/>
+            <w:tcW w:type="dxa" w:w="3120"/>
           </w:tcPr>
           <w:p>
             <w:r>
@@ -2418,13 +2820,13 @@
                 <w:rFonts w:ascii="Times New Roman" w:hAnsi="Times New Roman"/>
                 <w:sz w:val="22"/>
               </w:rPr>
-              <w:t>Testing</w:t>
+              <w:t>Phase 5: Testing</w:t>
             </w:r>
           </w:p>
         </w:tc>
         <w:tc>
           <w:tcPr>
-            <w:tcW w:type="dxa" w:w="2999"/>
+            <w:tcW w:type="dxa" w:w="3120"/>
           </w:tcPr>
           <w:p>
             <w:r>
@@ -2438,7 +2840,7 @@
         </w:tc>
         <w:tc>
           <w:tcPr>
-            <w:tcW w:type="dxa" w:w="2999"/>
+            <w:tcW w:type="dxa" w:w="3120"/>
           </w:tcPr>
           <w:p>
             <w:r>
@@ -2446,7 +2848,7 @@
                 <w:rFonts w:ascii="Times New Roman" w:hAnsi="Times New Roman"/>
                 <w:sz w:val="22"/>
               </w:rPr>
-              <w:t>Unit and integration tests, bug fixes</w:t>
+              <w:t>Write unit and integration tests, fix bugs, validate edge cases</w:t>
             </w:r>
           </w:p>
         </w:tc>
@@ -2454,7 +2856,7 @@
       <w:tr>
         <w:tc>
           <w:tcPr>
-            <w:tcW w:type="dxa" w:w="2999"/>
+            <w:tcW w:type="dxa" w:w="3120"/>
           </w:tcPr>
           <w:p>
             <w:r>
@@ -2462,13 +2864,13 @@
                 <w:rFonts w:ascii="Times New Roman" w:hAnsi="Times New Roman"/>
                 <w:sz w:val="22"/>
               </w:rPr>
-              <w:t>Deployment</w:t>
+              <w:t>Phase 6: Deployment</w:t>
             </w:r>
           </w:p>
         </w:tc>
         <w:tc>
           <w:tcPr>
-            <w:tcW w:type="dxa" w:w="2999"/>
+            <w:tcW w:type="dxa" w:w="3120"/>
           </w:tcPr>
           <w:p>
             <w:r>
@@ -2482,7 +2884,7 @@
         </w:tc>
         <w:tc>
           <w:tcPr>
-            <w:tcW w:type="dxa" w:w="2999"/>
+            <w:tcW w:type="dxa" w:w="3120"/>
           </w:tcPr>
           <w:p>
             <w:r>
@@ -2490,7 +2892,7 @@
                 <w:rFonts w:ascii="Times New Roman" w:hAnsi="Times New Roman"/>
                 <w:sz w:val="22"/>
               </w:rPr>
-              <w:t>Docker, Gunicorn, documentation</w:t>
+              <w:t>Dockerise application, configure Gunicorn, write deployment docs</w:t>
             </w:r>
           </w:p>
         </w:tc>
@@ -2498,7 +2900,7 @@
       <w:tr>
         <w:tc>
           <w:tcPr>
-            <w:tcW w:type="dxa" w:w="2999"/>
+            <w:tcW w:type="dxa" w:w="3120"/>
           </w:tcPr>
           <w:p>
             <w:r>
@@ -2506,13 +2908,13 @@
                 <w:rFonts w:ascii="Times New Roman" w:hAnsi="Times New Roman"/>
                 <w:sz w:val="22"/>
               </w:rPr>
-              <w:t>Documentation</w:t>
+              <w:t>Phase 7: Documentation</w:t>
             </w:r>
           </w:p>
         </w:tc>
         <w:tc>
           <w:tcPr>
-            <w:tcW w:type="dxa" w:w="2999"/>
+            <w:tcW w:type="dxa" w:w="3120"/>
           </w:tcPr>
           <w:p>
             <w:r>
@@ -2526,7 +2928,7 @@
         </w:tc>
         <w:tc>
           <w:tcPr>
-            <w:tcW w:type="dxa" w:w="2999"/>
+            <w:tcW w:type="dxa" w:w="3120"/>
           </w:tcPr>
           <w:p>
             <w:r>
@@ -2534,21 +2936,28 @@
                 <w:rFonts w:ascii="Times New Roman" w:hAnsi="Times New Roman"/>
                 <w:sz w:val="22"/>
               </w:rPr>
-              <w:t>Synopsis, report, presentation</w:t>
+              <w:t>Write synopsis, project report, prepare presentation</w:t>
             </w:r>
           </w:p>
         </w:tc>
       </w:tr>
     </w:tbl>
-    <w:p/>
     <w:p>
       <w:pPr>
-        <w:pStyle w:val="Heading1"/>
+        <w:spacing w:before="120" w:after="120"/>
+      </w:pPr>
+    </w:p>
+    <w:p>
+      <w:pPr>
+        <w:spacing w:line="360" w:lineRule="auto" w:before="360" w:after="120"/>
+        <w:jc w:val="left"/>
       </w:pPr>
       <w:r>
         <w:rPr>
           <w:rFonts w:ascii="Times New Roman" w:hAnsi="Times New Roman"/>
+          <w:b/>
           <w:color w:val="000000"/>
+          <w:sz w:val="28"/>
         </w:rPr>
         <w:t>10. References</w:t>
       </w:r>
@@ -2556,30 +2965,36 @@
     <w:p>
       <w:pPr>
         <w:pStyle w:val="ListNumber"/>
+        <w:spacing w:line="360" w:lineRule="auto" w:after="40"/>
+        <w:jc w:val="both"/>
       </w:pPr>
       <w:r>
         <w:rPr>
           <w:rFonts w:ascii="Times New Roman" w:hAnsi="Times New Roman"/>
           <w:sz w:val="24"/>
         </w:rPr>
-        <w:t>Janosi, A., et al. (1988). Heart Disease Data Set. UCI Machine Learning Repository.</w:t>
+        <w:t>Janosi, A., Steinbrunn, W., Pfisterer, M., and Detrano, R. (1988). Heart Disease Data Set. UCI Machine Learning Repository. https://archive.ics.uci.edu/ml/datasets/heart+disease</w:t>
       </w:r>
     </w:p>
     <w:p>
       <w:pPr>
         <w:pStyle w:val="ListNumber"/>
+        <w:spacing w:line="360" w:lineRule="auto" w:after="40"/>
+        <w:jc w:val="both"/>
       </w:pPr>
       <w:r>
         <w:rPr>
           <w:rFonts w:ascii="Times New Roman" w:hAnsi="Times New Roman"/>
           <w:sz w:val="24"/>
         </w:rPr>
-        <w:t>Pedregosa, F., et al. (2011). Scikit-learn: Machine Learning in Python. JMLR, 12, 2825–2830.</w:t>
+        <w:t>Pedregosa, F., Varoquaux, G., Gramfort, A., Michel, V., Thirion, B., Grisel, O., Blondel, M., Prettenhofer, P., Weiss, R., Dubourg, V., Vanderplas, J., Passos, A., Cournapeau, D., Brucher, M., Perrot, M., and Duchesnay, É. (2011). Scikit-learn: Machine Learning in Python. Journal of Machine Learning Research, 12, 2825–2830.</w:t>
       </w:r>
     </w:p>
     <w:p>
       <w:pPr>
         <w:pStyle w:val="ListNumber"/>
+        <w:spacing w:line="360" w:lineRule="auto" w:after="40"/>
+        <w:jc w:val="both"/>
       </w:pPr>
       <w:r>
         <w:rPr>
@@ -2592,54 +3007,62 @@
     <w:p>
       <w:pPr>
         <w:pStyle w:val="ListNumber"/>
+        <w:spacing w:line="360" w:lineRule="auto" w:after="40"/>
+        <w:jc w:val="both"/>
       </w:pPr>
       <w:r>
         <w:rPr>
           <w:rFonts w:ascii="Times New Roman" w:hAnsi="Times New Roman"/>
           <w:sz w:val="24"/>
         </w:rPr>
-        <w:t>Grinberg, M. (2018). Flask Web Development (2nd ed.). O'Reilly Media.</w:t>
+        <w:t>Grinberg, M. (2018). Flask Web Development: Developing Web Applications with Python (2nd ed.). O'Reilly Media.</w:t>
       </w:r>
     </w:p>
     <w:p>
       <w:pPr>
         <w:pStyle w:val="ListNumber"/>
+        <w:spacing w:line="360" w:lineRule="auto" w:after="40"/>
+        <w:jc w:val="both"/>
       </w:pPr>
       <w:r>
         <w:rPr>
           <w:rFonts w:ascii="Times New Roman" w:hAnsi="Times New Roman"/>
           <w:sz w:val="24"/>
         </w:rPr>
-        <w:t>WHO (2025). Cardiovascular Diseases — Key Facts.</w:t>
+        <w:t>World Health Organization. (2025). Cardiovascular Diseases (CVDs) — Key Facts. https://www.who.int/news-room/fact-sheets/detail/cardiovascular-diseases</w:t>
       </w:r>
     </w:p>
     <w:p>
       <w:pPr>
         <w:pStyle w:val="ListNumber"/>
+        <w:spacing w:line="360" w:lineRule="auto" w:after="40"/>
+        <w:jc w:val="both"/>
       </w:pPr>
       <w:r>
         <w:rPr>
           <w:rFonts w:ascii="Times New Roman" w:hAnsi="Times New Roman"/>
           <w:sz w:val="24"/>
         </w:rPr>
-        <w:t>Friedman, J., Hastie, T., &amp; Tibshirani, R. (2001). The Elements of Statistical Learning. Springer.</w:t>
+        <w:t>Friedman, J., Hastie, T., and Tibshirani, R. (2001). The Elements of Statistical Learning: Data Mining, Inference, and Prediction. Springer.</w:t>
       </w:r>
     </w:p>
     <w:p>
       <w:pPr>
         <w:pStyle w:val="ListNumber"/>
+        <w:spacing w:line="360" w:lineRule="auto" w:after="40"/>
+        <w:jc w:val="both"/>
       </w:pPr>
       <w:r>
         <w:rPr>
           <w:rFonts w:ascii="Times New Roman" w:hAnsi="Times New Roman"/>
           <w:sz w:val="24"/>
         </w:rPr>
-        <w:t>McKinney, W. (2012). Python for Data Analysis. O'Reilly Media.</w:t>
+        <w:t>McKinney, W. (2012). Python for Data Analysis: Data Wrangling with Pandas, NumPy, and IPython. O'Reilly Media.</w:t>
       </w:r>
     </w:p>
     <w:sectPr>
       <w:pgSz w:w="12240" w:h="15840"/>
-      <w:pgMar w:top="1440" w:right="1440" w:bottom="1440" w:left="1803" w:header="720" w:footer="720" w:gutter="0"/>
+      <w:pgMar w:top="1440" w:right="1440" w:bottom="1440" w:left="1440" w:header="720" w:footer="720" w:gutter="0"/>
       <w:cols w:space="720"/>
       <w:docGrid w:linePitch="360"/>
     </w:sectPr>
@@ -3011,7 +3434,7 @@
     <w:qFormat/>
     <w:rsid w:val="00FC693F"/>
     <w:pPr>
-      <w:spacing w:line="360" w:lineRule="auto" w:after="120"/>
+      <w:spacing w:line="360" w:lineRule="auto" w:after="0" w:before="0"/>
     </w:pPr>
     <w:rPr>
       <w:rFonts w:ascii="Times New Roman" w:hAnsi="Times New Roman"/>

</xml_diff>